<commit_message>
docs: add deployment data model and security architecture
</commit_message>
<xml_diff>
--- a/Member3-Architecture/SCMS_Member3_Software_Architecture.docx
+++ b/Member3-Architecture/SCMS_Member3_Software_Architecture.docx
@@ -24,7 +24,7 @@
         <w:br/>
         <w:t>Prepared by Mohammed Zahoor Mashahir | PES1UG24CS579</w:t>
         <w:br/>
-        <w:t>Team 8 | Version 0.1</w:t>
+        <w:t>Team 8 | Version 0.2</w:t>
       </w:r>
     </w:p>
     <w:p>
@@ -2243,6 +2243,3329 @@
         <w:t>C08 computes elapsed time from status_updated_at using the configured threshold, default 7 days. A protected overdue view shows the current queue, days overdue and escalation availability. Escalation delegates to C04 and C05 after a fresh permission, state, version and threshold check. The scope of this exception to normal assigned-handler authority requires team review; it is not a general cross-queue handling permission.</w:t>
       </w:r>
     </w:p>
+    <w:p>
+      <w:r>
+        <w:br w:type="page"/>
+      </w:r>
+    </w:p>
+    <w:p>
+      <w:pPr>
+        <w:pStyle w:val="Heading1"/>
+      </w:pPr>
+      <w:r>
+        <w:t>3 5 Deployment and reliability</w:t>
+      </w:r>
+    </w:p>
+    <w:p>
+      <w:r>
+        <w:t>Deploy one SCMS application on a Windows or Linux host, with its SQLite file on durable local storage outside the web root. Use a dedicated WSGI server and HTTPS termination for shared deployment. The Flask development server is limited to local development. The browser can reach only the application HTTP interface.</w:t>
+      </w:r>
+    </w:p>
+    <w:p>
+      <w:pPr>
+        <w:jc w:val="center"/>
+      </w:pPr>
+      <w:r>
+        <w:drawing>
+          <wp:inline xmlns:a="http://schemas.openxmlformats.org/drawingml/2006/main" xmlns:pic="http://schemas.openxmlformats.org/drawingml/2006/picture">
+            <wp:extent cx="6400800" cy="3297056"/>
+            <wp:docPr id="2" name="Picture 2" descr="AD01 Deployment Diagram"/>
+            <wp:cNvGraphicFramePr>
+              <a:graphicFrameLocks noChangeAspect="1"/>
+            </wp:cNvGraphicFramePr>
+            <a:graphic>
+              <a:graphicData uri="http://schemas.openxmlformats.org/drawingml/2006/picture">
+                <pic:pic>
+                  <pic:nvPicPr>
+                    <pic:cNvPr id="0" name="AD01_Deployment_Diagram.png"/>
+                    <pic:cNvPicPr/>
+                  </pic:nvPicPr>
+                  <pic:blipFill>
+                    <a:blip r:embed="rId11"/>
+                    <a:stretch>
+                      <a:fillRect/>
+                    </a:stretch>
+                  </pic:blipFill>
+                  <pic:spPr>
+                    <a:xfrm>
+                      <a:off x="0" y="0"/>
+                      <a:ext cx="6400800" cy="3297056"/>
+                    </a:xfrm>
+                    <a:prstGeom prst="rect"/>
+                  </pic:spPr>
+                </pic:pic>
+              </a:graphicData>
+            </a:graphic>
+          </wp:inline>
+        </w:drawing>
+      </w:r>
+    </w:p>
+    <w:p>
+      <w:pPr>
+        <w:pStyle w:val="Heading2"/>
+      </w:pPr>
+      <w:r>
+        <w:t>3 5 1 Persistence and recovery</w:t>
+      </w:r>
+    </w:p>
+    <w:p>
+      <w:r>
+        <w:t>Use short transactions and a bounded SQLite busy timeout. On lock, disk or constraint failure, roll back the entire workflow and return the Section 4 error contract. A client checks persisted state before repeating an ambiguous submission after a lost response. An SQLite-aware backup captures a consistent database; verify restoration to a separate location and normal restart persistence before release.</w:t>
+      </w:r>
+    </w:p>
+    <w:p>
+      <w:pPr>
+        <w:pStyle w:val="Heading2"/>
+      </w:pPr>
+      <w:r>
+        <w:t>3 5 2 Operations and growth</w:t>
+      </w:r>
+    </w:p>
+    <w:p>
+      <w:r>
+        <w:t>One host remains a single point of availability. Protect the database, backup, secrets and operational logs using OS permissions. Observe request latency, denied actions, failed transactions and database contention without recording sensitive request content. Pagination and targeted indexes support the 2-second dashboard and 3-second submission targets; measure these under an agreed workload rather than assuming them.</w:t>
+      </w:r>
+    </w:p>
+    <w:p>
+      <w:r>
+        <w:t>Revisit PostgreSQL and deployment capacity if concurrent writes or recovery needs exceed SQLite on one host. This is an extension path, not a current dependency. Review retention and backup frequency with the university before deployment; the SRS supplies no quantitative retention or availability target.</w:t>
+      </w:r>
+    </w:p>
+    <w:p>
+      <w:r>
+        <w:br w:type="page"/>
+      </w:r>
+    </w:p>
+    <w:p>
+      <w:pPr>
+        <w:pStyle w:val="Heading1"/>
+      </w:pPr>
+      <w:r>
+        <w:t>3 6 Logical data model</w:t>
+      </w:r>
+    </w:p>
+    <w:p>
+      <w:r>
+        <w:t>Figure AE01 identifies the persistent entities and cardinalities. users and complaints provide the core domain. Assignment, audit, appeal and notification records preserve workflow history, while sessions and settings support authentication and manual SLA review.</w:t>
+      </w:r>
+    </w:p>
+    <w:p>
+      <w:pPr>
+        <w:jc w:val="center"/>
+      </w:pPr>
+      <w:r>
+        <w:drawing>
+          <wp:inline xmlns:a="http://schemas.openxmlformats.org/drawingml/2006/main" xmlns:pic="http://schemas.openxmlformats.org/drawingml/2006/picture">
+            <wp:extent cx="6400800" cy="4607287"/>
+            <wp:docPr id="3" name="Picture 3" descr="AE01 Logical Data Model"/>
+            <wp:cNvGraphicFramePr>
+              <a:graphicFrameLocks noChangeAspect="1"/>
+            </wp:cNvGraphicFramePr>
+            <a:graphic>
+              <a:graphicData uri="http://schemas.openxmlformats.org/drawingml/2006/picture">
+                <pic:pic>
+                  <pic:nvPicPr>
+                    <pic:cNvPr id="0" name="AE01_Logical_Data_Model.png"/>
+                    <pic:cNvPicPr/>
+                  </pic:nvPicPr>
+                  <pic:blipFill>
+                    <a:blip r:embed="rId12"/>
+                    <a:stretch>
+                      <a:fillRect/>
+                    </a:stretch>
+                  </pic:blipFill>
+                  <pic:spPr>
+                    <a:xfrm>
+                      <a:off x="0" y="0"/>
+                      <a:ext cx="6400800" cy="4607287"/>
+                    </a:xfrm>
+                    <a:prstGeom prst="rect"/>
+                  </pic:spPr>
+                </pic:pic>
+              </a:graphicData>
+            </a:graphic>
+          </wp:inline>
+        </w:drawing>
+      </w:r>
+    </w:p>
+    <w:p>
+      <w:pPr>
+        <w:pStyle w:val="Heading2"/>
+      </w:pPr>
+      <w:r>
+        <w:t>3 6 1 Relationship and privacy rules</w:t>
+      </w:r>
+    </w:p>
+    <w:p>
+      <w:r>
+        <w:t>A complaint belongs to one student. An optional assigned_to value names a handler; current_level determines the handler queue. Each complaint has zero or one appeal and zero or one feedback record, and may have many assignment, audit and notification records. assignment_history, appeals and audit_logs each retain an actor_id referencing users. sessions.user_id is null only for a pre-login CSRF session.</w:t>
+      </w:r>
+    </w:p>
+    <w:p>
+      <w:r>
+        <w:t>Feedback stores the complaint link but no student_id. The handler-facing projection omits owner name, ID and email and never joins them into the feedback response. This satisfies identity suppression in REQ-9.2; a complaint link can still provide context, so this design does not promise unlinkability from complaint history.</w:t>
+      </w:r>
+    </w:p>
+    <w:p>
+      <w:r>
+        <w:br w:type="page"/>
+      </w:r>
+    </w:p>
+    <w:p>
+      <w:pPr>
+        <w:pStyle w:val="Heading1"/>
+      </w:pPr>
+      <w:r>
+        <w:t>3 7 Core database schema</w:t>
+      </w:r>
+    </w:p>
+    <w:p>
+      <w:r>
+        <w:t>SQLite INTEGER primary keys identify persistent records. Use TEXT for strings and UTC ISO 8601 timestamps, and INTEGER with CHECK IN (0,1) for booleans. All mandatory SRS fields use NOT NULL. Foreign keys are enabled on every connection. Field lengths below preserve SRS Appendix B. Supporting state fields extend the schema to enforce Section 4 workflows.</w:t>
+      </w:r>
+    </w:p>
+    <w:p>
+      <w:pPr>
+        <w:pStyle w:val="Heading2"/>
+      </w:pPr>
+      <w:r>
+        <w:t>3 7 1 Users</w:t>
+      </w:r>
+    </w:p>
+    <w:tbl>
+      <w:tblPr>
+        <w:tblW w:type="auto" w:w="0"/>
+        <w:tblLayout w:type="fixed"/>
+        <w:tblLook w:firstColumn="1" w:firstRow="1" w:lastColumn="0" w:lastRow="0" w:noHBand="0" w:noVBand="1" w:val="04A0"/>
+      </w:tblPr>
+      <w:tblGrid>
+        <w:gridCol w:w="2059"/>
+        <w:gridCol w:w="4421"/>
+        <w:gridCol w:w="3600"/>
+      </w:tblGrid>
+      <w:tr>
+        <w:trPr>
+          <w:cantSplit/>
+          <w:tblHeader/>
+        </w:trPr>
+        <w:tc>
+          <w:tcPr>
+            <w:tcW w:type="dxa" w:w="2059"/>
+            <w:vAlign w:val="center"/>
+            <w:shd w:fill="E6EDF3"/>
+            <w:tcMar>
+              <w:top w:w="75" w:type="dxa"/>
+              <w:bottom w:w="75" w:type="dxa"/>
+              <w:left w:w="100" w:type="dxa"/>
+              <w:right w:w="100" w:type="dxa"/>
+            </w:tcMar>
+            <w:tcBorders>
+              <w:top w:val="single" w:sz="4" w:color="D9D9D9"/>
+              <w:bottom w:val="single" w:sz="4" w:color="D9D9D9"/>
+              <w:left w:val="single" w:sz="4" w:color="D9D9D9"/>
+              <w:right w:val="single" w:sz="4" w:color="D9D9D9"/>
+            </w:tcBorders>
+          </w:tcPr>
+          <w:p>
+            <w:pPr>
+              <w:spacing w:after="20" w:line="240" w:lineRule="auto"/>
+            </w:pPr>
+            <w:r>
+              <w:rPr>
+                <w:b/>
+                <w:sz w:val="19"/>
+              </w:rPr>
+              <w:t>Field</w:t>
+            </w:r>
+          </w:p>
+        </w:tc>
+        <w:tc>
+          <w:tcPr>
+            <w:tcW w:type="dxa" w:w="4421"/>
+            <w:vAlign w:val="center"/>
+            <w:shd w:fill="E6EDF3"/>
+            <w:tcMar>
+              <w:top w:w="75" w:type="dxa"/>
+              <w:bottom w:w="75" w:type="dxa"/>
+              <w:left w:w="100" w:type="dxa"/>
+              <w:right w:w="100" w:type="dxa"/>
+            </w:tcMar>
+            <w:tcBorders>
+              <w:top w:val="single" w:sz="4" w:color="D9D9D9"/>
+              <w:bottom w:val="single" w:sz="4" w:color="D9D9D9"/>
+              <w:left w:val="single" w:sz="4" w:color="D9D9D9"/>
+              <w:right w:val="single" w:sz="4" w:color="D9D9D9"/>
+            </w:tcBorders>
+          </w:tcPr>
+          <w:p>
+            <w:pPr>
+              <w:spacing w:after="20" w:line="240" w:lineRule="auto"/>
+            </w:pPr>
+            <w:r>
+              <w:rPr>
+                <w:b/>
+                <w:sz w:val="19"/>
+              </w:rPr>
+              <w:t>Type and constraint</w:t>
+            </w:r>
+          </w:p>
+        </w:tc>
+        <w:tc>
+          <w:tcPr>
+            <w:tcW w:type="dxa" w:w="3600"/>
+            <w:vAlign w:val="center"/>
+            <w:shd w:fill="E6EDF3"/>
+            <w:tcMar>
+              <w:top w:w="75" w:type="dxa"/>
+              <w:bottom w:w="75" w:type="dxa"/>
+              <w:left w:w="100" w:type="dxa"/>
+              <w:right w:w="100" w:type="dxa"/>
+            </w:tcMar>
+            <w:tcBorders>
+              <w:top w:val="single" w:sz="4" w:color="D9D9D9"/>
+              <w:bottom w:val="single" w:sz="4" w:color="D9D9D9"/>
+              <w:left w:val="single" w:sz="4" w:color="D9D9D9"/>
+              <w:right w:val="single" w:sz="4" w:color="D9D9D9"/>
+            </w:tcBorders>
+          </w:tcPr>
+          <w:p>
+            <w:pPr>
+              <w:spacing w:after="20" w:line="240" w:lineRule="auto"/>
+            </w:pPr>
+            <w:r>
+              <w:rPr>
+                <w:b/>
+                <w:sz w:val="19"/>
+              </w:rPr>
+              <w:t>Purpose</w:t>
+            </w:r>
+          </w:p>
+        </w:tc>
+      </w:tr>
+      <w:tr>
+        <w:trPr>
+          <w:cantSplit/>
+        </w:trPr>
+        <w:tc>
+          <w:tcPr>
+            <w:tcW w:type="dxa" w:w="2059"/>
+            <w:vAlign w:val="center"/>
+            <w:shd w:fill="FFFFFF"/>
+            <w:tcMar>
+              <w:top w:w="75" w:type="dxa"/>
+              <w:bottom w:w="75" w:type="dxa"/>
+              <w:left w:w="100" w:type="dxa"/>
+              <w:right w:w="100" w:type="dxa"/>
+            </w:tcMar>
+            <w:tcBorders>
+              <w:top w:val="single" w:sz="4" w:color="D9D9D9"/>
+              <w:bottom w:val="single" w:sz="4" w:color="D9D9D9"/>
+              <w:left w:val="single" w:sz="4" w:color="D9D9D9"/>
+              <w:right w:val="single" w:sz="4" w:color="D9D9D9"/>
+            </w:tcBorders>
+          </w:tcPr>
+          <w:p>
+            <w:pPr>
+              <w:spacing w:after="20" w:line="240" w:lineRule="auto"/>
+            </w:pPr>
+            <w:r>
+              <w:rPr>
+                <w:b w:val="0"/>
+                <w:sz w:val="19"/>
+              </w:rPr>
+              <w:t>user_id</w:t>
+            </w:r>
+          </w:p>
+        </w:tc>
+        <w:tc>
+          <w:tcPr>
+            <w:tcW w:type="dxa" w:w="4421"/>
+            <w:vAlign w:val="center"/>
+            <w:shd w:fill="FFFFFF"/>
+            <w:tcMar>
+              <w:top w:w="75" w:type="dxa"/>
+              <w:bottom w:w="75" w:type="dxa"/>
+              <w:left w:w="100" w:type="dxa"/>
+              <w:right w:w="100" w:type="dxa"/>
+            </w:tcMar>
+            <w:tcBorders>
+              <w:top w:val="single" w:sz="4" w:color="D9D9D9"/>
+              <w:bottom w:val="single" w:sz="4" w:color="D9D9D9"/>
+              <w:left w:val="single" w:sz="4" w:color="D9D9D9"/>
+              <w:right w:val="single" w:sz="4" w:color="D9D9D9"/>
+            </w:tcBorders>
+          </w:tcPr>
+          <w:p>
+            <w:pPr>
+              <w:spacing w:after="20" w:line="240" w:lineRule="auto"/>
+            </w:pPr>
+            <w:r>
+              <w:rPr>
+                <w:b w:val="0"/>
+                <w:sz w:val="19"/>
+              </w:rPr>
+              <w:t>INTEGER PRIMARY KEY</w:t>
+            </w:r>
+          </w:p>
+        </w:tc>
+        <w:tc>
+          <w:tcPr>
+            <w:tcW w:type="dxa" w:w="3600"/>
+            <w:vAlign w:val="center"/>
+            <w:shd w:fill="FFFFFF"/>
+            <w:tcMar>
+              <w:top w:w="75" w:type="dxa"/>
+              <w:bottom w:w="75" w:type="dxa"/>
+              <w:left w:w="100" w:type="dxa"/>
+              <w:right w:w="100" w:type="dxa"/>
+            </w:tcMar>
+            <w:tcBorders>
+              <w:top w:val="single" w:sz="4" w:color="D9D9D9"/>
+              <w:bottom w:val="single" w:sz="4" w:color="D9D9D9"/>
+              <w:left w:val="single" w:sz="4" w:color="D9D9D9"/>
+              <w:right w:val="single" w:sz="4" w:color="D9D9D9"/>
+            </w:tcBorders>
+          </w:tcPr>
+          <w:p>
+            <w:pPr>
+              <w:spacing w:after="20" w:line="240" w:lineRule="auto"/>
+            </w:pPr>
+            <w:r>
+              <w:rPr>
+                <w:b w:val="0"/>
+                <w:sz w:val="19"/>
+              </w:rPr>
+              <w:t>User identity for domain relations.</w:t>
+            </w:r>
+          </w:p>
+        </w:tc>
+      </w:tr>
+      <w:tr>
+        <w:trPr>
+          <w:cantSplit/>
+        </w:trPr>
+        <w:tc>
+          <w:tcPr>
+            <w:tcW w:type="dxa" w:w="2059"/>
+            <w:vAlign w:val="center"/>
+            <w:shd w:fill="FFFFFF"/>
+            <w:tcMar>
+              <w:top w:w="75" w:type="dxa"/>
+              <w:bottom w:w="75" w:type="dxa"/>
+              <w:left w:w="100" w:type="dxa"/>
+              <w:right w:w="100" w:type="dxa"/>
+            </w:tcMar>
+            <w:tcBorders>
+              <w:top w:val="single" w:sz="4" w:color="D9D9D9"/>
+              <w:bottom w:val="single" w:sz="4" w:color="D9D9D9"/>
+              <w:left w:val="single" w:sz="4" w:color="D9D9D9"/>
+              <w:right w:val="single" w:sz="4" w:color="D9D9D9"/>
+            </w:tcBorders>
+          </w:tcPr>
+          <w:p>
+            <w:pPr>
+              <w:spacing w:after="20" w:line="240" w:lineRule="auto"/>
+            </w:pPr>
+            <w:r>
+              <w:rPr>
+                <w:b w:val="0"/>
+                <w:sz w:val="19"/>
+              </w:rPr>
+              <w:t>university_id</w:t>
+            </w:r>
+          </w:p>
+        </w:tc>
+        <w:tc>
+          <w:tcPr>
+            <w:tcW w:type="dxa" w:w="4421"/>
+            <w:vAlign w:val="center"/>
+            <w:shd w:fill="FFFFFF"/>
+            <w:tcMar>
+              <w:top w:w="75" w:type="dxa"/>
+              <w:bottom w:w="75" w:type="dxa"/>
+              <w:left w:w="100" w:type="dxa"/>
+              <w:right w:w="100" w:type="dxa"/>
+            </w:tcMar>
+            <w:tcBorders>
+              <w:top w:val="single" w:sz="4" w:color="D9D9D9"/>
+              <w:bottom w:val="single" w:sz="4" w:color="D9D9D9"/>
+              <w:left w:val="single" w:sz="4" w:color="D9D9D9"/>
+              <w:right w:val="single" w:sz="4" w:color="D9D9D9"/>
+            </w:tcBorders>
+          </w:tcPr>
+          <w:p>
+            <w:pPr>
+              <w:spacing w:after="20" w:line="240" w:lineRule="auto"/>
+            </w:pPr>
+            <w:r>
+              <w:rPr>
+                <w:b w:val="0"/>
+                <w:sz w:val="19"/>
+              </w:rPr>
+              <w:t>TEXT NOT NULL UNIQUE; length 1-20</w:t>
+            </w:r>
+          </w:p>
+        </w:tc>
+        <w:tc>
+          <w:tcPr>
+            <w:tcW w:type="dxa" w:w="3600"/>
+            <w:vAlign w:val="center"/>
+            <w:shd w:fill="FFFFFF"/>
+            <w:tcMar>
+              <w:top w:w="75" w:type="dxa"/>
+              <w:bottom w:w="75" w:type="dxa"/>
+              <w:left w:w="100" w:type="dxa"/>
+              <w:right w:w="100" w:type="dxa"/>
+            </w:tcMar>
+            <w:tcBorders>
+              <w:top w:val="single" w:sz="4" w:color="D9D9D9"/>
+              <w:bottom w:val="single" w:sz="4" w:color="D9D9D9"/>
+              <w:left w:val="single" w:sz="4" w:color="D9D9D9"/>
+              <w:right w:val="single" w:sz="4" w:color="D9D9D9"/>
+            </w:tcBorders>
+          </w:tcPr>
+          <w:p>
+            <w:pPr>
+              <w:spacing w:after="20" w:line="240" w:lineRule="auto"/>
+            </w:pPr>
+            <w:r>
+              <w:rPr>
+                <w:b w:val="0"/>
+                <w:sz w:val="19"/>
+              </w:rPr>
+              <w:t>University account identifier.</w:t>
+            </w:r>
+          </w:p>
+        </w:tc>
+      </w:tr>
+      <w:tr>
+        <w:trPr>
+          <w:cantSplit/>
+        </w:trPr>
+        <w:tc>
+          <w:tcPr>
+            <w:tcW w:type="dxa" w:w="2059"/>
+            <w:vAlign w:val="center"/>
+            <w:shd w:fill="FFFFFF"/>
+            <w:tcMar>
+              <w:top w:w="75" w:type="dxa"/>
+              <w:bottom w:w="75" w:type="dxa"/>
+              <w:left w:w="100" w:type="dxa"/>
+              <w:right w:w="100" w:type="dxa"/>
+            </w:tcMar>
+            <w:tcBorders>
+              <w:top w:val="single" w:sz="4" w:color="D9D9D9"/>
+              <w:bottom w:val="single" w:sz="4" w:color="D9D9D9"/>
+              <w:left w:val="single" w:sz="4" w:color="D9D9D9"/>
+              <w:right w:val="single" w:sz="4" w:color="D9D9D9"/>
+            </w:tcBorders>
+          </w:tcPr>
+          <w:p>
+            <w:pPr>
+              <w:spacing w:after="20" w:line="240" w:lineRule="auto"/>
+            </w:pPr>
+            <w:r>
+              <w:rPr>
+                <w:b w:val="0"/>
+                <w:sz w:val="19"/>
+              </w:rPr>
+              <w:t>name; email</w:t>
+            </w:r>
+          </w:p>
+        </w:tc>
+        <w:tc>
+          <w:tcPr>
+            <w:tcW w:type="dxa" w:w="4421"/>
+            <w:vAlign w:val="center"/>
+            <w:shd w:fill="FFFFFF"/>
+            <w:tcMar>
+              <w:top w:w="75" w:type="dxa"/>
+              <w:bottom w:w="75" w:type="dxa"/>
+              <w:left w:w="100" w:type="dxa"/>
+              <w:right w:w="100" w:type="dxa"/>
+            </w:tcMar>
+            <w:tcBorders>
+              <w:top w:val="single" w:sz="4" w:color="D9D9D9"/>
+              <w:bottom w:val="single" w:sz="4" w:color="D9D9D9"/>
+              <w:left w:val="single" w:sz="4" w:color="D9D9D9"/>
+              <w:right w:val="single" w:sz="4" w:color="D9D9D9"/>
+            </w:tcBorders>
+          </w:tcPr>
+          <w:p>
+            <w:pPr>
+              <w:spacing w:after="20" w:line="240" w:lineRule="auto"/>
+            </w:pPr>
+            <w:r>
+              <w:rPr>
+                <w:b w:val="0"/>
+                <w:sz w:val="19"/>
+              </w:rPr>
+              <w:t>TEXT NOT NULL; 1-100 each; email UNIQUE</w:t>
+            </w:r>
+          </w:p>
+        </w:tc>
+        <w:tc>
+          <w:tcPr>
+            <w:tcW w:type="dxa" w:w="3600"/>
+            <w:vAlign w:val="center"/>
+            <w:shd w:fill="FFFFFF"/>
+            <w:tcMar>
+              <w:top w:w="75" w:type="dxa"/>
+              <w:bottom w:w="75" w:type="dxa"/>
+              <w:left w:w="100" w:type="dxa"/>
+              <w:right w:w="100" w:type="dxa"/>
+            </w:tcMar>
+            <w:tcBorders>
+              <w:top w:val="single" w:sz="4" w:color="D9D9D9"/>
+              <w:bottom w:val="single" w:sz="4" w:color="D9D9D9"/>
+              <w:left w:val="single" w:sz="4" w:color="D9D9D9"/>
+              <w:right w:val="single" w:sz="4" w:color="D9D9D9"/>
+            </w:tcBorders>
+          </w:tcPr>
+          <w:p>
+            <w:pPr>
+              <w:spacing w:after="20" w:line="240" w:lineRule="auto"/>
+            </w:pPr>
+            <w:r>
+              <w:rPr>
+                <w:b w:val="0"/>
+                <w:sz w:val="19"/>
+              </w:rPr>
+              <w:t>Profile and contact address.</w:t>
+            </w:r>
+          </w:p>
+        </w:tc>
+      </w:tr>
+      <w:tr>
+        <w:trPr>
+          <w:cantSplit/>
+        </w:trPr>
+        <w:tc>
+          <w:tcPr>
+            <w:tcW w:type="dxa" w:w="2059"/>
+            <w:vAlign w:val="center"/>
+            <w:shd w:fill="FFFFFF"/>
+            <w:tcMar>
+              <w:top w:w="75" w:type="dxa"/>
+              <w:bottom w:w="75" w:type="dxa"/>
+              <w:left w:w="100" w:type="dxa"/>
+              <w:right w:w="100" w:type="dxa"/>
+            </w:tcMar>
+            <w:tcBorders>
+              <w:top w:val="single" w:sz="4" w:color="D9D9D9"/>
+              <w:bottom w:val="single" w:sz="4" w:color="D9D9D9"/>
+              <w:left w:val="single" w:sz="4" w:color="D9D9D9"/>
+              <w:right w:val="single" w:sz="4" w:color="D9D9D9"/>
+            </w:tcBorders>
+          </w:tcPr>
+          <w:p>
+            <w:pPr>
+              <w:spacing w:after="20" w:line="240" w:lineRule="auto"/>
+            </w:pPr>
+            <w:r>
+              <w:rPr>
+                <w:b w:val="0"/>
+                <w:sz w:val="19"/>
+              </w:rPr>
+              <w:t>password_hash</w:t>
+            </w:r>
+          </w:p>
+        </w:tc>
+        <w:tc>
+          <w:tcPr>
+            <w:tcW w:type="dxa" w:w="4421"/>
+            <w:vAlign w:val="center"/>
+            <w:shd w:fill="FFFFFF"/>
+            <w:tcMar>
+              <w:top w:w="75" w:type="dxa"/>
+              <w:bottom w:w="75" w:type="dxa"/>
+              <w:left w:w="100" w:type="dxa"/>
+              <w:right w:w="100" w:type="dxa"/>
+            </w:tcMar>
+            <w:tcBorders>
+              <w:top w:val="single" w:sz="4" w:color="D9D9D9"/>
+              <w:bottom w:val="single" w:sz="4" w:color="D9D9D9"/>
+              <w:left w:val="single" w:sz="4" w:color="D9D9D9"/>
+              <w:right w:val="single" w:sz="4" w:color="D9D9D9"/>
+            </w:tcBorders>
+          </w:tcPr>
+          <w:p>
+            <w:pPr>
+              <w:spacing w:after="20" w:line="240" w:lineRule="auto"/>
+            </w:pPr>
+            <w:r>
+              <w:rPr>
+                <w:b w:val="0"/>
+                <w:sz w:val="19"/>
+              </w:rPr>
+              <w:t>TEXT NOT NULL; length &lt;=255</w:t>
+            </w:r>
+          </w:p>
+        </w:tc>
+        <w:tc>
+          <w:tcPr>
+            <w:tcW w:type="dxa" w:w="3600"/>
+            <w:vAlign w:val="center"/>
+            <w:shd w:fill="FFFFFF"/>
+            <w:tcMar>
+              <w:top w:w="75" w:type="dxa"/>
+              <w:bottom w:w="75" w:type="dxa"/>
+              <w:left w:w="100" w:type="dxa"/>
+              <w:right w:w="100" w:type="dxa"/>
+            </w:tcMar>
+            <w:tcBorders>
+              <w:top w:val="single" w:sz="4" w:color="D9D9D9"/>
+              <w:bottom w:val="single" w:sz="4" w:color="D9D9D9"/>
+              <w:left w:val="single" w:sz="4" w:color="D9D9D9"/>
+              <w:right w:val="single" w:sz="4" w:color="D9D9D9"/>
+            </w:tcBorders>
+          </w:tcPr>
+          <w:p>
+            <w:pPr>
+              <w:spacing w:after="20" w:line="240" w:lineRule="auto"/>
+            </w:pPr>
+            <w:r>
+              <w:rPr>
+                <w:b w:val="0"/>
+                <w:sz w:val="19"/>
+              </w:rPr>
+              <w:t>Salted adaptive hash encoding.</w:t>
+            </w:r>
+          </w:p>
+        </w:tc>
+      </w:tr>
+      <w:tr>
+        <w:trPr>
+          <w:cantSplit/>
+        </w:trPr>
+        <w:tc>
+          <w:tcPr>
+            <w:tcW w:type="dxa" w:w="2059"/>
+            <w:vAlign w:val="center"/>
+            <w:shd w:fill="FFFFFF"/>
+            <w:tcMar>
+              <w:top w:w="75" w:type="dxa"/>
+              <w:bottom w:w="75" w:type="dxa"/>
+              <w:left w:w="100" w:type="dxa"/>
+              <w:right w:w="100" w:type="dxa"/>
+            </w:tcMar>
+            <w:tcBorders>
+              <w:top w:val="single" w:sz="4" w:color="D9D9D9"/>
+              <w:bottom w:val="single" w:sz="4" w:color="D9D9D9"/>
+              <w:left w:val="single" w:sz="4" w:color="D9D9D9"/>
+              <w:right w:val="single" w:sz="4" w:color="D9D9D9"/>
+            </w:tcBorders>
+          </w:tcPr>
+          <w:p>
+            <w:pPr>
+              <w:spacing w:after="20" w:line="240" w:lineRule="auto"/>
+            </w:pPr>
+            <w:r>
+              <w:rPr>
+                <w:b w:val="0"/>
+                <w:sz w:val="19"/>
+              </w:rPr>
+              <w:t>role</w:t>
+            </w:r>
+          </w:p>
+        </w:tc>
+        <w:tc>
+          <w:tcPr>
+            <w:tcW w:type="dxa" w:w="4421"/>
+            <w:vAlign w:val="center"/>
+            <w:shd w:fill="FFFFFF"/>
+            <w:tcMar>
+              <w:top w:w="75" w:type="dxa"/>
+              <w:bottom w:w="75" w:type="dxa"/>
+              <w:left w:w="100" w:type="dxa"/>
+              <w:right w:w="100" w:type="dxa"/>
+            </w:tcMar>
+            <w:tcBorders>
+              <w:top w:val="single" w:sz="4" w:color="D9D9D9"/>
+              <w:bottom w:val="single" w:sz="4" w:color="D9D9D9"/>
+              <w:left w:val="single" w:sz="4" w:color="D9D9D9"/>
+              <w:right w:val="single" w:sz="4" w:color="D9D9D9"/>
+            </w:tcBorders>
+          </w:tcPr>
+          <w:p>
+            <w:pPr>
+              <w:spacing w:after="20" w:line="240" w:lineRule="auto"/>
+            </w:pPr>
+            <w:r>
+              <w:rPr>
+                <w:b w:val="0"/>
+                <w:sz w:val="19"/>
+              </w:rPr>
+              <w:t>TEXT NOT NULL; enum Student/Faculty/Committee/Dean</w:t>
+            </w:r>
+          </w:p>
+        </w:tc>
+        <w:tc>
+          <w:tcPr>
+            <w:tcW w:type="dxa" w:w="3600"/>
+            <w:vAlign w:val="center"/>
+            <w:shd w:fill="FFFFFF"/>
+            <w:tcMar>
+              <w:top w:w="75" w:type="dxa"/>
+              <w:bottom w:w="75" w:type="dxa"/>
+              <w:left w:w="100" w:type="dxa"/>
+              <w:right w:w="100" w:type="dxa"/>
+            </w:tcMar>
+            <w:tcBorders>
+              <w:top w:val="single" w:sz="4" w:color="D9D9D9"/>
+              <w:bottom w:val="single" w:sz="4" w:color="D9D9D9"/>
+              <w:left w:val="single" w:sz="4" w:color="D9D9D9"/>
+              <w:right w:val="single" w:sz="4" w:color="D9D9D9"/>
+            </w:tcBorders>
+          </w:tcPr>
+          <w:p>
+            <w:pPr>
+              <w:spacing w:after="20" w:line="240" w:lineRule="auto"/>
+            </w:pPr>
+            <w:r>
+              <w:rPr>
+                <w:b w:val="0"/>
+                <w:sz w:val="19"/>
+              </w:rPr>
+              <w:t>Stored values map to SRS user classes.</w:t>
+            </w:r>
+          </w:p>
+        </w:tc>
+      </w:tr>
+      <w:tr>
+        <w:trPr>
+          <w:cantSplit/>
+        </w:trPr>
+        <w:tc>
+          <w:tcPr>
+            <w:tcW w:type="dxa" w:w="2059"/>
+            <w:vAlign w:val="center"/>
+            <w:shd w:fill="FFFFFF"/>
+            <w:tcMar>
+              <w:top w:w="75" w:type="dxa"/>
+              <w:bottom w:w="75" w:type="dxa"/>
+              <w:left w:w="100" w:type="dxa"/>
+              <w:right w:w="100" w:type="dxa"/>
+            </w:tcMar>
+            <w:tcBorders>
+              <w:top w:val="single" w:sz="4" w:color="D9D9D9"/>
+              <w:bottom w:val="single" w:sz="4" w:color="D9D9D9"/>
+              <w:left w:val="single" w:sz="4" w:color="D9D9D9"/>
+              <w:right w:val="single" w:sz="4" w:color="D9D9D9"/>
+            </w:tcBorders>
+          </w:tcPr>
+          <w:p>
+            <w:pPr>
+              <w:spacing w:after="20" w:line="240" w:lineRule="auto"/>
+            </w:pPr>
+            <w:r>
+              <w:rPr>
+                <w:b w:val="0"/>
+                <w:sz w:val="19"/>
+              </w:rPr>
+              <w:t>created_at</w:t>
+            </w:r>
+          </w:p>
+        </w:tc>
+        <w:tc>
+          <w:tcPr>
+            <w:tcW w:type="dxa" w:w="4421"/>
+            <w:vAlign w:val="center"/>
+            <w:shd w:fill="FFFFFF"/>
+            <w:tcMar>
+              <w:top w:w="75" w:type="dxa"/>
+              <w:bottom w:w="75" w:type="dxa"/>
+              <w:left w:w="100" w:type="dxa"/>
+              <w:right w:w="100" w:type="dxa"/>
+            </w:tcMar>
+            <w:tcBorders>
+              <w:top w:val="single" w:sz="4" w:color="D9D9D9"/>
+              <w:bottom w:val="single" w:sz="4" w:color="D9D9D9"/>
+              <w:left w:val="single" w:sz="4" w:color="D9D9D9"/>
+              <w:right w:val="single" w:sz="4" w:color="D9D9D9"/>
+            </w:tcBorders>
+          </w:tcPr>
+          <w:p>
+            <w:pPr>
+              <w:spacing w:after="20" w:line="240" w:lineRule="auto"/>
+            </w:pPr>
+            <w:r>
+              <w:rPr>
+                <w:b w:val="0"/>
+                <w:sz w:val="19"/>
+              </w:rPr>
+              <w:t>TEXT NOT NULL UTC timestamp</w:t>
+            </w:r>
+          </w:p>
+        </w:tc>
+        <w:tc>
+          <w:tcPr>
+            <w:tcW w:type="dxa" w:w="3600"/>
+            <w:vAlign w:val="center"/>
+            <w:shd w:fill="FFFFFF"/>
+            <w:tcMar>
+              <w:top w:w="75" w:type="dxa"/>
+              <w:bottom w:w="75" w:type="dxa"/>
+              <w:left w:w="100" w:type="dxa"/>
+              <w:right w:w="100" w:type="dxa"/>
+            </w:tcMar>
+            <w:tcBorders>
+              <w:top w:val="single" w:sz="4" w:color="D9D9D9"/>
+              <w:bottom w:val="single" w:sz="4" w:color="D9D9D9"/>
+              <w:left w:val="single" w:sz="4" w:color="D9D9D9"/>
+              <w:right w:val="single" w:sz="4" w:color="D9D9D9"/>
+            </w:tcBorders>
+          </w:tcPr>
+          <w:p>
+            <w:pPr>
+              <w:spacing w:after="20" w:line="240" w:lineRule="auto"/>
+            </w:pPr>
+            <w:r>
+              <w:rPr>
+                <w:b w:val="0"/>
+                <w:sz w:val="19"/>
+              </w:rPr>
+              <w:t>Creation time.</w:t>
+            </w:r>
+          </w:p>
+        </w:tc>
+      </w:tr>
+    </w:tbl>
+    <w:p>
+      <w:pPr>
+        <w:spacing w:after="0"/>
+      </w:pPr>
+    </w:p>
+    <w:p>
+      <w:pPr>
+        <w:pStyle w:val="Heading2"/>
+      </w:pPr>
+      <w:r>
+        <w:t>3 7 2 Complaints</w:t>
+      </w:r>
+    </w:p>
+    <w:tbl>
+      <w:tblPr>
+        <w:tblW w:type="auto" w:w="0"/>
+        <w:tblLayout w:type="fixed"/>
+        <w:tblLook w:firstColumn="1" w:firstRow="1" w:lastColumn="0" w:lastRow="0" w:noHBand="0" w:noVBand="1" w:val="04A0"/>
+      </w:tblPr>
+      <w:tblGrid>
+        <w:gridCol w:w="2448"/>
+        <w:gridCol w:w="4032"/>
+        <w:gridCol w:w="3600"/>
+      </w:tblGrid>
+      <w:tr>
+        <w:trPr>
+          <w:cantSplit/>
+          <w:tblHeader/>
+        </w:trPr>
+        <w:tc>
+          <w:tcPr>
+            <w:tcW w:type="dxa" w:w="2448"/>
+            <w:vAlign w:val="center"/>
+            <w:shd w:fill="E6EDF3"/>
+            <w:tcMar>
+              <w:top w:w="75" w:type="dxa"/>
+              <w:bottom w:w="75" w:type="dxa"/>
+              <w:left w:w="100" w:type="dxa"/>
+              <w:right w:w="100" w:type="dxa"/>
+            </w:tcMar>
+            <w:tcBorders>
+              <w:top w:val="single" w:sz="4" w:color="D9D9D9"/>
+              <w:bottom w:val="single" w:sz="4" w:color="D9D9D9"/>
+              <w:left w:val="single" w:sz="4" w:color="D9D9D9"/>
+              <w:right w:val="single" w:sz="4" w:color="D9D9D9"/>
+            </w:tcBorders>
+          </w:tcPr>
+          <w:p>
+            <w:pPr>
+              <w:spacing w:after="20" w:line="240" w:lineRule="auto"/>
+            </w:pPr>
+            <w:r>
+              <w:rPr>
+                <w:b/>
+                <w:sz w:val="19"/>
+              </w:rPr>
+              <w:t>Field</w:t>
+            </w:r>
+          </w:p>
+        </w:tc>
+        <w:tc>
+          <w:tcPr>
+            <w:tcW w:type="dxa" w:w="4032"/>
+            <w:vAlign w:val="center"/>
+            <w:shd w:fill="E6EDF3"/>
+            <w:tcMar>
+              <w:top w:w="75" w:type="dxa"/>
+              <w:bottom w:w="75" w:type="dxa"/>
+              <w:left w:w="100" w:type="dxa"/>
+              <w:right w:w="100" w:type="dxa"/>
+            </w:tcMar>
+            <w:tcBorders>
+              <w:top w:val="single" w:sz="4" w:color="D9D9D9"/>
+              <w:bottom w:val="single" w:sz="4" w:color="D9D9D9"/>
+              <w:left w:val="single" w:sz="4" w:color="D9D9D9"/>
+              <w:right w:val="single" w:sz="4" w:color="D9D9D9"/>
+            </w:tcBorders>
+          </w:tcPr>
+          <w:p>
+            <w:pPr>
+              <w:spacing w:after="20" w:line="240" w:lineRule="auto"/>
+            </w:pPr>
+            <w:r>
+              <w:rPr>
+                <w:b/>
+                <w:sz w:val="19"/>
+              </w:rPr>
+              <w:t>Type and constraint</w:t>
+            </w:r>
+          </w:p>
+        </w:tc>
+        <w:tc>
+          <w:tcPr>
+            <w:tcW w:type="dxa" w:w="3600"/>
+            <w:vAlign w:val="center"/>
+            <w:shd w:fill="E6EDF3"/>
+            <w:tcMar>
+              <w:top w:w="75" w:type="dxa"/>
+              <w:bottom w:w="75" w:type="dxa"/>
+              <w:left w:w="100" w:type="dxa"/>
+              <w:right w:w="100" w:type="dxa"/>
+            </w:tcMar>
+            <w:tcBorders>
+              <w:top w:val="single" w:sz="4" w:color="D9D9D9"/>
+              <w:bottom w:val="single" w:sz="4" w:color="D9D9D9"/>
+              <w:left w:val="single" w:sz="4" w:color="D9D9D9"/>
+              <w:right w:val="single" w:sz="4" w:color="D9D9D9"/>
+            </w:tcBorders>
+          </w:tcPr>
+          <w:p>
+            <w:pPr>
+              <w:spacing w:after="20" w:line="240" w:lineRule="auto"/>
+            </w:pPr>
+            <w:r>
+              <w:rPr>
+                <w:b/>
+                <w:sz w:val="19"/>
+              </w:rPr>
+              <w:t>Purpose</w:t>
+            </w:r>
+          </w:p>
+        </w:tc>
+      </w:tr>
+      <w:tr>
+        <w:trPr>
+          <w:cantSplit/>
+        </w:trPr>
+        <w:tc>
+          <w:tcPr>
+            <w:tcW w:type="dxa" w:w="2448"/>
+            <w:vAlign w:val="center"/>
+            <w:shd w:fill="FFFFFF"/>
+            <w:tcMar>
+              <w:top w:w="75" w:type="dxa"/>
+              <w:bottom w:w="75" w:type="dxa"/>
+              <w:left w:w="100" w:type="dxa"/>
+              <w:right w:w="100" w:type="dxa"/>
+            </w:tcMar>
+            <w:tcBorders>
+              <w:top w:val="single" w:sz="4" w:color="D9D9D9"/>
+              <w:bottom w:val="single" w:sz="4" w:color="D9D9D9"/>
+              <w:left w:val="single" w:sz="4" w:color="D9D9D9"/>
+              <w:right w:val="single" w:sz="4" w:color="D9D9D9"/>
+            </w:tcBorders>
+          </w:tcPr>
+          <w:p>
+            <w:pPr>
+              <w:spacing w:after="20" w:line="240" w:lineRule="auto"/>
+            </w:pPr>
+            <w:r>
+              <w:rPr>
+                <w:b w:val="0"/>
+                <w:sz w:val="19"/>
+              </w:rPr>
+              <w:t>complaint_id; student_id</w:t>
+            </w:r>
+          </w:p>
+        </w:tc>
+        <w:tc>
+          <w:tcPr>
+            <w:tcW w:type="dxa" w:w="4032"/>
+            <w:vAlign w:val="center"/>
+            <w:shd w:fill="FFFFFF"/>
+            <w:tcMar>
+              <w:top w:w="75" w:type="dxa"/>
+              <w:bottom w:w="75" w:type="dxa"/>
+              <w:left w:w="100" w:type="dxa"/>
+              <w:right w:w="100" w:type="dxa"/>
+            </w:tcMar>
+            <w:tcBorders>
+              <w:top w:val="single" w:sz="4" w:color="D9D9D9"/>
+              <w:bottom w:val="single" w:sz="4" w:color="D9D9D9"/>
+              <w:left w:val="single" w:sz="4" w:color="D9D9D9"/>
+              <w:right w:val="single" w:sz="4" w:color="D9D9D9"/>
+            </w:tcBorders>
+          </w:tcPr>
+          <w:p>
+            <w:pPr>
+              <w:spacing w:after="20" w:line="240" w:lineRule="auto"/>
+            </w:pPr>
+            <w:r>
+              <w:rPr>
+                <w:b w:val="0"/>
+                <w:sz w:val="19"/>
+              </w:rPr>
+              <w:t>INTEGER PK; INTEGER NOT NULL FK users</w:t>
+            </w:r>
+          </w:p>
+        </w:tc>
+        <w:tc>
+          <w:tcPr>
+            <w:tcW w:type="dxa" w:w="3600"/>
+            <w:vAlign w:val="center"/>
+            <w:shd w:fill="FFFFFF"/>
+            <w:tcMar>
+              <w:top w:w="75" w:type="dxa"/>
+              <w:bottom w:w="75" w:type="dxa"/>
+              <w:left w:w="100" w:type="dxa"/>
+              <w:right w:w="100" w:type="dxa"/>
+            </w:tcMar>
+            <w:tcBorders>
+              <w:top w:val="single" w:sz="4" w:color="D9D9D9"/>
+              <w:bottom w:val="single" w:sz="4" w:color="D9D9D9"/>
+              <w:left w:val="single" w:sz="4" w:color="D9D9D9"/>
+              <w:right w:val="single" w:sz="4" w:color="D9D9D9"/>
+            </w:tcBorders>
+          </w:tcPr>
+          <w:p>
+            <w:pPr>
+              <w:spacing w:after="20" w:line="240" w:lineRule="auto"/>
+            </w:pPr>
+            <w:r>
+              <w:rPr>
+                <w:b w:val="0"/>
+                <w:sz w:val="19"/>
+              </w:rPr>
+              <w:t>Unique record and submitting owner.</w:t>
+            </w:r>
+          </w:p>
+        </w:tc>
+      </w:tr>
+      <w:tr>
+        <w:trPr>
+          <w:cantSplit/>
+        </w:trPr>
+        <w:tc>
+          <w:tcPr>
+            <w:tcW w:type="dxa" w:w="2448"/>
+            <w:vAlign w:val="center"/>
+            <w:shd w:fill="FFFFFF"/>
+            <w:tcMar>
+              <w:top w:w="75" w:type="dxa"/>
+              <w:bottom w:w="75" w:type="dxa"/>
+              <w:left w:w="100" w:type="dxa"/>
+              <w:right w:w="100" w:type="dxa"/>
+            </w:tcMar>
+            <w:tcBorders>
+              <w:top w:val="single" w:sz="4" w:color="D9D9D9"/>
+              <w:bottom w:val="single" w:sz="4" w:color="D9D9D9"/>
+              <w:left w:val="single" w:sz="4" w:color="D9D9D9"/>
+              <w:right w:val="single" w:sz="4" w:color="D9D9D9"/>
+            </w:tcBorders>
+          </w:tcPr>
+          <w:p>
+            <w:pPr>
+              <w:spacing w:after="20" w:line="240" w:lineRule="auto"/>
+            </w:pPr>
+            <w:r>
+              <w:rPr>
+                <w:b w:val="0"/>
+                <w:sz w:val="19"/>
+              </w:rPr>
+              <w:t>category; description</w:t>
+            </w:r>
+          </w:p>
+        </w:tc>
+        <w:tc>
+          <w:tcPr>
+            <w:tcW w:type="dxa" w:w="4032"/>
+            <w:vAlign w:val="center"/>
+            <w:shd w:fill="FFFFFF"/>
+            <w:tcMar>
+              <w:top w:w="75" w:type="dxa"/>
+              <w:bottom w:w="75" w:type="dxa"/>
+              <w:left w:w="100" w:type="dxa"/>
+              <w:right w:w="100" w:type="dxa"/>
+            </w:tcMar>
+            <w:tcBorders>
+              <w:top w:val="single" w:sz="4" w:color="D9D9D9"/>
+              <w:bottom w:val="single" w:sz="4" w:color="D9D9D9"/>
+              <w:left w:val="single" w:sz="4" w:color="D9D9D9"/>
+              <w:right w:val="single" w:sz="4" w:color="D9D9D9"/>
+            </w:tcBorders>
+          </w:tcPr>
+          <w:p>
+            <w:pPr>
+              <w:spacing w:after="20" w:line="240" w:lineRule="auto"/>
+            </w:pPr>
+            <w:r>
+              <w:rPr>
+                <w:b w:val="0"/>
+                <w:sz w:val="19"/>
+              </w:rPr>
+              <w:t>TEXT NOT NULL; 1-50 and 1-1000</w:t>
+            </w:r>
+          </w:p>
+        </w:tc>
+        <w:tc>
+          <w:tcPr>
+            <w:tcW w:type="dxa" w:w="3600"/>
+            <w:vAlign w:val="center"/>
+            <w:shd w:fill="FFFFFF"/>
+            <w:tcMar>
+              <w:top w:w="75" w:type="dxa"/>
+              <w:bottom w:w="75" w:type="dxa"/>
+              <w:left w:w="100" w:type="dxa"/>
+              <w:right w:w="100" w:type="dxa"/>
+            </w:tcMar>
+            <w:tcBorders>
+              <w:top w:val="single" w:sz="4" w:color="D9D9D9"/>
+              <w:bottom w:val="single" w:sz="4" w:color="D9D9D9"/>
+              <w:left w:val="single" w:sz="4" w:color="D9D9D9"/>
+              <w:right w:val="single" w:sz="4" w:color="D9D9D9"/>
+            </w:tcBorders>
+          </w:tcPr>
+          <w:p>
+            <w:pPr>
+              <w:spacing w:after="20" w:line="240" w:lineRule="auto"/>
+            </w:pPr>
+            <w:r>
+              <w:rPr>
+                <w:b w:val="0"/>
+                <w:sz w:val="19"/>
+              </w:rPr>
+              <w:t>Validated complaint content.</w:t>
+            </w:r>
+          </w:p>
+        </w:tc>
+      </w:tr>
+      <w:tr>
+        <w:trPr>
+          <w:cantSplit/>
+        </w:trPr>
+        <w:tc>
+          <w:tcPr>
+            <w:tcW w:type="dxa" w:w="2448"/>
+            <w:vAlign w:val="center"/>
+            <w:shd w:fill="FFFFFF"/>
+            <w:tcMar>
+              <w:top w:w="75" w:type="dxa"/>
+              <w:bottom w:w="75" w:type="dxa"/>
+              <w:left w:w="100" w:type="dxa"/>
+              <w:right w:w="100" w:type="dxa"/>
+            </w:tcMar>
+            <w:tcBorders>
+              <w:top w:val="single" w:sz="4" w:color="D9D9D9"/>
+              <w:bottom w:val="single" w:sz="4" w:color="D9D9D9"/>
+              <w:left w:val="single" w:sz="4" w:color="D9D9D9"/>
+              <w:right w:val="single" w:sz="4" w:color="D9D9D9"/>
+            </w:tcBorders>
+          </w:tcPr>
+          <w:p>
+            <w:pPr>
+              <w:spacing w:after="20" w:line="240" w:lineRule="auto"/>
+            </w:pPr>
+            <w:r>
+              <w:rPr>
+                <w:b w:val="0"/>
+                <w:sz w:val="19"/>
+              </w:rPr>
+              <w:t>severity; status</w:t>
+            </w:r>
+          </w:p>
+        </w:tc>
+        <w:tc>
+          <w:tcPr>
+            <w:tcW w:type="dxa" w:w="4032"/>
+            <w:vAlign w:val="center"/>
+            <w:shd w:fill="FFFFFF"/>
+            <w:tcMar>
+              <w:top w:w="75" w:type="dxa"/>
+              <w:bottom w:w="75" w:type="dxa"/>
+              <w:left w:w="100" w:type="dxa"/>
+              <w:right w:w="100" w:type="dxa"/>
+            </w:tcMar>
+            <w:tcBorders>
+              <w:top w:val="single" w:sz="4" w:color="D9D9D9"/>
+              <w:bottom w:val="single" w:sz="4" w:color="D9D9D9"/>
+              <w:left w:val="single" w:sz="4" w:color="D9D9D9"/>
+              <w:right w:val="single" w:sz="4" w:color="D9D9D9"/>
+            </w:tcBorders>
+          </w:tcPr>
+          <w:p>
+            <w:pPr>
+              <w:spacing w:after="20" w:line="240" w:lineRule="auto"/>
+            </w:pPr>
+            <w:r>
+              <w:rPr>
+                <w:b w:val="0"/>
+                <w:sz w:val="19"/>
+              </w:rPr>
+              <w:t>TEXT NOT NULL; constrained enumerations</w:t>
+            </w:r>
+          </w:p>
+        </w:tc>
+        <w:tc>
+          <w:tcPr>
+            <w:tcW w:type="dxa" w:w="3600"/>
+            <w:vAlign w:val="center"/>
+            <w:shd w:fill="FFFFFF"/>
+            <w:tcMar>
+              <w:top w:w="75" w:type="dxa"/>
+              <w:bottom w:w="75" w:type="dxa"/>
+              <w:left w:w="100" w:type="dxa"/>
+              <w:right w:w="100" w:type="dxa"/>
+            </w:tcMar>
+            <w:tcBorders>
+              <w:top w:val="single" w:sz="4" w:color="D9D9D9"/>
+              <w:bottom w:val="single" w:sz="4" w:color="D9D9D9"/>
+              <w:left w:val="single" w:sz="4" w:color="D9D9D9"/>
+              <w:right w:val="single" w:sz="4" w:color="D9D9D9"/>
+            </w:tcBorders>
+          </w:tcPr>
+          <w:p>
+            <w:pPr>
+              <w:spacing w:after="20" w:line="240" w:lineRule="auto"/>
+            </w:pPr>
+            <w:r>
+              <w:rPr>
+                <w:b w:val="0"/>
+                <w:sz w:val="19"/>
+              </w:rPr>
+              <w:t>Low/Medium/High and Section 3 4 states.</w:t>
+            </w:r>
+          </w:p>
+        </w:tc>
+      </w:tr>
+      <w:tr>
+        <w:trPr>
+          <w:cantSplit/>
+        </w:trPr>
+        <w:tc>
+          <w:tcPr>
+            <w:tcW w:type="dxa" w:w="2448"/>
+            <w:vAlign w:val="center"/>
+            <w:shd w:fill="FFFFFF"/>
+            <w:tcMar>
+              <w:top w:w="75" w:type="dxa"/>
+              <w:bottom w:w="75" w:type="dxa"/>
+              <w:left w:w="100" w:type="dxa"/>
+              <w:right w:w="100" w:type="dxa"/>
+            </w:tcMar>
+            <w:tcBorders>
+              <w:top w:val="single" w:sz="4" w:color="D9D9D9"/>
+              <w:bottom w:val="single" w:sz="4" w:color="D9D9D9"/>
+              <w:left w:val="single" w:sz="4" w:color="D9D9D9"/>
+              <w:right w:val="single" w:sz="4" w:color="D9D9D9"/>
+            </w:tcBorders>
+          </w:tcPr>
+          <w:p>
+            <w:pPr>
+              <w:spacing w:after="20" w:line="240" w:lineRule="auto"/>
+            </w:pPr>
+            <w:r>
+              <w:rPr>
+                <w:b w:val="0"/>
+                <w:sz w:val="19"/>
+              </w:rPr>
+              <w:t>current_level; assigned_to</w:t>
+            </w:r>
+          </w:p>
+        </w:tc>
+        <w:tc>
+          <w:tcPr>
+            <w:tcW w:type="dxa" w:w="4032"/>
+            <w:vAlign w:val="center"/>
+            <w:shd w:fill="FFFFFF"/>
+            <w:tcMar>
+              <w:top w:w="75" w:type="dxa"/>
+              <w:bottom w:w="75" w:type="dxa"/>
+              <w:left w:w="100" w:type="dxa"/>
+              <w:right w:w="100" w:type="dxa"/>
+            </w:tcMar>
+            <w:tcBorders>
+              <w:top w:val="single" w:sz="4" w:color="D9D9D9"/>
+              <w:bottom w:val="single" w:sz="4" w:color="D9D9D9"/>
+              <w:left w:val="single" w:sz="4" w:color="D9D9D9"/>
+              <w:right w:val="single" w:sz="4" w:color="D9D9D9"/>
+            </w:tcBorders>
+          </w:tcPr>
+          <w:p>
+            <w:pPr>
+              <w:spacing w:after="20" w:line="240" w:lineRule="auto"/>
+            </w:pPr>
+            <w:r>
+              <w:rPr>
+                <w:b w:val="0"/>
+                <w:sz w:val="19"/>
+              </w:rPr>
+              <w:t>INTEGER NOT NULL CHECK 1-3; optional FK users</w:t>
+            </w:r>
+          </w:p>
+        </w:tc>
+        <w:tc>
+          <w:tcPr>
+            <w:tcW w:type="dxa" w:w="3600"/>
+            <w:vAlign w:val="center"/>
+            <w:shd w:fill="FFFFFF"/>
+            <w:tcMar>
+              <w:top w:w="75" w:type="dxa"/>
+              <w:bottom w:w="75" w:type="dxa"/>
+              <w:left w:w="100" w:type="dxa"/>
+              <w:right w:w="100" w:type="dxa"/>
+            </w:tcMar>
+            <w:tcBorders>
+              <w:top w:val="single" w:sz="4" w:color="D9D9D9"/>
+              <w:bottom w:val="single" w:sz="4" w:color="D9D9D9"/>
+              <w:left w:val="single" w:sz="4" w:color="D9D9D9"/>
+              <w:right w:val="single" w:sz="4" w:color="D9D9D9"/>
+            </w:tcBorders>
+          </w:tcPr>
+          <w:p>
+            <w:pPr>
+              <w:spacing w:after="20" w:line="240" w:lineRule="auto"/>
+            </w:pPr>
+            <w:r>
+              <w:rPr>
+                <w:b w:val="0"/>
+                <w:sz w:val="19"/>
+              </w:rPr>
+              <w:t>Role queue and optional named handler.</w:t>
+            </w:r>
+          </w:p>
+        </w:tc>
+      </w:tr>
+      <w:tr>
+        <w:trPr>
+          <w:cantSplit/>
+        </w:trPr>
+        <w:tc>
+          <w:tcPr>
+            <w:tcW w:type="dxa" w:w="2448"/>
+            <w:vAlign w:val="center"/>
+            <w:shd w:fill="FFFFFF"/>
+            <w:tcMar>
+              <w:top w:w="75" w:type="dxa"/>
+              <w:bottom w:w="75" w:type="dxa"/>
+              <w:left w:w="100" w:type="dxa"/>
+              <w:right w:w="100" w:type="dxa"/>
+            </w:tcMar>
+            <w:tcBorders>
+              <w:top w:val="single" w:sz="4" w:color="D9D9D9"/>
+              <w:bottom w:val="single" w:sz="4" w:color="D9D9D9"/>
+              <w:left w:val="single" w:sz="4" w:color="D9D9D9"/>
+              <w:right w:val="single" w:sz="4" w:color="D9D9D9"/>
+            </w:tcBorders>
+          </w:tcPr>
+          <w:p>
+            <w:pPr>
+              <w:spacing w:after="20" w:line="240" w:lineRule="auto"/>
+            </w:pPr>
+            <w:r>
+              <w:rPr>
+                <w:b w:val="0"/>
+                <w:sz w:val="19"/>
+              </w:rPr>
+              <w:t>submitted_at; status_updated_at</w:t>
+            </w:r>
+          </w:p>
+        </w:tc>
+        <w:tc>
+          <w:tcPr>
+            <w:tcW w:type="dxa" w:w="4032"/>
+            <w:vAlign w:val="center"/>
+            <w:shd w:fill="FFFFFF"/>
+            <w:tcMar>
+              <w:top w:w="75" w:type="dxa"/>
+              <w:bottom w:w="75" w:type="dxa"/>
+              <w:left w:w="100" w:type="dxa"/>
+              <w:right w:w="100" w:type="dxa"/>
+            </w:tcMar>
+            <w:tcBorders>
+              <w:top w:val="single" w:sz="4" w:color="D9D9D9"/>
+              <w:bottom w:val="single" w:sz="4" w:color="D9D9D9"/>
+              <w:left w:val="single" w:sz="4" w:color="D9D9D9"/>
+              <w:right w:val="single" w:sz="4" w:color="D9D9D9"/>
+            </w:tcBorders>
+          </w:tcPr>
+          <w:p>
+            <w:pPr>
+              <w:spacing w:after="20" w:line="240" w:lineRule="auto"/>
+            </w:pPr>
+            <w:r>
+              <w:rPr>
+                <w:b w:val="0"/>
+                <w:sz w:val="19"/>
+              </w:rPr>
+              <w:t>TEXT NOT NULL UTC timestamps</w:t>
+            </w:r>
+          </w:p>
+        </w:tc>
+        <w:tc>
+          <w:tcPr>
+            <w:tcW w:type="dxa" w:w="3600"/>
+            <w:vAlign w:val="center"/>
+            <w:shd w:fill="FFFFFF"/>
+            <w:tcMar>
+              <w:top w:w="75" w:type="dxa"/>
+              <w:bottom w:w="75" w:type="dxa"/>
+              <w:left w:w="100" w:type="dxa"/>
+              <w:right w:w="100" w:type="dxa"/>
+            </w:tcMar>
+            <w:tcBorders>
+              <w:top w:val="single" w:sz="4" w:color="D9D9D9"/>
+              <w:bottom w:val="single" w:sz="4" w:color="D9D9D9"/>
+              <w:left w:val="single" w:sz="4" w:color="D9D9D9"/>
+              <w:right w:val="single" w:sz="4" w:color="D9D9D9"/>
+            </w:tcBorders>
+          </w:tcPr>
+          <w:p>
+            <w:pPr>
+              <w:spacing w:after="20" w:line="240" w:lineRule="auto"/>
+            </w:pPr>
+            <w:r>
+              <w:rPr>
+                <w:b w:val="0"/>
+                <w:sz w:val="19"/>
+              </w:rPr>
+              <w:t>Submission and current-state start time.</w:t>
+            </w:r>
+          </w:p>
+        </w:tc>
+      </w:tr>
+      <w:tr>
+        <w:trPr>
+          <w:cantSplit/>
+        </w:trPr>
+        <w:tc>
+          <w:tcPr>
+            <w:tcW w:type="dxa" w:w="2448"/>
+            <w:vAlign w:val="center"/>
+            <w:shd w:fill="FFFFFF"/>
+            <w:tcMar>
+              <w:top w:w="75" w:type="dxa"/>
+              <w:bottom w:w="75" w:type="dxa"/>
+              <w:left w:w="100" w:type="dxa"/>
+              <w:right w:w="100" w:type="dxa"/>
+            </w:tcMar>
+            <w:tcBorders>
+              <w:top w:val="single" w:sz="4" w:color="D9D9D9"/>
+              <w:bottom w:val="single" w:sz="4" w:color="D9D9D9"/>
+              <w:left w:val="single" w:sz="4" w:color="D9D9D9"/>
+              <w:right w:val="single" w:sz="4" w:color="D9D9D9"/>
+            </w:tcBorders>
+          </w:tcPr>
+          <w:p>
+            <w:pPr>
+              <w:spacing w:after="20" w:line="240" w:lineRule="auto"/>
+            </w:pPr>
+            <w:r>
+              <w:rPr>
+                <w:b w:val="0"/>
+                <w:sz w:val="19"/>
+              </w:rPr>
+              <w:t>rejection_reason; resolution_remarks</w:t>
+            </w:r>
+          </w:p>
+        </w:tc>
+        <w:tc>
+          <w:tcPr>
+            <w:tcW w:type="dxa" w:w="4032"/>
+            <w:vAlign w:val="center"/>
+            <w:shd w:fill="FFFFFF"/>
+            <w:tcMar>
+              <w:top w:w="75" w:type="dxa"/>
+              <w:bottom w:w="75" w:type="dxa"/>
+              <w:left w:w="100" w:type="dxa"/>
+              <w:right w:w="100" w:type="dxa"/>
+            </w:tcMar>
+            <w:tcBorders>
+              <w:top w:val="single" w:sz="4" w:color="D9D9D9"/>
+              <w:bottom w:val="single" w:sz="4" w:color="D9D9D9"/>
+              <w:left w:val="single" w:sz="4" w:color="D9D9D9"/>
+              <w:right w:val="single" w:sz="4" w:color="D9D9D9"/>
+            </w:tcBorders>
+          </w:tcPr>
+          <w:p>
+            <w:pPr>
+              <w:spacing w:after="20" w:line="240" w:lineRule="auto"/>
+            </w:pPr>
+            <w:r>
+              <w:rPr>
+                <w:b w:val="0"/>
+                <w:sz w:val="19"/>
+              </w:rPr>
+              <w:t>TEXT nullable; maximum 500 each</w:t>
+            </w:r>
+          </w:p>
+        </w:tc>
+        <w:tc>
+          <w:tcPr>
+            <w:tcW w:type="dxa" w:w="3600"/>
+            <w:vAlign w:val="center"/>
+            <w:shd w:fill="FFFFFF"/>
+            <w:tcMar>
+              <w:top w:w="75" w:type="dxa"/>
+              <w:bottom w:w="75" w:type="dxa"/>
+              <w:left w:w="100" w:type="dxa"/>
+              <w:right w:w="100" w:type="dxa"/>
+            </w:tcMar>
+            <w:tcBorders>
+              <w:top w:val="single" w:sz="4" w:color="D9D9D9"/>
+              <w:bottom w:val="single" w:sz="4" w:color="D9D9D9"/>
+              <w:left w:val="single" w:sz="4" w:color="D9D9D9"/>
+              <w:right w:val="single" w:sz="4" w:color="D9D9D9"/>
+            </w:tcBorders>
+          </w:tcPr>
+          <w:p>
+            <w:pPr>
+              <w:spacing w:after="20" w:line="240" w:lineRule="auto"/>
+            </w:pPr>
+            <w:r>
+              <w:rPr>
+                <w:b w:val="0"/>
+                <w:sz w:val="19"/>
+              </w:rPr>
+              <w:t>Required when rejected/resolved.</w:t>
+            </w:r>
+          </w:p>
+        </w:tc>
+      </w:tr>
+      <w:tr>
+        <w:trPr>
+          <w:cantSplit/>
+        </w:trPr>
+        <w:tc>
+          <w:tcPr>
+            <w:tcW w:type="dxa" w:w="2448"/>
+            <w:vAlign w:val="center"/>
+            <w:shd w:fill="FFFFFF"/>
+            <w:tcMar>
+              <w:top w:w="75" w:type="dxa"/>
+              <w:bottom w:w="75" w:type="dxa"/>
+              <w:left w:w="100" w:type="dxa"/>
+              <w:right w:w="100" w:type="dxa"/>
+            </w:tcMar>
+            <w:tcBorders>
+              <w:top w:val="single" w:sz="4" w:color="D9D9D9"/>
+              <w:bottom w:val="single" w:sz="4" w:color="D9D9D9"/>
+              <w:left w:val="single" w:sz="4" w:color="D9D9D9"/>
+              <w:right w:val="single" w:sz="4" w:color="D9D9D9"/>
+            </w:tcBorders>
+          </w:tcPr>
+          <w:p>
+            <w:pPr>
+              <w:spacing w:after="20" w:line="240" w:lineRule="auto"/>
+            </w:pPr>
+            <w:r>
+              <w:rPr>
+                <w:b w:val="0"/>
+                <w:sz w:val="19"/>
+              </w:rPr>
+              <w:t>appealed; rejected_level</w:t>
+            </w:r>
+          </w:p>
+        </w:tc>
+        <w:tc>
+          <w:tcPr>
+            <w:tcW w:type="dxa" w:w="4032"/>
+            <w:vAlign w:val="center"/>
+            <w:shd w:fill="FFFFFF"/>
+            <w:tcMar>
+              <w:top w:w="75" w:type="dxa"/>
+              <w:bottom w:w="75" w:type="dxa"/>
+              <w:left w:w="100" w:type="dxa"/>
+              <w:right w:w="100" w:type="dxa"/>
+            </w:tcMar>
+            <w:tcBorders>
+              <w:top w:val="single" w:sz="4" w:color="D9D9D9"/>
+              <w:bottom w:val="single" w:sz="4" w:color="D9D9D9"/>
+              <w:left w:val="single" w:sz="4" w:color="D9D9D9"/>
+              <w:right w:val="single" w:sz="4" w:color="D9D9D9"/>
+            </w:tcBorders>
+          </w:tcPr>
+          <w:p>
+            <w:pPr>
+              <w:spacing w:after="20" w:line="240" w:lineRule="auto"/>
+            </w:pPr>
+            <w:r>
+              <w:rPr>
+                <w:b w:val="0"/>
+                <w:sz w:val="19"/>
+              </w:rPr>
+              <w:t>Boolean default 0; nullable INTEGER CHECK 1-3</w:t>
+            </w:r>
+          </w:p>
+        </w:tc>
+        <w:tc>
+          <w:tcPr>
+            <w:tcW w:type="dxa" w:w="3600"/>
+            <w:vAlign w:val="center"/>
+            <w:shd w:fill="FFFFFF"/>
+            <w:tcMar>
+              <w:top w:w="75" w:type="dxa"/>
+              <w:bottom w:w="75" w:type="dxa"/>
+              <w:left w:w="100" w:type="dxa"/>
+              <w:right w:w="100" w:type="dxa"/>
+            </w:tcMar>
+            <w:tcBorders>
+              <w:top w:val="single" w:sz="4" w:color="D9D9D9"/>
+              <w:bottom w:val="single" w:sz="4" w:color="D9D9D9"/>
+              <w:left w:val="single" w:sz="4" w:color="D9D9D9"/>
+              <w:right w:val="single" w:sz="4" w:color="D9D9D9"/>
+            </w:tcBorders>
+          </w:tcPr>
+          <w:p>
+            <w:pPr>
+              <w:spacing w:after="20" w:line="240" w:lineRule="auto"/>
+            </w:pPr>
+            <w:r>
+              <w:rPr>
+                <w:b w:val="0"/>
+                <w:sz w:val="19"/>
+              </w:rPr>
+              <w:t>Single-appeal flag and rejecting queue.</w:t>
+            </w:r>
+          </w:p>
+        </w:tc>
+      </w:tr>
+      <w:tr>
+        <w:trPr>
+          <w:cantSplit/>
+        </w:trPr>
+        <w:tc>
+          <w:tcPr>
+            <w:tcW w:type="dxa" w:w="2448"/>
+            <w:vAlign w:val="center"/>
+            <w:shd w:fill="FFFFFF"/>
+            <w:tcMar>
+              <w:top w:w="75" w:type="dxa"/>
+              <w:bottom w:w="75" w:type="dxa"/>
+              <w:left w:w="100" w:type="dxa"/>
+              <w:right w:w="100" w:type="dxa"/>
+            </w:tcMar>
+            <w:tcBorders>
+              <w:top w:val="single" w:sz="4" w:color="D9D9D9"/>
+              <w:bottom w:val="single" w:sz="4" w:color="D9D9D9"/>
+              <w:left w:val="single" w:sz="4" w:color="D9D9D9"/>
+              <w:right w:val="single" w:sz="4" w:color="D9D9D9"/>
+            </w:tcBorders>
+          </w:tcPr>
+          <w:p>
+            <w:pPr>
+              <w:spacing w:after="20" w:line="240" w:lineRule="auto"/>
+            </w:pPr>
+            <w:r>
+              <w:rPr>
+                <w:b w:val="0"/>
+                <w:sz w:val="19"/>
+              </w:rPr>
+              <w:t>final_review; version</w:t>
+            </w:r>
+          </w:p>
+        </w:tc>
+        <w:tc>
+          <w:tcPr>
+            <w:tcW w:type="dxa" w:w="4032"/>
+            <w:vAlign w:val="center"/>
+            <w:shd w:fill="FFFFFF"/>
+            <w:tcMar>
+              <w:top w:w="75" w:type="dxa"/>
+              <w:bottom w:w="75" w:type="dxa"/>
+              <w:left w:w="100" w:type="dxa"/>
+              <w:right w:w="100" w:type="dxa"/>
+            </w:tcMar>
+            <w:tcBorders>
+              <w:top w:val="single" w:sz="4" w:color="D9D9D9"/>
+              <w:bottom w:val="single" w:sz="4" w:color="D9D9D9"/>
+              <w:left w:val="single" w:sz="4" w:color="D9D9D9"/>
+              <w:right w:val="single" w:sz="4" w:color="D9D9D9"/>
+            </w:tcBorders>
+          </w:tcPr>
+          <w:p>
+            <w:pPr>
+              <w:spacing w:after="20" w:line="240" w:lineRule="auto"/>
+            </w:pPr>
+            <w:r>
+              <w:rPr>
+                <w:b w:val="0"/>
+                <w:sz w:val="19"/>
+              </w:rPr>
+              <w:t>Boolean default 0; INTEGER &gt;=1 default 1</w:t>
+            </w:r>
+          </w:p>
+        </w:tc>
+        <w:tc>
+          <w:tcPr>
+            <w:tcW w:type="dxa" w:w="3600"/>
+            <w:vAlign w:val="center"/>
+            <w:shd w:fill="FFFFFF"/>
+            <w:tcMar>
+              <w:top w:w="75" w:type="dxa"/>
+              <w:bottom w:w="75" w:type="dxa"/>
+              <w:left w:w="100" w:type="dxa"/>
+              <w:right w:w="100" w:type="dxa"/>
+            </w:tcMar>
+            <w:tcBorders>
+              <w:top w:val="single" w:sz="4" w:color="D9D9D9"/>
+              <w:bottom w:val="single" w:sz="4" w:color="D9D9D9"/>
+              <w:left w:val="single" w:sz="4" w:color="D9D9D9"/>
+              <w:right w:val="single" w:sz="4" w:color="D9D9D9"/>
+            </w:tcBorders>
+          </w:tcPr>
+          <w:p>
+            <w:pPr>
+              <w:spacing w:after="20" w:line="240" w:lineRule="auto"/>
+            </w:pPr>
+            <w:r>
+              <w:rPr>
+                <w:b w:val="0"/>
+                <w:sz w:val="19"/>
+              </w:rPr>
+              <w:t>Dean review and concurrency control.</w:t>
+            </w:r>
+          </w:p>
+        </w:tc>
+      </w:tr>
+    </w:tbl>
+    <w:p>
+      <w:pPr>
+        <w:spacing w:after="0"/>
+      </w:pPr>
+    </w:p>
+    <w:p>
+      <w:pPr>
+        <w:pStyle w:val="Heading2"/>
+      </w:pPr>
+      <w:r>
+        <w:t>3 7 3 Audit logs</w:t>
+      </w:r>
+    </w:p>
+    <w:p>
+      <w:r>
+        <w:t>audit_id INTEGER PK; complaint_id and actor_id required FK; action TEXT up to 50; previous_status and new_status TEXT up to 30; timestamp required UTC TEXT. previous_level and new_level record queue changes. Use an explicit initial-state sentinel within the 30-character limit for submission history. Reject UPDATE/DELETE through application routes and database triggers; privileged database-owner access is a separate trust boundary.</w:t>
+      </w:r>
+    </w:p>
+    <w:p>
+      <w:r>
+        <w:br w:type="page"/>
+      </w:r>
+    </w:p>
+    <w:p>
+      <w:pPr>
+        <w:pStyle w:val="Heading1"/>
+      </w:pPr>
+      <w:r>
+        <w:t>3 8 Supporting schema and consistency</w:t>
+      </w:r>
+    </w:p>
+    <w:tbl>
+      <w:tblPr>
+        <w:tblW w:type="auto" w:w="0"/>
+        <w:tblLayout w:type="fixed"/>
+        <w:tblLook w:firstColumn="1" w:firstRow="1" w:lastColumn="0" w:lastRow="0" w:noHBand="0" w:noVBand="1" w:val="04A0"/>
+      </w:tblPr>
+      <w:tblGrid>
+        <w:gridCol w:w="1800"/>
+        <w:gridCol w:w="4608"/>
+        <w:gridCol w:w="3672"/>
+      </w:tblGrid>
+      <w:tr>
+        <w:trPr>
+          <w:cantSplit/>
+          <w:tblHeader/>
+        </w:trPr>
+        <w:tc>
+          <w:tcPr>
+            <w:tcW w:type="dxa" w:w="1800"/>
+            <w:vAlign w:val="center"/>
+            <w:shd w:fill="E6EDF3"/>
+            <w:tcMar>
+              <w:top w:w="75" w:type="dxa"/>
+              <w:bottom w:w="75" w:type="dxa"/>
+              <w:left w:w="100" w:type="dxa"/>
+              <w:right w:w="100" w:type="dxa"/>
+            </w:tcMar>
+            <w:tcBorders>
+              <w:top w:val="single" w:sz="4" w:color="D9D9D9"/>
+              <w:bottom w:val="single" w:sz="4" w:color="D9D9D9"/>
+              <w:left w:val="single" w:sz="4" w:color="D9D9D9"/>
+              <w:right w:val="single" w:sz="4" w:color="D9D9D9"/>
+            </w:tcBorders>
+          </w:tcPr>
+          <w:p>
+            <w:pPr>
+              <w:spacing w:after="20" w:line="240" w:lineRule="auto"/>
+            </w:pPr>
+            <w:r>
+              <w:rPr>
+                <w:b/>
+                <w:sz w:val="19"/>
+              </w:rPr>
+              <w:t>Entity</w:t>
+            </w:r>
+          </w:p>
+        </w:tc>
+        <w:tc>
+          <w:tcPr>
+            <w:tcW w:type="dxa" w:w="4608"/>
+            <w:vAlign w:val="center"/>
+            <w:shd w:fill="E6EDF3"/>
+            <w:tcMar>
+              <w:top w:w="75" w:type="dxa"/>
+              <w:bottom w:w="75" w:type="dxa"/>
+              <w:left w:w="100" w:type="dxa"/>
+              <w:right w:w="100" w:type="dxa"/>
+            </w:tcMar>
+            <w:tcBorders>
+              <w:top w:val="single" w:sz="4" w:color="D9D9D9"/>
+              <w:bottom w:val="single" w:sz="4" w:color="D9D9D9"/>
+              <w:left w:val="single" w:sz="4" w:color="D9D9D9"/>
+              <w:right w:val="single" w:sz="4" w:color="D9D9D9"/>
+            </w:tcBorders>
+          </w:tcPr>
+          <w:p>
+            <w:pPr>
+              <w:spacing w:after="20" w:line="240" w:lineRule="auto"/>
+            </w:pPr>
+            <w:r>
+              <w:rPr>
+                <w:b/>
+                <w:sz w:val="19"/>
+              </w:rPr>
+              <w:t>Keys and fields</w:t>
+            </w:r>
+          </w:p>
+        </w:tc>
+        <w:tc>
+          <w:tcPr>
+            <w:tcW w:type="dxa" w:w="3672"/>
+            <w:vAlign w:val="center"/>
+            <w:shd w:fill="E6EDF3"/>
+            <w:tcMar>
+              <w:top w:w="75" w:type="dxa"/>
+              <w:bottom w:w="75" w:type="dxa"/>
+              <w:left w:w="100" w:type="dxa"/>
+              <w:right w:w="100" w:type="dxa"/>
+            </w:tcMar>
+            <w:tcBorders>
+              <w:top w:val="single" w:sz="4" w:color="D9D9D9"/>
+              <w:bottom w:val="single" w:sz="4" w:color="D9D9D9"/>
+              <w:left w:val="single" w:sz="4" w:color="D9D9D9"/>
+              <w:right w:val="single" w:sz="4" w:color="D9D9D9"/>
+            </w:tcBorders>
+          </w:tcPr>
+          <w:p>
+            <w:pPr>
+              <w:spacing w:after="20" w:line="240" w:lineRule="auto"/>
+            </w:pPr>
+            <w:r>
+              <w:rPr>
+                <w:b/>
+                <w:sz w:val="19"/>
+              </w:rPr>
+              <w:t>Constraints and use</w:t>
+            </w:r>
+          </w:p>
+        </w:tc>
+      </w:tr>
+      <w:tr>
+        <w:trPr>
+          <w:cantSplit/>
+        </w:trPr>
+        <w:tc>
+          <w:tcPr>
+            <w:tcW w:type="dxa" w:w="1800"/>
+            <w:vAlign w:val="center"/>
+            <w:shd w:fill="FFFFFF"/>
+            <w:tcMar>
+              <w:top w:w="75" w:type="dxa"/>
+              <w:bottom w:w="75" w:type="dxa"/>
+              <w:left w:w="100" w:type="dxa"/>
+              <w:right w:w="100" w:type="dxa"/>
+            </w:tcMar>
+            <w:tcBorders>
+              <w:top w:val="single" w:sz="4" w:color="D9D9D9"/>
+              <w:bottom w:val="single" w:sz="4" w:color="D9D9D9"/>
+              <w:left w:val="single" w:sz="4" w:color="D9D9D9"/>
+              <w:right w:val="single" w:sz="4" w:color="D9D9D9"/>
+            </w:tcBorders>
+          </w:tcPr>
+          <w:p>
+            <w:pPr>
+              <w:spacing w:after="20" w:line="240" w:lineRule="auto"/>
+            </w:pPr>
+            <w:r>
+              <w:rPr>
+                <w:b w:val="0"/>
+                <w:sz w:val="19"/>
+              </w:rPr>
+              <w:t>sessions</w:t>
+            </w:r>
+          </w:p>
+        </w:tc>
+        <w:tc>
+          <w:tcPr>
+            <w:tcW w:type="dxa" w:w="4608"/>
+            <w:vAlign w:val="center"/>
+            <w:shd w:fill="FFFFFF"/>
+            <w:tcMar>
+              <w:top w:w="75" w:type="dxa"/>
+              <w:bottom w:w="75" w:type="dxa"/>
+              <w:left w:w="100" w:type="dxa"/>
+              <w:right w:w="100" w:type="dxa"/>
+            </w:tcMar>
+            <w:tcBorders>
+              <w:top w:val="single" w:sz="4" w:color="D9D9D9"/>
+              <w:bottom w:val="single" w:sz="4" w:color="D9D9D9"/>
+              <w:left w:val="single" w:sz="4" w:color="D9D9D9"/>
+              <w:right w:val="single" w:sz="4" w:color="D9D9D9"/>
+            </w:tcBorders>
+          </w:tcPr>
+          <w:p>
+            <w:pPr>
+              <w:spacing w:after="20" w:line="240" w:lineRule="auto"/>
+            </w:pPr>
+            <w:r>
+              <w:rPr>
+                <w:b w:val="0"/>
+                <w:sz w:val="19"/>
+              </w:rPr>
+              <w:t>Opaque random session_id PK; optional user_id FK; CSRF token; expires_at.</w:t>
+            </w:r>
+          </w:p>
+        </w:tc>
+        <w:tc>
+          <w:tcPr>
+            <w:tcW w:type="dxa" w:w="3672"/>
+            <w:vAlign w:val="center"/>
+            <w:shd w:fill="FFFFFF"/>
+            <w:tcMar>
+              <w:top w:w="75" w:type="dxa"/>
+              <w:bottom w:w="75" w:type="dxa"/>
+              <w:left w:w="100" w:type="dxa"/>
+              <w:right w:w="100" w:type="dxa"/>
+            </w:tcMar>
+            <w:tcBorders>
+              <w:top w:val="single" w:sz="4" w:color="D9D9D9"/>
+              <w:bottom w:val="single" w:sz="4" w:color="D9D9D9"/>
+              <w:left w:val="single" w:sz="4" w:color="D9D9D9"/>
+              <w:right w:val="single" w:sz="4" w:color="D9D9D9"/>
+            </w:tcBorders>
+          </w:tcPr>
+          <w:p>
+            <w:pPr>
+              <w:spacing w:after="20" w:line="240" w:lineRule="auto"/>
+            </w:pPr>
+            <w:r>
+              <w:rPr>
+                <w:b w:val="0"/>
+                <w:sz w:val="19"/>
+              </w:rPr>
+              <w:t>Rotate on login; remove at logout/expiry. Anonymous sessions carry no authenticated role.</w:t>
+            </w:r>
+          </w:p>
+        </w:tc>
+      </w:tr>
+      <w:tr>
+        <w:trPr>
+          <w:cantSplit/>
+        </w:trPr>
+        <w:tc>
+          <w:tcPr>
+            <w:tcW w:type="dxa" w:w="1800"/>
+            <w:vAlign w:val="center"/>
+            <w:shd w:fill="FFFFFF"/>
+            <w:tcMar>
+              <w:top w:w="75" w:type="dxa"/>
+              <w:bottom w:w="75" w:type="dxa"/>
+              <w:left w:w="100" w:type="dxa"/>
+              <w:right w:w="100" w:type="dxa"/>
+            </w:tcMar>
+            <w:tcBorders>
+              <w:top w:val="single" w:sz="4" w:color="D9D9D9"/>
+              <w:bottom w:val="single" w:sz="4" w:color="D9D9D9"/>
+              <w:left w:val="single" w:sz="4" w:color="D9D9D9"/>
+              <w:right w:val="single" w:sz="4" w:color="D9D9D9"/>
+            </w:tcBorders>
+          </w:tcPr>
+          <w:p>
+            <w:pPr>
+              <w:spacing w:after="20" w:line="240" w:lineRule="auto"/>
+            </w:pPr>
+            <w:r>
+              <w:rPr>
+                <w:b w:val="0"/>
+                <w:sz w:val="19"/>
+              </w:rPr>
+              <w:t>assignment_history</w:t>
+            </w:r>
+          </w:p>
+        </w:tc>
+        <w:tc>
+          <w:tcPr>
+            <w:tcW w:type="dxa" w:w="4608"/>
+            <w:vAlign w:val="center"/>
+            <w:shd w:fill="FFFFFF"/>
+            <w:tcMar>
+              <w:top w:w="75" w:type="dxa"/>
+              <w:bottom w:w="75" w:type="dxa"/>
+              <w:left w:w="100" w:type="dxa"/>
+              <w:right w:w="100" w:type="dxa"/>
+            </w:tcMar>
+            <w:tcBorders>
+              <w:top w:val="single" w:sz="4" w:color="D9D9D9"/>
+              <w:bottom w:val="single" w:sz="4" w:color="D9D9D9"/>
+              <w:left w:val="single" w:sz="4" w:color="D9D9D9"/>
+              <w:right w:val="single" w:sz="4" w:color="D9D9D9"/>
+            </w:tcBorders>
+          </w:tcPr>
+          <w:p>
+            <w:pPr>
+              <w:spacing w:after="20" w:line="240" w:lineRule="auto"/>
+            </w:pPr>
+            <w:r>
+              <w:rPr>
+                <w:b w:val="0"/>
+                <w:sz w:val="19"/>
+              </w:rPr>
+              <w:t>assignment_id INTEGER PK; complaint_id and actor_id FK; level; assigned_at.</w:t>
+            </w:r>
+          </w:p>
+        </w:tc>
+        <w:tc>
+          <w:tcPr>
+            <w:tcW w:type="dxa" w:w="3672"/>
+            <w:vAlign w:val="center"/>
+            <w:shd w:fill="FFFFFF"/>
+            <w:tcMar>
+              <w:top w:w="75" w:type="dxa"/>
+              <w:bottom w:w="75" w:type="dxa"/>
+              <w:left w:w="100" w:type="dxa"/>
+              <w:right w:w="100" w:type="dxa"/>
+            </w:tcMar>
+            <w:tcBorders>
+              <w:top w:val="single" w:sz="4" w:color="D9D9D9"/>
+              <w:bottom w:val="single" w:sz="4" w:color="D9D9D9"/>
+              <w:left w:val="single" w:sz="4" w:color="D9D9D9"/>
+              <w:right w:val="single" w:sz="4" w:color="D9D9D9"/>
+            </w:tcBorders>
+          </w:tcPr>
+          <w:p>
+            <w:pPr>
+              <w:spacing w:after="20" w:line="240" w:lineRule="auto"/>
+            </w:pPr>
+            <w:r>
+              <w:rPr>
+                <w:b w:val="0"/>
+                <w:sz w:val="19"/>
+              </w:rPr>
+              <w:t>Level CHECK 1-3. Records all reached queues for historic visibility.</w:t>
+            </w:r>
+          </w:p>
+        </w:tc>
+      </w:tr>
+      <w:tr>
+        <w:trPr>
+          <w:cantSplit/>
+        </w:trPr>
+        <w:tc>
+          <w:tcPr>
+            <w:tcW w:type="dxa" w:w="1800"/>
+            <w:vAlign w:val="center"/>
+            <w:shd w:fill="FFFFFF"/>
+            <w:tcMar>
+              <w:top w:w="75" w:type="dxa"/>
+              <w:bottom w:w="75" w:type="dxa"/>
+              <w:left w:w="100" w:type="dxa"/>
+              <w:right w:w="100" w:type="dxa"/>
+            </w:tcMar>
+            <w:tcBorders>
+              <w:top w:val="single" w:sz="4" w:color="D9D9D9"/>
+              <w:bottom w:val="single" w:sz="4" w:color="D9D9D9"/>
+              <w:left w:val="single" w:sz="4" w:color="D9D9D9"/>
+              <w:right w:val="single" w:sz="4" w:color="D9D9D9"/>
+            </w:tcBorders>
+          </w:tcPr>
+          <w:p>
+            <w:pPr>
+              <w:spacing w:after="20" w:line="240" w:lineRule="auto"/>
+            </w:pPr>
+            <w:r>
+              <w:rPr>
+                <w:b w:val="0"/>
+                <w:sz w:val="19"/>
+              </w:rPr>
+              <w:t>appeals</w:t>
+            </w:r>
+          </w:p>
+        </w:tc>
+        <w:tc>
+          <w:tcPr>
+            <w:tcW w:type="dxa" w:w="4608"/>
+            <w:vAlign w:val="center"/>
+            <w:shd w:fill="FFFFFF"/>
+            <w:tcMar>
+              <w:top w:w="75" w:type="dxa"/>
+              <w:bottom w:w="75" w:type="dxa"/>
+              <w:left w:w="100" w:type="dxa"/>
+              <w:right w:w="100" w:type="dxa"/>
+            </w:tcMar>
+            <w:tcBorders>
+              <w:top w:val="single" w:sz="4" w:color="D9D9D9"/>
+              <w:bottom w:val="single" w:sz="4" w:color="D9D9D9"/>
+              <w:left w:val="single" w:sz="4" w:color="D9D9D9"/>
+              <w:right w:val="single" w:sz="4" w:color="D9D9D9"/>
+            </w:tcBorders>
+          </w:tcPr>
+          <w:p>
+            <w:pPr>
+              <w:spacing w:after="20" w:line="240" w:lineRule="auto"/>
+            </w:pPr>
+            <w:r>
+              <w:rPr>
+                <w:b w:val="0"/>
+                <w:sz w:val="19"/>
+              </w:rPr>
+              <w:t>appeal_id INTEGER PK; complaint_id UNIQUE FK; actor_id FK; justification; submitted_at; rejected_level; target_level; final_review.</w:t>
+            </w:r>
+          </w:p>
+        </w:tc>
+        <w:tc>
+          <w:tcPr>
+            <w:tcW w:type="dxa" w:w="3672"/>
+            <w:vAlign w:val="center"/>
+            <w:shd w:fill="FFFFFF"/>
+            <w:tcMar>
+              <w:top w:w="75" w:type="dxa"/>
+              <w:bottom w:w="75" w:type="dxa"/>
+              <w:left w:w="100" w:type="dxa"/>
+              <w:right w:w="100" w:type="dxa"/>
+            </w:tcMar>
+            <w:tcBorders>
+              <w:top w:val="single" w:sz="4" w:color="D9D9D9"/>
+              <w:bottom w:val="single" w:sz="4" w:color="D9D9D9"/>
+              <w:left w:val="single" w:sz="4" w:color="D9D9D9"/>
+              <w:right w:val="single" w:sz="4" w:color="D9D9D9"/>
+            </w:tcBorders>
+          </w:tcPr>
+          <w:p>
+            <w:pPr>
+              <w:spacing w:after="20" w:line="240" w:lineRule="auto"/>
+            </w:pPr>
+            <w:r>
+              <w:rPr>
+                <w:b w:val="0"/>
+                <w:sz w:val="19"/>
+              </w:rPr>
+              <w:t>One appeal per complaint; levels 1-3. Justification 1-1000 is a proposed design limit.</w:t>
+            </w:r>
+          </w:p>
+        </w:tc>
+      </w:tr>
+      <w:tr>
+        <w:trPr>
+          <w:cantSplit/>
+        </w:trPr>
+        <w:tc>
+          <w:tcPr>
+            <w:tcW w:type="dxa" w:w="1800"/>
+            <w:vAlign w:val="center"/>
+            <w:shd w:fill="FFFFFF"/>
+            <w:tcMar>
+              <w:top w:w="75" w:type="dxa"/>
+              <w:bottom w:w="75" w:type="dxa"/>
+              <w:left w:w="100" w:type="dxa"/>
+              <w:right w:w="100" w:type="dxa"/>
+            </w:tcMar>
+            <w:tcBorders>
+              <w:top w:val="single" w:sz="4" w:color="D9D9D9"/>
+              <w:bottom w:val="single" w:sz="4" w:color="D9D9D9"/>
+              <w:left w:val="single" w:sz="4" w:color="D9D9D9"/>
+              <w:right w:val="single" w:sz="4" w:color="D9D9D9"/>
+            </w:tcBorders>
+          </w:tcPr>
+          <w:p>
+            <w:pPr>
+              <w:spacing w:after="20" w:line="240" w:lineRule="auto"/>
+            </w:pPr>
+            <w:r>
+              <w:rPr>
+                <w:b w:val="0"/>
+                <w:sz w:val="19"/>
+              </w:rPr>
+              <w:t>notifications</w:t>
+            </w:r>
+          </w:p>
+        </w:tc>
+        <w:tc>
+          <w:tcPr>
+            <w:tcW w:type="dxa" w:w="4608"/>
+            <w:vAlign w:val="center"/>
+            <w:shd w:fill="FFFFFF"/>
+            <w:tcMar>
+              <w:top w:w="75" w:type="dxa"/>
+              <w:bottom w:w="75" w:type="dxa"/>
+              <w:left w:w="100" w:type="dxa"/>
+              <w:right w:w="100" w:type="dxa"/>
+            </w:tcMar>
+            <w:tcBorders>
+              <w:top w:val="single" w:sz="4" w:color="D9D9D9"/>
+              <w:bottom w:val="single" w:sz="4" w:color="D9D9D9"/>
+              <w:left w:val="single" w:sz="4" w:color="D9D9D9"/>
+              <w:right w:val="single" w:sz="4" w:color="D9D9D9"/>
+            </w:tcBorders>
+          </w:tcPr>
+          <w:p>
+            <w:pPr>
+              <w:spacing w:after="20" w:line="240" w:lineRule="auto"/>
+            </w:pPr>
+            <w:r>
+              <w:rPr>
+                <w:b w:val="0"/>
+                <w:sz w:val="19"/>
+              </w:rPr>
+              <w:t>notification_id INTEGER PK; complaint_id FK; target_level; event; created_at.</w:t>
+            </w:r>
+          </w:p>
+        </w:tc>
+        <w:tc>
+          <w:tcPr>
+            <w:tcW w:type="dxa" w:w="3672"/>
+            <w:vAlign w:val="center"/>
+            <w:shd w:fill="FFFFFF"/>
+            <w:tcMar>
+              <w:top w:w="75" w:type="dxa"/>
+              <w:bottom w:w="75" w:type="dxa"/>
+              <w:left w:w="100" w:type="dxa"/>
+              <w:right w:w="100" w:type="dxa"/>
+            </w:tcMar>
+            <w:tcBorders>
+              <w:top w:val="single" w:sz="4" w:color="D9D9D9"/>
+              <w:bottom w:val="single" w:sz="4" w:color="D9D9D9"/>
+              <w:left w:val="single" w:sz="4" w:color="D9D9D9"/>
+              <w:right w:val="single" w:sz="4" w:color="D9D9D9"/>
+            </w:tcBorders>
+          </w:tcPr>
+          <w:p>
+            <w:pPr>
+              <w:spacing w:after="20" w:line="240" w:lineRule="auto"/>
+            </w:pPr>
+            <w:r>
+              <w:rPr>
+                <w:b w:val="0"/>
+                <w:sz w:val="19"/>
+              </w:rPr>
+              <w:t>Role queue notice stored with assignment. Access to complaint is checked when opened.</w:t>
+            </w:r>
+          </w:p>
+        </w:tc>
+      </w:tr>
+      <w:tr>
+        <w:trPr>
+          <w:cantSplit/>
+        </w:trPr>
+        <w:tc>
+          <w:tcPr>
+            <w:tcW w:type="dxa" w:w="1800"/>
+            <w:vAlign w:val="center"/>
+            <w:shd w:fill="FFFFFF"/>
+            <w:tcMar>
+              <w:top w:w="75" w:type="dxa"/>
+              <w:bottom w:w="75" w:type="dxa"/>
+              <w:left w:w="100" w:type="dxa"/>
+              <w:right w:w="100" w:type="dxa"/>
+            </w:tcMar>
+            <w:tcBorders>
+              <w:top w:val="single" w:sz="4" w:color="D9D9D9"/>
+              <w:bottom w:val="single" w:sz="4" w:color="D9D9D9"/>
+              <w:left w:val="single" w:sz="4" w:color="D9D9D9"/>
+              <w:right w:val="single" w:sz="4" w:color="D9D9D9"/>
+            </w:tcBorders>
+          </w:tcPr>
+          <w:p>
+            <w:pPr>
+              <w:spacing w:after="20" w:line="240" w:lineRule="auto"/>
+            </w:pPr>
+            <w:r>
+              <w:rPr>
+                <w:b w:val="0"/>
+                <w:sz w:val="19"/>
+              </w:rPr>
+              <w:t>feedback</w:t>
+            </w:r>
+          </w:p>
+        </w:tc>
+        <w:tc>
+          <w:tcPr>
+            <w:tcW w:type="dxa" w:w="4608"/>
+            <w:vAlign w:val="center"/>
+            <w:shd w:fill="FFFFFF"/>
+            <w:tcMar>
+              <w:top w:w="75" w:type="dxa"/>
+              <w:bottom w:w="75" w:type="dxa"/>
+              <w:left w:w="100" w:type="dxa"/>
+              <w:right w:w="100" w:type="dxa"/>
+            </w:tcMar>
+            <w:tcBorders>
+              <w:top w:val="single" w:sz="4" w:color="D9D9D9"/>
+              <w:bottom w:val="single" w:sz="4" w:color="D9D9D9"/>
+              <w:left w:val="single" w:sz="4" w:color="D9D9D9"/>
+              <w:right w:val="single" w:sz="4" w:color="D9D9D9"/>
+            </w:tcBorders>
+          </w:tcPr>
+          <w:p>
+            <w:pPr>
+              <w:spacing w:after="20" w:line="240" w:lineRule="auto"/>
+            </w:pPr>
+            <w:r>
+              <w:rPr>
+                <w:b w:val="0"/>
+                <w:sz w:val="19"/>
+              </w:rPr>
+              <w:t>feedback_id INTEGER PK; complaint_id UNIQUE FK; rating; optional comment; submitted_at.</w:t>
+            </w:r>
+          </w:p>
+        </w:tc>
+        <w:tc>
+          <w:tcPr>
+            <w:tcW w:type="dxa" w:w="3672"/>
+            <w:vAlign w:val="center"/>
+            <w:shd w:fill="FFFFFF"/>
+            <w:tcMar>
+              <w:top w:w="75" w:type="dxa"/>
+              <w:bottom w:w="75" w:type="dxa"/>
+              <w:left w:w="100" w:type="dxa"/>
+              <w:right w:w="100" w:type="dxa"/>
+            </w:tcMar>
+            <w:tcBorders>
+              <w:top w:val="single" w:sz="4" w:color="D9D9D9"/>
+              <w:bottom w:val="single" w:sz="4" w:color="D9D9D9"/>
+              <w:left w:val="single" w:sz="4" w:color="D9D9D9"/>
+              <w:right w:val="single" w:sz="4" w:color="D9D9D9"/>
+            </w:tcBorders>
+          </w:tcPr>
+          <w:p>
+            <w:pPr>
+              <w:spacing w:after="20" w:line="240" w:lineRule="auto"/>
+            </w:pPr>
+            <w:r>
+              <w:rPr>
+                <w:b w:val="0"/>
+                <w:sz w:val="19"/>
+              </w:rPr>
+              <w:t>Rating INTEGER CHECK 1-5; comment &lt;=500; resolved-owner eligibility enforced before write.</w:t>
+            </w:r>
+          </w:p>
+        </w:tc>
+      </w:tr>
+      <w:tr>
+        <w:trPr>
+          <w:cantSplit/>
+        </w:trPr>
+        <w:tc>
+          <w:tcPr>
+            <w:tcW w:type="dxa" w:w="1800"/>
+            <w:vAlign w:val="center"/>
+            <w:shd w:fill="FFFFFF"/>
+            <w:tcMar>
+              <w:top w:w="75" w:type="dxa"/>
+              <w:bottom w:w="75" w:type="dxa"/>
+              <w:left w:w="100" w:type="dxa"/>
+              <w:right w:w="100" w:type="dxa"/>
+            </w:tcMar>
+            <w:tcBorders>
+              <w:top w:val="single" w:sz="4" w:color="D9D9D9"/>
+              <w:bottom w:val="single" w:sz="4" w:color="D9D9D9"/>
+              <w:left w:val="single" w:sz="4" w:color="D9D9D9"/>
+              <w:right w:val="single" w:sz="4" w:color="D9D9D9"/>
+            </w:tcBorders>
+          </w:tcPr>
+          <w:p>
+            <w:pPr>
+              <w:spacing w:after="20" w:line="240" w:lineRule="auto"/>
+            </w:pPr>
+            <w:r>
+              <w:rPr>
+                <w:b w:val="0"/>
+                <w:sz w:val="19"/>
+              </w:rPr>
+              <w:t>settings</w:t>
+            </w:r>
+          </w:p>
+        </w:tc>
+        <w:tc>
+          <w:tcPr>
+            <w:tcW w:type="dxa" w:w="4608"/>
+            <w:vAlign w:val="center"/>
+            <w:shd w:fill="FFFFFF"/>
+            <w:tcMar>
+              <w:top w:w="75" w:type="dxa"/>
+              <w:bottom w:w="75" w:type="dxa"/>
+              <w:left w:w="100" w:type="dxa"/>
+              <w:right w:w="100" w:type="dxa"/>
+            </w:tcMar>
+            <w:tcBorders>
+              <w:top w:val="single" w:sz="4" w:color="D9D9D9"/>
+              <w:bottom w:val="single" w:sz="4" w:color="D9D9D9"/>
+              <w:left w:val="single" w:sz="4" w:color="D9D9D9"/>
+              <w:right w:val="single" w:sz="4" w:color="D9D9D9"/>
+            </w:tcBorders>
+          </w:tcPr>
+          <w:p>
+            <w:pPr>
+              <w:spacing w:after="20" w:line="240" w:lineRule="auto"/>
+            </w:pPr>
+            <w:r>
+              <w:rPr>
+                <w:b w:val="0"/>
+                <w:sz w:val="19"/>
+              </w:rPr>
+              <w:t>key TEXT PK; value TEXT.</w:t>
+            </w:r>
+          </w:p>
+        </w:tc>
+        <w:tc>
+          <w:tcPr>
+            <w:tcW w:type="dxa" w:w="3672"/>
+            <w:vAlign w:val="center"/>
+            <w:shd w:fill="FFFFFF"/>
+            <w:tcMar>
+              <w:top w:w="75" w:type="dxa"/>
+              <w:bottom w:w="75" w:type="dxa"/>
+              <w:left w:w="100" w:type="dxa"/>
+              <w:right w:w="100" w:type="dxa"/>
+            </w:tcMar>
+            <w:tcBorders>
+              <w:top w:val="single" w:sz="4" w:color="D9D9D9"/>
+              <w:bottom w:val="single" w:sz="4" w:color="D9D9D9"/>
+              <w:left w:val="single" w:sz="4" w:color="D9D9D9"/>
+              <w:right w:val="single" w:sz="4" w:color="D9D9D9"/>
+            </w:tcBorders>
+          </w:tcPr>
+          <w:p>
+            <w:pPr>
+              <w:spacing w:after="20" w:line="240" w:lineRule="auto"/>
+            </w:pPr>
+            <w:r>
+              <w:rPr>
+                <w:b w:val="0"/>
+                <w:sz w:val="19"/>
+              </w:rPr>
+              <w:t>sla_threshold_days is validated as a positive integer, default 7; configured by trusted setup.</w:t>
+            </w:r>
+          </w:p>
+        </w:tc>
+      </w:tr>
+    </w:tbl>
+    <w:p>
+      <w:pPr>
+        <w:spacing w:after="0"/>
+      </w:pPr>
+    </w:p>
+    <w:p>
+      <w:pPr>
+        <w:pStyle w:val="Heading2"/>
+      </w:pPr>
+      <w:r>
+        <w:t>3 8 1 Transaction boundary and concurrency</w:t>
+      </w:r>
+    </w:p>
+    <w:p>
+      <w:r>
+        <w:t>A mutation uses one Repository connection for complaint state, assignment history, audit and notifications. Check the actor, legal transition and expected version within that transaction, then update WHERE complaint_id=? AND version=? and require exactly one affected row. Increment version only after a valid transition. Appeal eligibility and its unique insert are in the same transaction. Any failed write rolls back all associated changes.</w:t>
+      </w:r>
+    </w:p>
+    <w:p>
+      <w:pPr>
+        <w:pStyle w:val="Heading2"/>
+      </w:pPr>
+      <w:r>
+        <w:t>3 8 2 Referential integrity and indexing</w:t>
+      </w:r>
+    </w:p>
+    <w:p>
+      <w:r>
+        <w:t>Use foreign-key restrictions rather than cascading deletion for complaint history. No complaint/audit deletion UI is specified. Parameterize values; validate and allowlist sort/filter options. Index complaints(student_id, submitted_at), complaints(current_level, status), complaints(status, status_updated_at), assignment_history(complaint_id, level), audit_logs(complaint_id, timestamp, audit_id) and notifications(target_level, created_at). Unique indexes enforce account, appeal and feedback constraints.</w:t>
+      </w:r>
+    </w:p>
+    <w:p>
+      <w:r>
+        <w:t>current_level maps 1 to Faculty, 2 to Committee and 3 to Dean. assigned_to is optional and must match that level if supplied. Historic assignment affects reads only. Database constraints, application transition rules and server-side authorization work together; foreign keys alone cannot enforce role or workflow eligibility.</w:t>
+      </w:r>
+    </w:p>
+    <w:p>
+      <w:r>
+        <w:br w:type="page"/>
+      </w:r>
+    </w:p>
+    <w:p>
+      <w:pPr>
+        <w:pStyle w:val="Heading1"/>
+      </w:pPr>
+      <w:r>
+        <w:t>3 9 Security architecture</w:t>
+      </w:r>
+    </w:p>
+    <w:p>
+      <w:r>
+        <w:t>SO-01 requires authenticated, authorized access to accounts and complaints. SO-02 requires integrity and accountability of complaint processing. C03 enforces both role and resource scope; C04 commits state and audit together. The public browser boundary accepts untrusted input, and the database and operational files remain private to the host.</w:t>
+      </w:r>
+    </w:p>
+    <w:p>
+      <w:pPr>
+        <w:pStyle w:val="Heading2"/>
+      </w:pPr>
+      <w:r>
+        <w:t>3 9 1 Identity sessions and provisioning</w:t>
+      </w:r>
+    </w:p>
+    <w:p>
+      <w:r>
+        <w:t>Public registration creates only Student accounts. Trusted deployment setup provisions Faculty, Committee and Dean accounts and SLA permission. Store a salted adaptive password hash using a maintained library such as Werkzeug; select an encoding that fits the 255-character field. Verify with the corresponding library helper. Use generic failed-login messages and a bounded login throttle as an additional design safeguard.</w:t>
+      </w:r>
+    </w:p>
+    <w:p>
+      <w:r>
+        <w:t>A signed Secure, HttpOnly, SameSite=Lax cookie carries an opaque session ID; persistent session records establish the actor and current role. Rotate session ID and CSRF token on login, expire sessions and revoke on logout. Verify CSRF on mutations, including login and registration. Keep signing secrets outside source control; use HTTPS for shared deployment and disable debug mode.</w:t>
+      </w:r>
+    </w:p>
+    <w:p>
+      <w:pPr>
+        <w:pStyle w:val="Heading2"/>
+      </w:pPr>
+      <w:r>
+        <w:t>3 9 2 Access control and threat handling</w:t>
+      </w:r>
+    </w:p>
+    <w:tbl>
+      <w:tblPr>
+        <w:tblW w:type="auto" w:w="0"/>
+        <w:tblLayout w:type="fixed"/>
+        <w:tblLook w:firstColumn="1" w:firstRow="1" w:lastColumn="0" w:lastRow="0" w:noHBand="0" w:noVBand="1" w:val="04A0"/>
+      </w:tblPr>
+      <w:tblGrid>
+        <w:gridCol w:w="2347"/>
+        <w:gridCol w:w="5933"/>
+        <w:gridCol w:w="1800"/>
+      </w:tblGrid>
+      <w:tr>
+        <w:trPr>
+          <w:cantSplit/>
+          <w:tblHeader/>
+        </w:trPr>
+        <w:tc>
+          <w:tcPr>
+            <w:tcW w:type="dxa" w:w="2347"/>
+            <w:vAlign w:val="center"/>
+            <w:shd w:fill="E6EDF3"/>
+            <w:tcMar>
+              <w:top w:w="75" w:type="dxa"/>
+              <w:bottom w:w="75" w:type="dxa"/>
+              <w:left w:w="100" w:type="dxa"/>
+              <w:right w:w="100" w:type="dxa"/>
+            </w:tcMar>
+            <w:tcBorders>
+              <w:top w:val="single" w:sz="4" w:color="D9D9D9"/>
+              <w:bottom w:val="single" w:sz="4" w:color="D9D9D9"/>
+              <w:left w:val="single" w:sz="4" w:color="D9D9D9"/>
+              <w:right w:val="single" w:sz="4" w:color="D9D9D9"/>
+            </w:tcBorders>
+          </w:tcPr>
+          <w:p>
+            <w:pPr>
+              <w:spacing w:after="20" w:line="240" w:lineRule="auto"/>
+            </w:pPr>
+            <w:r>
+              <w:rPr>
+                <w:b/>
+                <w:sz w:val="19"/>
+              </w:rPr>
+              <w:t>Threat</w:t>
+            </w:r>
+          </w:p>
+        </w:tc>
+        <w:tc>
+          <w:tcPr>
+            <w:tcW w:type="dxa" w:w="5933"/>
+            <w:vAlign w:val="center"/>
+            <w:shd w:fill="E6EDF3"/>
+            <w:tcMar>
+              <w:top w:w="75" w:type="dxa"/>
+              <w:bottom w:w="75" w:type="dxa"/>
+              <w:left w:w="100" w:type="dxa"/>
+              <w:right w:w="100" w:type="dxa"/>
+            </w:tcMar>
+            <w:tcBorders>
+              <w:top w:val="single" w:sz="4" w:color="D9D9D9"/>
+              <w:bottom w:val="single" w:sz="4" w:color="D9D9D9"/>
+              <w:left w:val="single" w:sz="4" w:color="D9D9D9"/>
+              <w:right w:val="single" w:sz="4" w:color="D9D9D9"/>
+            </w:tcBorders>
+          </w:tcPr>
+          <w:p>
+            <w:pPr>
+              <w:spacing w:after="20" w:line="240" w:lineRule="auto"/>
+            </w:pPr>
+            <w:r>
+              <w:rPr>
+                <w:b/>
+                <w:sz w:val="19"/>
+              </w:rPr>
+              <w:t>Architectural control</w:t>
+            </w:r>
+          </w:p>
+        </w:tc>
+        <w:tc>
+          <w:tcPr>
+            <w:tcW w:type="dxa" w:w="1800"/>
+            <w:vAlign w:val="center"/>
+            <w:shd w:fill="E6EDF3"/>
+            <w:tcMar>
+              <w:top w:w="75" w:type="dxa"/>
+              <w:bottom w:w="75" w:type="dxa"/>
+              <w:left w:w="100" w:type="dxa"/>
+              <w:right w:w="100" w:type="dxa"/>
+            </w:tcMar>
+            <w:tcBorders>
+              <w:top w:val="single" w:sz="4" w:color="D9D9D9"/>
+              <w:bottom w:val="single" w:sz="4" w:color="D9D9D9"/>
+              <w:left w:val="single" w:sz="4" w:color="D9D9D9"/>
+              <w:right w:val="single" w:sz="4" w:color="D9D9D9"/>
+            </w:tcBorders>
+          </w:tcPr>
+          <w:p>
+            <w:pPr>
+              <w:spacing w:after="20" w:line="240" w:lineRule="auto"/>
+            </w:pPr>
+            <w:r>
+              <w:rPr>
+                <w:b/>
+                <w:sz w:val="19"/>
+              </w:rPr>
+              <w:t>Requirement</w:t>
+            </w:r>
+          </w:p>
+        </w:tc>
+      </w:tr>
+      <w:tr>
+        <w:trPr>
+          <w:cantSplit/>
+        </w:trPr>
+        <w:tc>
+          <w:tcPr>
+            <w:tcW w:type="dxa" w:w="2347"/>
+            <w:vAlign w:val="center"/>
+            <w:shd w:fill="FFFFFF"/>
+            <w:tcMar>
+              <w:top w:w="75" w:type="dxa"/>
+              <w:bottom w:w="75" w:type="dxa"/>
+              <w:left w:w="100" w:type="dxa"/>
+              <w:right w:w="100" w:type="dxa"/>
+            </w:tcMar>
+            <w:tcBorders>
+              <w:top w:val="single" w:sz="4" w:color="D9D9D9"/>
+              <w:bottom w:val="single" w:sz="4" w:color="D9D9D9"/>
+              <w:left w:val="single" w:sz="4" w:color="D9D9D9"/>
+              <w:right w:val="single" w:sz="4" w:color="D9D9D9"/>
+            </w:tcBorders>
+          </w:tcPr>
+          <w:p>
+            <w:pPr>
+              <w:spacing w:after="20" w:line="240" w:lineRule="auto"/>
+            </w:pPr>
+            <w:r>
+              <w:rPr>
+                <w:b w:val="0"/>
+                <w:sz w:val="19"/>
+              </w:rPr>
+              <w:t>Wrong-role or cross-owner access</w:t>
+            </w:r>
+          </w:p>
+        </w:tc>
+        <w:tc>
+          <w:tcPr>
+            <w:tcW w:type="dxa" w:w="5933"/>
+            <w:vAlign w:val="center"/>
+            <w:shd w:fill="FFFFFF"/>
+            <w:tcMar>
+              <w:top w:w="75" w:type="dxa"/>
+              <w:bottom w:w="75" w:type="dxa"/>
+              <w:left w:w="100" w:type="dxa"/>
+              <w:right w:w="100" w:type="dxa"/>
+            </w:tcMar>
+            <w:tcBorders>
+              <w:top w:val="single" w:sz="4" w:color="D9D9D9"/>
+              <w:bottom w:val="single" w:sz="4" w:color="D9D9D9"/>
+              <w:left w:val="single" w:sz="4" w:color="D9D9D9"/>
+              <w:right w:val="single" w:sz="4" w:color="D9D9D9"/>
+            </w:tcBorders>
+          </w:tcPr>
+          <w:p>
+            <w:pPr>
+              <w:spacing w:after="20" w:line="240" w:lineRule="auto"/>
+            </w:pPr>
+            <w:r>
+              <w:rPr>
+                <w:b w:val="0"/>
+                <w:sz w:val="19"/>
+              </w:rPr>
+              <w:t>C03 verifies identity, ownership, assignment and permitted action before every service call and read.</w:t>
+            </w:r>
+          </w:p>
+        </w:tc>
+        <w:tc>
+          <w:tcPr>
+            <w:tcW w:type="dxa" w:w="1800"/>
+            <w:vAlign w:val="center"/>
+            <w:shd w:fill="FFFFFF"/>
+            <w:tcMar>
+              <w:top w:w="75" w:type="dxa"/>
+              <w:bottom w:w="75" w:type="dxa"/>
+              <w:left w:w="100" w:type="dxa"/>
+              <w:right w:w="100" w:type="dxa"/>
+            </w:tcMar>
+            <w:tcBorders>
+              <w:top w:val="single" w:sz="4" w:color="D9D9D9"/>
+              <w:bottom w:val="single" w:sz="4" w:color="D9D9D9"/>
+              <w:left w:val="single" w:sz="4" w:color="D9D9D9"/>
+              <w:right w:val="single" w:sz="4" w:color="D9D9D9"/>
+            </w:tcBorders>
+          </w:tcPr>
+          <w:p>
+            <w:pPr>
+              <w:spacing w:after="20" w:line="240" w:lineRule="auto"/>
+            </w:pPr>
+            <w:r>
+              <w:rPr>
+                <w:b w:val="0"/>
+                <w:sz w:val="19"/>
+              </w:rPr>
+              <w:t>SEC-02; REQ-1.3; REQ-4.4</w:t>
+            </w:r>
+          </w:p>
+        </w:tc>
+      </w:tr>
+      <w:tr>
+        <w:trPr>
+          <w:cantSplit/>
+        </w:trPr>
+        <w:tc>
+          <w:tcPr>
+            <w:tcW w:type="dxa" w:w="2347"/>
+            <w:vAlign w:val="center"/>
+            <w:shd w:fill="FFFFFF"/>
+            <w:tcMar>
+              <w:top w:w="75" w:type="dxa"/>
+              <w:bottom w:w="75" w:type="dxa"/>
+              <w:left w:w="100" w:type="dxa"/>
+              <w:right w:w="100" w:type="dxa"/>
+            </w:tcMar>
+            <w:tcBorders>
+              <w:top w:val="single" w:sz="4" w:color="D9D9D9"/>
+              <w:bottom w:val="single" w:sz="4" w:color="D9D9D9"/>
+              <w:left w:val="single" w:sz="4" w:color="D9D9D9"/>
+              <w:right w:val="single" w:sz="4" w:color="D9D9D9"/>
+            </w:tcBorders>
+          </w:tcPr>
+          <w:p>
+            <w:pPr>
+              <w:spacing w:after="20" w:line="240" w:lineRule="auto"/>
+            </w:pPr>
+            <w:r>
+              <w:rPr>
+                <w:b w:val="0"/>
+                <w:sz w:val="19"/>
+              </w:rPr>
+              <w:t>Password disclosure or account enumeration</w:t>
+            </w:r>
+          </w:p>
+        </w:tc>
+        <w:tc>
+          <w:tcPr>
+            <w:tcW w:type="dxa" w:w="5933"/>
+            <w:vAlign w:val="center"/>
+            <w:shd w:fill="FFFFFF"/>
+            <w:tcMar>
+              <w:top w:w="75" w:type="dxa"/>
+              <w:bottom w:w="75" w:type="dxa"/>
+              <w:left w:w="100" w:type="dxa"/>
+              <w:right w:w="100" w:type="dxa"/>
+            </w:tcMar>
+            <w:tcBorders>
+              <w:top w:val="single" w:sz="4" w:color="D9D9D9"/>
+              <w:bottom w:val="single" w:sz="4" w:color="D9D9D9"/>
+              <w:left w:val="single" w:sz="4" w:color="D9D9D9"/>
+              <w:right w:val="single" w:sz="4" w:color="D9D9D9"/>
+            </w:tcBorders>
+          </w:tcPr>
+          <w:p>
+            <w:pPr>
+              <w:spacing w:after="20" w:line="240" w:lineRule="auto"/>
+            </w:pPr>
+            <w:r>
+              <w:rPr>
+                <w:b w:val="0"/>
+                <w:sz w:val="19"/>
+              </w:rPr>
+              <w:t>Salted adaptive hashes; generic failures; no hashes/passwords in responses or logs.</w:t>
+            </w:r>
+          </w:p>
+        </w:tc>
+        <w:tc>
+          <w:tcPr>
+            <w:tcW w:type="dxa" w:w="1800"/>
+            <w:vAlign w:val="center"/>
+            <w:shd w:fill="FFFFFF"/>
+            <w:tcMar>
+              <w:top w:w="75" w:type="dxa"/>
+              <w:bottom w:w="75" w:type="dxa"/>
+              <w:left w:w="100" w:type="dxa"/>
+              <w:right w:w="100" w:type="dxa"/>
+            </w:tcMar>
+            <w:tcBorders>
+              <w:top w:val="single" w:sz="4" w:color="D9D9D9"/>
+              <w:bottom w:val="single" w:sz="4" w:color="D9D9D9"/>
+              <w:left w:val="single" w:sz="4" w:color="D9D9D9"/>
+              <w:right w:val="single" w:sz="4" w:color="D9D9D9"/>
+            </w:tcBorders>
+          </w:tcPr>
+          <w:p>
+            <w:pPr>
+              <w:spacing w:after="20" w:line="240" w:lineRule="auto"/>
+            </w:pPr>
+            <w:r>
+              <w:rPr>
+                <w:b w:val="0"/>
+                <w:sz w:val="19"/>
+              </w:rPr>
+              <w:t>SEC-01; SEC-04</w:t>
+            </w:r>
+          </w:p>
+        </w:tc>
+      </w:tr>
+      <w:tr>
+        <w:trPr>
+          <w:cantSplit/>
+        </w:trPr>
+        <w:tc>
+          <w:tcPr>
+            <w:tcW w:type="dxa" w:w="2347"/>
+            <w:vAlign w:val="center"/>
+            <w:shd w:fill="FFFFFF"/>
+            <w:tcMar>
+              <w:top w:w="75" w:type="dxa"/>
+              <w:bottom w:w="75" w:type="dxa"/>
+              <w:left w:w="100" w:type="dxa"/>
+              <w:right w:w="100" w:type="dxa"/>
+            </w:tcMar>
+            <w:tcBorders>
+              <w:top w:val="single" w:sz="4" w:color="D9D9D9"/>
+              <w:bottom w:val="single" w:sz="4" w:color="D9D9D9"/>
+              <w:left w:val="single" w:sz="4" w:color="D9D9D9"/>
+              <w:right w:val="single" w:sz="4" w:color="D9D9D9"/>
+            </w:tcBorders>
+          </w:tcPr>
+          <w:p>
+            <w:pPr>
+              <w:spacing w:after="20" w:line="240" w:lineRule="auto"/>
+            </w:pPr>
+            <w:r>
+              <w:rPr>
+                <w:b w:val="0"/>
+                <w:sz w:val="19"/>
+              </w:rPr>
+              <w:t>SQL injection or stored script content</w:t>
+            </w:r>
+          </w:p>
+        </w:tc>
+        <w:tc>
+          <w:tcPr>
+            <w:tcW w:type="dxa" w:w="5933"/>
+            <w:vAlign w:val="center"/>
+            <w:shd w:fill="FFFFFF"/>
+            <w:tcMar>
+              <w:top w:w="75" w:type="dxa"/>
+              <w:bottom w:w="75" w:type="dxa"/>
+              <w:left w:w="100" w:type="dxa"/>
+              <w:right w:w="100" w:type="dxa"/>
+            </w:tcMar>
+            <w:tcBorders>
+              <w:top w:val="single" w:sz="4" w:color="D9D9D9"/>
+              <w:bottom w:val="single" w:sz="4" w:color="D9D9D9"/>
+              <w:left w:val="single" w:sz="4" w:color="D9D9D9"/>
+              <w:right w:val="single" w:sz="4" w:color="D9D9D9"/>
+            </w:tcBorders>
+          </w:tcPr>
+          <w:p>
+            <w:pPr>
+              <w:spacing w:after="20" w:line="240" w:lineRule="auto"/>
+            </w:pPr>
+            <w:r>
+              <w:rPr>
+                <w:b w:val="0"/>
+                <w:sz w:val="19"/>
+              </w:rPr>
+              <w:t>C09 parameterizes SQL; allowlist query structure; escape user text in C02 output.</w:t>
+            </w:r>
+          </w:p>
+        </w:tc>
+        <w:tc>
+          <w:tcPr>
+            <w:tcW w:type="dxa" w:w="1800"/>
+            <w:vAlign w:val="center"/>
+            <w:shd w:fill="FFFFFF"/>
+            <w:tcMar>
+              <w:top w:w="75" w:type="dxa"/>
+              <w:bottom w:w="75" w:type="dxa"/>
+              <w:left w:w="100" w:type="dxa"/>
+              <w:right w:w="100" w:type="dxa"/>
+            </w:tcMar>
+            <w:tcBorders>
+              <w:top w:val="single" w:sz="4" w:color="D9D9D9"/>
+              <w:bottom w:val="single" w:sz="4" w:color="D9D9D9"/>
+              <w:left w:val="single" w:sz="4" w:color="D9D9D9"/>
+              <w:right w:val="single" w:sz="4" w:color="D9D9D9"/>
+            </w:tcBorders>
+          </w:tcPr>
+          <w:p>
+            <w:pPr>
+              <w:spacing w:after="20" w:line="240" w:lineRule="auto"/>
+            </w:pPr>
+            <w:r>
+              <w:rPr>
+                <w:b w:val="0"/>
+                <w:sz w:val="19"/>
+              </w:rPr>
+              <w:t>SO-01; SO-02</w:t>
+            </w:r>
+          </w:p>
+        </w:tc>
+      </w:tr>
+      <w:tr>
+        <w:trPr>
+          <w:cantSplit/>
+        </w:trPr>
+        <w:tc>
+          <w:tcPr>
+            <w:tcW w:type="dxa" w:w="2347"/>
+            <w:vAlign w:val="center"/>
+            <w:shd w:fill="FFFFFF"/>
+            <w:tcMar>
+              <w:top w:w="75" w:type="dxa"/>
+              <w:bottom w:w="75" w:type="dxa"/>
+              <w:left w:w="100" w:type="dxa"/>
+              <w:right w:w="100" w:type="dxa"/>
+            </w:tcMar>
+            <w:tcBorders>
+              <w:top w:val="single" w:sz="4" w:color="D9D9D9"/>
+              <w:bottom w:val="single" w:sz="4" w:color="D9D9D9"/>
+              <w:left w:val="single" w:sz="4" w:color="D9D9D9"/>
+              <w:right w:val="single" w:sz="4" w:color="D9D9D9"/>
+            </w:tcBorders>
+          </w:tcPr>
+          <w:p>
+            <w:pPr>
+              <w:spacing w:after="20" w:line="240" w:lineRule="auto"/>
+            </w:pPr>
+            <w:r>
+              <w:rPr>
+                <w:b w:val="0"/>
+                <w:sz w:val="19"/>
+              </w:rPr>
+              <w:t>CSRF or stolen session token</w:t>
+            </w:r>
+          </w:p>
+        </w:tc>
+        <w:tc>
+          <w:tcPr>
+            <w:tcW w:type="dxa" w:w="5933"/>
+            <w:vAlign w:val="center"/>
+            <w:shd w:fill="FFFFFF"/>
+            <w:tcMar>
+              <w:top w:w="75" w:type="dxa"/>
+              <w:bottom w:w="75" w:type="dxa"/>
+              <w:left w:w="100" w:type="dxa"/>
+              <w:right w:w="100" w:type="dxa"/>
+            </w:tcMar>
+            <w:tcBorders>
+              <w:top w:val="single" w:sz="4" w:color="D9D9D9"/>
+              <w:bottom w:val="single" w:sz="4" w:color="D9D9D9"/>
+              <w:left w:val="single" w:sz="4" w:color="D9D9D9"/>
+              <w:right w:val="single" w:sz="4" w:color="D9D9D9"/>
+            </w:tcBorders>
+          </w:tcPr>
+          <w:p>
+            <w:pPr>
+              <w:spacing w:after="20" w:line="240" w:lineRule="auto"/>
+            </w:pPr>
+            <w:r>
+              <w:rPr>
+                <w:b w:val="0"/>
+                <w:sz w:val="19"/>
+              </w:rPr>
+              <w:t>CSRF verification, secure cookie attributes, HTTPS and session revocation.</w:t>
+            </w:r>
+          </w:p>
+        </w:tc>
+        <w:tc>
+          <w:tcPr>
+            <w:tcW w:type="dxa" w:w="1800"/>
+            <w:vAlign w:val="center"/>
+            <w:shd w:fill="FFFFFF"/>
+            <w:tcMar>
+              <w:top w:w="75" w:type="dxa"/>
+              <w:bottom w:w="75" w:type="dxa"/>
+              <w:left w:w="100" w:type="dxa"/>
+              <w:right w:w="100" w:type="dxa"/>
+            </w:tcMar>
+            <w:tcBorders>
+              <w:top w:val="single" w:sz="4" w:color="D9D9D9"/>
+              <w:bottom w:val="single" w:sz="4" w:color="D9D9D9"/>
+              <w:left w:val="single" w:sz="4" w:color="D9D9D9"/>
+              <w:right w:val="single" w:sz="4" w:color="D9D9D9"/>
+            </w:tcBorders>
+          </w:tcPr>
+          <w:p>
+            <w:pPr>
+              <w:spacing w:after="20" w:line="240" w:lineRule="auto"/>
+            </w:pPr>
+            <w:r>
+              <w:rPr>
+                <w:b w:val="0"/>
+                <w:sz w:val="19"/>
+              </w:rPr>
+              <w:t>SO-01; additional safeguards</w:t>
+            </w:r>
+          </w:p>
+        </w:tc>
+      </w:tr>
+      <w:tr>
+        <w:trPr>
+          <w:cantSplit/>
+        </w:trPr>
+        <w:tc>
+          <w:tcPr>
+            <w:tcW w:type="dxa" w:w="2347"/>
+            <w:vAlign w:val="center"/>
+            <w:shd w:fill="FFFFFF"/>
+            <w:tcMar>
+              <w:top w:w="75" w:type="dxa"/>
+              <w:bottom w:w="75" w:type="dxa"/>
+              <w:left w:w="100" w:type="dxa"/>
+              <w:right w:w="100" w:type="dxa"/>
+            </w:tcMar>
+            <w:tcBorders>
+              <w:top w:val="single" w:sz="4" w:color="D9D9D9"/>
+              <w:bottom w:val="single" w:sz="4" w:color="D9D9D9"/>
+              <w:left w:val="single" w:sz="4" w:color="D9D9D9"/>
+              <w:right w:val="single" w:sz="4" w:color="D9D9D9"/>
+            </w:tcBorders>
+          </w:tcPr>
+          <w:p>
+            <w:pPr>
+              <w:spacing w:after="20" w:line="240" w:lineRule="auto"/>
+            </w:pPr>
+            <w:r>
+              <w:rPr>
+                <w:b w:val="0"/>
+                <w:sz w:val="19"/>
+              </w:rPr>
+              <w:t>Audit edits or partial workflow state</w:t>
+            </w:r>
+          </w:p>
+        </w:tc>
+        <w:tc>
+          <w:tcPr>
+            <w:tcW w:type="dxa" w:w="5933"/>
+            <w:vAlign w:val="center"/>
+            <w:shd w:fill="FFFFFF"/>
+            <w:tcMar>
+              <w:top w:w="75" w:type="dxa"/>
+              <w:bottom w:w="75" w:type="dxa"/>
+              <w:left w:w="100" w:type="dxa"/>
+              <w:right w:w="100" w:type="dxa"/>
+            </w:tcMar>
+            <w:tcBorders>
+              <w:top w:val="single" w:sz="4" w:color="D9D9D9"/>
+              <w:bottom w:val="single" w:sz="4" w:color="D9D9D9"/>
+              <w:left w:val="single" w:sz="4" w:color="D9D9D9"/>
+              <w:right w:val="single" w:sz="4" w:color="D9D9D9"/>
+            </w:tcBorders>
+          </w:tcPr>
+          <w:p>
+            <w:pPr>
+              <w:spacing w:after="20" w:line="240" w:lineRule="auto"/>
+            </w:pPr>
+            <w:r>
+              <w:rPr>
+                <w:b w:val="0"/>
+                <w:sz w:val="19"/>
+              </w:rPr>
+              <w:t>Append-only C06; no mutation route; trigger protection; atomic C04 transaction.</w:t>
+            </w:r>
+          </w:p>
+        </w:tc>
+        <w:tc>
+          <w:tcPr>
+            <w:tcW w:type="dxa" w:w="1800"/>
+            <w:vAlign w:val="center"/>
+            <w:shd w:fill="FFFFFF"/>
+            <w:tcMar>
+              <w:top w:w="75" w:type="dxa"/>
+              <w:bottom w:w="75" w:type="dxa"/>
+              <w:left w:w="100" w:type="dxa"/>
+              <w:right w:w="100" w:type="dxa"/>
+            </w:tcMar>
+            <w:tcBorders>
+              <w:top w:val="single" w:sz="4" w:color="D9D9D9"/>
+              <w:bottom w:val="single" w:sz="4" w:color="D9D9D9"/>
+              <w:left w:val="single" w:sz="4" w:color="D9D9D9"/>
+              <w:right w:val="single" w:sz="4" w:color="D9D9D9"/>
+            </w:tcBorders>
+          </w:tcPr>
+          <w:p>
+            <w:pPr>
+              <w:spacing w:after="20" w:line="240" w:lineRule="auto"/>
+            </w:pPr>
+            <w:r>
+              <w:rPr>
+                <w:b w:val="0"/>
+                <w:sz w:val="19"/>
+              </w:rPr>
+              <w:t>REQ-6.1 to REQ-6.3; SEC-03</w:t>
+            </w:r>
+          </w:p>
+        </w:tc>
+      </w:tr>
+      <w:tr>
+        <w:trPr>
+          <w:cantSplit/>
+        </w:trPr>
+        <w:tc>
+          <w:tcPr>
+            <w:tcW w:type="dxa" w:w="2347"/>
+            <w:vAlign w:val="center"/>
+            <w:shd w:fill="FFFFFF"/>
+            <w:tcMar>
+              <w:top w:w="75" w:type="dxa"/>
+              <w:bottom w:w="75" w:type="dxa"/>
+              <w:left w:w="100" w:type="dxa"/>
+              <w:right w:w="100" w:type="dxa"/>
+            </w:tcMar>
+            <w:tcBorders>
+              <w:top w:val="single" w:sz="4" w:color="D9D9D9"/>
+              <w:bottom w:val="single" w:sz="4" w:color="D9D9D9"/>
+              <w:left w:val="single" w:sz="4" w:color="D9D9D9"/>
+              <w:right w:val="single" w:sz="4" w:color="D9D9D9"/>
+            </w:tcBorders>
+          </w:tcPr>
+          <w:p>
+            <w:pPr>
+              <w:spacing w:after="20" w:line="240" w:lineRule="auto"/>
+            </w:pPr>
+            <w:r>
+              <w:rPr>
+                <w:b w:val="0"/>
+                <w:sz w:val="19"/>
+              </w:rPr>
+              <w:t>Duplicate appeal or stale mutation</w:t>
+            </w:r>
+          </w:p>
+        </w:tc>
+        <w:tc>
+          <w:tcPr>
+            <w:tcW w:type="dxa" w:w="5933"/>
+            <w:vAlign w:val="center"/>
+            <w:shd w:fill="FFFFFF"/>
+            <w:tcMar>
+              <w:top w:w="75" w:type="dxa"/>
+              <w:bottom w:w="75" w:type="dxa"/>
+              <w:left w:w="100" w:type="dxa"/>
+              <w:right w:w="100" w:type="dxa"/>
+            </w:tcMar>
+            <w:tcBorders>
+              <w:top w:val="single" w:sz="4" w:color="D9D9D9"/>
+              <w:bottom w:val="single" w:sz="4" w:color="D9D9D9"/>
+              <w:left w:val="single" w:sz="4" w:color="D9D9D9"/>
+              <w:right w:val="single" w:sz="4" w:color="D9D9D9"/>
+            </w:tcBorders>
+          </w:tcPr>
+          <w:p>
+            <w:pPr>
+              <w:spacing w:after="20" w:line="240" w:lineRule="auto"/>
+            </w:pPr>
+            <w:r>
+              <w:rPr>
+                <w:b w:val="0"/>
+                <w:sz w:val="19"/>
+              </w:rPr>
+              <w:t>Unique appeal and feedback constraints plus optimistic version checking.</w:t>
+            </w:r>
+          </w:p>
+        </w:tc>
+        <w:tc>
+          <w:tcPr>
+            <w:tcW w:type="dxa" w:w="1800"/>
+            <w:vAlign w:val="center"/>
+            <w:shd w:fill="FFFFFF"/>
+            <w:tcMar>
+              <w:top w:w="75" w:type="dxa"/>
+              <w:bottom w:w="75" w:type="dxa"/>
+              <w:left w:w="100" w:type="dxa"/>
+              <w:right w:w="100" w:type="dxa"/>
+            </w:tcMar>
+            <w:tcBorders>
+              <w:top w:val="single" w:sz="4" w:color="D9D9D9"/>
+              <w:bottom w:val="single" w:sz="4" w:color="D9D9D9"/>
+              <w:left w:val="single" w:sz="4" w:color="D9D9D9"/>
+              <w:right w:val="single" w:sz="4" w:color="D9D9D9"/>
+            </w:tcBorders>
+          </w:tcPr>
+          <w:p>
+            <w:pPr>
+              <w:spacing w:after="20" w:line="240" w:lineRule="auto"/>
+            </w:pPr>
+            <w:r>
+              <w:rPr>
+                <w:b w:val="0"/>
+                <w:sz w:val="19"/>
+              </w:rPr>
+              <w:t>REQ-5.1 to REQ-5.4; SO-02</w:t>
+            </w:r>
+          </w:p>
+        </w:tc>
+      </w:tr>
+    </w:tbl>
+    <w:p>
+      <w:pPr>
+        <w:spacing w:after="0"/>
+      </w:pPr>
+    </w:p>
+    <w:p>
+      <w:pPr>
+        <w:pStyle w:val="Heading2"/>
+      </w:pPr>
+      <w:r>
+        <w:t>3 9 3 Privacy and operational access</w:t>
+      </w:r>
+    </w:p>
+    <w:p>
+      <w:r>
+        <w:t>Return minimum role-specific fields and apply Cache-Control: no-store to protected data. Denied access to an invisible complaint uses a generic not-found result. Logs exclude complaint text, appeal justification, feedback comments, passwords, hashes, cookies and CSRF tokens. Authorized handler feedback views exclude student identity. Database owner, backup and log administrators remain privileged; database audit triggers do not defend against host compromise.</w:t>
+      </w:r>
+    </w:p>
     <w:sectPr>
       <w:footerReference w:type="default" r:id="rId9"/>
       <w:pgSz w:w="12240" w:h="15840"/>

</xml_diff>

<commit_message>
docs: complete requirement traceability and design alignment
</commit_message>
<xml_diff>
--- a/Member3-Architecture/SCMS_Member3_Software_Architecture.docx
+++ b/Member3-Architecture/SCMS_Member3_Software_Architecture.docx
@@ -24,7 +24,7 @@
         <w:br/>
         <w:t>Prepared by Mohammed Zahoor Mashahir | PES1UG24CS579</w:t>
         <w:br/>
-        <w:t>Team 8 | Version 0.2</w:t>
+        <w:t>Team 8 | Version 1.0</w:t>
       </w:r>
     </w:p>
     <w:p>
@@ -5566,6 +5566,3034 @@
         <w:t>Return minimum role-specific fields and apply Cache-Control: no-store to protected data. Denied access to an invisible complaint uses a generic not-found result. Logs exclude complaint text, appeal justification, feedback comments, passwords, hashes, cookies and CSRF tokens. Authorized handler feedback views exclude student identity. Database owner, backup and log administrators remain privileged; database audit triggers do not defend against host compromise.</w:t>
       </w:r>
     </w:p>
+    <w:p>
+      <w:r>
+        <w:br w:type="page"/>
+      </w:r>
+    </w:p>
+    <w:p>
+      <w:pPr>
+        <w:pStyle w:val="Heading1"/>
+      </w:pPr>
+      <w:r>
+        <w:t>3 10 Functional requirement traceability</w:t>
+      </w:r>
+    </w:p>
+    <w:p>
+      <w:r>
+        <w:t>Requirement IDs and meanings below come from SRS feature sections, which take precedence over mislabelled Appendix C rows. Each of the 28 functional requirements maps to an owning component and an architecture section. These are architecture references for insertion into the SRS traceability matrix, not implementation or test-execution claims.</w:t>
+      </w:r>
+    </w:p>
+    <w:tbl>
+      <w:tblPr>
+        <w:tblW w:type="auto" w:w="0"/>
+        <w:tblLayout w:type="fixed"/>
+        <w:tblLook w:firstColumn="1" w:firstRow="1" w:lastColumn="0" w:lastRow="0" w:noHBand="0" w:noVBand="1" w:val="04A0"/>
+      </w:tblPr>
+      <w:tblGrid>
+        <w:gridCol w:w="2275"/>
+        <w:gridCol w:w="6077"/>
+        <w:gridCol w:w="1728"/>
+      </w:tblGrid>
+      <w:tr>
+        <w:trPr>
+          <w:cantSplit/>
+          <w:tblHeader/>
+        </w:trPr>
+        <w:tc>
+          <w:tcPr>
+            <w:tcW w:type="dxa" w:w="2275"/>
+            <w:vAlign w:val="center"/>
+            <w:shd w:fill="E6EDF3"/>
+            <w:tcMar>
+              <w:top w:w="75" w:type="dxa"/>
+              <w:bottom w:w="75" w:type="dxa"/>
+              <w:left w:w="100" w:type="dxa"/>
+              <w:right w:w="100" w:type="dxa"/>
+            </w:tcMar>
+            <w:tcBorders>
+              <w:top w:val="single" w:sz="4" w:color="D9D9D9"/>
+              <w:bottom w:val="single" w:sz="4" w:color="D9D9D9"/>
+              <w:left w:val="single" w:sz="4" w:color="D9D9D9"/>
+              <w:right w:val="single" w:sz="4" w:color="D9D9D9"/>
+            </w:tcBorders>
+          </w:tcPr>
+          <w:p>
+            <w:pPr>
+              <w:spacing w:after="20" w:line="240" w:lineRule="auto"/>
+            </w:pPr>
+            <w:r>
+              <w:rPr>
+                <w:b/>
+                <w:sz w:val="19"/>
+              </w:rPr>
+              <w:t>SRS IDs</w:t>
+            </w:r>
+          </w:p>
+        </w:tc>
+        <w:tc>
+          <w:tcPr>
+            <w:tcW w:type="dxa" w:w="6077"/>
+            <w:vAlign w:val="center"/>
+            <w:shd w:fill="E6EDF3"/>
+            <w:tcMar>
+              <w:top w:w="75" w:type="dxa"/>
+              <w:bottom w:w="75" w:type="dxa"/>
+              <w:left w:w="100" w:type="dxa"/>
+              <w:right w:w="100" w:type="dxa"/>
+            </w:tcMar>
+            <w:tcBorders>
+              <w:top w:val="single" w:sz="4" w:color="D9D9D9"/>
+              <w:bottom w:val="single" w:sz="4" w:color="D9D9D9"/>
+              <w:left w:val="single" w:sz="4" w:color="D9D9D9"/>
+              <w:right w:val="single" w:sz="4" w:color="D9D9D9"/>
+            </w:tcBorders>
+          </w:tcPr>
+          <w:p>
+            <w:pPr>
+              <w:spacing w:after="20" w:line="240" w:lineRule="auto"/>
+            </w:pPr>
+            <w:r>
+              <w:rPr>
+                <w:b/>
+                <w:sz w:val="19"/>
+              </w:rPr>
+              <w:t>Architectural responsibility</w:t>
+            </w:r>
+          </w:p>
+        </w:tc>
+        <w:tc>
+          <w:tcPr>
+            <w:tcW w:type="dxa" w:w="1728"/>
+            <w:vAlign w:val="center"/>
+            <w:shd w:fill="E6EDF3"/>
+            <w:tcMar>
+              <w:top w:w="75" w:type="dxa"/>
+              <w:bottom w:w="75" w:type="dxa"/>
+              <w:left w:w="100" w:type="dxa"/>
+              <w:right w:w="100" w:type="dxa"/>
+            </w:tcMar>
+            <w:tcBorders>
+              <w:top w:val="single" w:sz="4" w:color="D9D9D9"/>
+              <w:bottom w:val="single" w:sz="4" w:color="D9D9D9"/>
+              <w:left w:val="single" w:sz="4" w:color="D9D9D9"/>
+              <w:right w:val="single" w:sz="4" w:color="D9D9D9"/>
+            </w:tcBorders>
+          </w:tcPr>
+          <w:p>
+            <w:pPr>
+              <w:spacing w:after="20" w:line="240" w:lineRule="auto"/>
+            </w:pPr>
+            <w:r>
+              <w:rPr>
+                <w:b/>
+                <w:sz w:val="19"/>
+              </w:rPr>
+              <w:t>Section</w:t>
+            </w:r>
+          </w:p>
+        </w:tc>
+      </w:tr>
+      <w:tr>
+        <w:trPr>
+          <w:cantSplit/>
+        </w:trPr>
+        <w:tc>
+          <w:tcPr>
+            <w:tcW w:type="dxa" w:w="2275"/>
+            <w:vAlign w:val="center"/>
+            <w:shd w:fill="FFFFFF"/>
+            <w:tcMar>
+              <w:top w:w="75" w:type="dxa"/>
+              <w:bottom w:w="75" w:type="dxa"/>
+              <w:left w:w="100" w:type="dxa"/>
+              <w:right w:w="100" w:type="dxa"/>
+            </w:tcMar>
+            <w:tcBorders>
+              <w:top w:val="single" w:sz="4" w:color="D9D9D9"/>
+              <w:bottom w:val="single" w:sz="4" w:color="D9D9D9"/>
+              <w:left w:val="single" w:sz="4" w:color="D9D9D9"/>
+              <w:right w:val="single" w:sz="4" w:color="D9D9D9"/>
+            </w:tcBorders>
+          </w:tcPr>
+          <w:p>
+            <w:pPr>
+              <w:spacing w:after="20" w:line="240" w:lineRule="auto"/>
+            </w:pPr>
+            <w:r>
+              <w:rPr>
+                <w:b w:val="0"/>
+                <w:sz w:val="19"/>
+              </w:rPr>
+              <w:t>REQ-1.1</w:t>
+            </w:r>
+          </w:p>
+        </w:tc>
+        <w:tc>
+          <w:tcPr>
+            <w:tcW w:type="dxa" w:w="6077"/>
+            <w:vAlign w:val="center"/>
+            <w:shd w:fill="FFFFFF"/>
+            <w:tcMar>
+              <w:top w:w="75" w:type="dxa"/>
+              <w:bottom w:w="75" w:type="dxa"/>
+              <w:left w:w="100" w:type="dxa"/>
+              <w:right w:w="100" w:type="dxa"/>
+            </w:tcMar>
+            <w:tcBorders>
+              <w:top w:val="single" w:sz="4" w:color="D9D9D9"/>
+              <w:bottom w:val="single" w:sz="4" w:color="D9D9D9"/>
+              <w:left w:val="single" w:sz="4" w:color="D9D9D9"/>
+              <w:right w:val="single" w:sz="4" w:color="D9D9D9"/>
+            </w:tcBorders>
+          </w:tcPr>
+          <w:p>
+            <w:pPr>
+              <w:spacing w:after="20" w:line="240" w:lineRule="auto"/>
+            </w:pPr>
+            <w:r>
+              <w:rPr>
+                <w:b w:val="0"/>
+                <w:sz w:val="19"/>
+              </w:rPr>
+              <w:t>C02/C03/C09 create Student account with validated university ID and credentials.</w:t>
+            </w:r>
+          </w:p>
+        </w:tc>
+        <w:tc>
+          <w:tcPr>
+            <w:tcW w:type="dxa" w:w="1728"/>
+            <w:vAlign w:val="center"/>
+            <w:shd w:fill="FFFFFF"/>
+            <w:tcMar>
+              <w:top w:w="75" w:type="dxa"/>
+              <w:bottom w:w="75" w:type="dxa"/>
+              <w:left w:w="100" w:type="dxa"/>
+              <w:right w:w="100" w:type="dxa"/>
+            </w:tcMar>
+            <w:tcBorders>
+              <w:top w:val="single" w:sz="4" w:color="D9D9D9"/>
+              <w:bottom w:val="single" w:sz="4" w:color="D9D9D9"/>
+              <w:left w:val="single" w:sz="4" w:color="D9D9D9"/>
+              <w:right w:val="single" w:sz="4" w:color="D9D9D9"/>
+            </w:tcBorders>
+          </w:tcPr>
+          <w:p>
+            <w:pPr>
+              <w:spacing w:after="20" w:line="240" w:lineRule="auto"/>
+            </w:pPr>
+            <w:r>
+              <w:rPr>
+                <w:b w:val="0"/>
+                <w:sz w:val="19"/>
+              </w:rPr>
+              <w:t>3 3; 3 7; 3 9</w:t>
+            </w:r>
+          </w:p>
+        </w:tc>
+      </w:tr>
+      <w:tr>
+        <w:trPr>
+          <w:cantSplit/>
+        </w:trPr>
+        <w:tc>
+          <w:tcPr>
+            <w:tcW w:type="dxa" w:w="2275"/>
+            <w:vAlign w:val="center"/>
+            <w:shd w:fill="FFFFFF"/>
+            <w:tcMar>
+              <w:top w:w="75" w:type="dxa"/>
+              <w:bottom w:w="75" w:type="dxa"/>
+              <w:left w:w="100" w:type="dxa"/>
+              <w:right w:w="100" w:type="dxa"/>
+            </w:tcMar>
+            <w:tcBorders>
+              <w:top w:val="single" w:sz="4" w:color="D9D9D9"/>
+              <w:bottom w:val="single" w:sz="4" w:color="D9D9D9"/>
+              <w:left w:val="single" w:sz="4" w:color="D9D9D9"/>
+              <w:right w:val="single" w:sz="4" w:color="D9D9D9"/>
+            </w:tcBorders>
+          </w:tcPr>
+          <w:p>
+            <w:pPr>
+              <w:spacing w:after="20" w:line="240" w:lineRule="auto"/>
+            </w:pPr>
+            <w:r>
+              <w:rPr>
+                <w:b w:val="0"/>
+                <w:sz w:val="19"/>
+              </w:rPr>
+              <w:t>REQ-1.2 to REQ-1.4</w:t>
+            </w:r>
+          </w:p>
+        </w:tc>
+        <w:tc>
+          <w:tcPr>
+            <w:tcW w:type="dxa" w:w="6077"/>
+            <w:vAlign w:val="center"/>
+            <w:shd w:fill="FFFFFF"/>
+            <w:tcMar>
+              <w:top w:w="75" w:type="dxa"/>
+              <w:bottom w:w="75" w:type="dxa"/>
+              <w:left w:w="100" w:type="dxa"/>
+              <w:right w:w="100" w:type="dxa"/>
+            </w:tcMar>
+            <w:tcBorders>
+              <w:top w:val="single" w:sz="4" w:color="D9D9D9"/>
+              <w:bottom w:val="single" w:sz="4" w:color="D9D9D9"/>
+              <w:left w:val="single" w:sz="4" w:color="D9D9D9"/>
+              <w:right w:val="single" w:sz="4" w:color="D9D9D9"/>
+            </w:tcBorders>
+          </w:tcPr>
+          <w:p>
+            <w:pPr>
+              <w:spacing w:after="20" w:line="240" w:lineRule="auto"/>
+            </w:pPr>
+            <w:r>
+              <w:rPr>
+                <w:b w:val="0"/>
+                <w:sz w:val="19"/>
+              </w:rPr>
+              <w:t>C03 verifies sessions, role/resource policy and generic failed authentication.</w:t>
+            </w:r>
+          </w:p>
+        </w:tc>
+        <w:tc>
+          <w:tcPr>
+            <w:tcW w:type="dxa" w:w="1728"/>
+            <w:vAlign w:val="center"/>
+            <w:shd w:fill="FFFFFF"/>
+            <w:tcMar>
+              <w:top w:w="75" w:type="dxa"/>
+              <w:bottom w:w="75" w:type="dxa"/>
+              <w:left w:w="100" w:type="dxa"/>
+              <w:right w:w="100" w:type="dxa"/>
+            </w:tcMar>
+            <w:tcBorders>
+              <w:top w:val="single" w:sz="4" w:color="D9D9D9"/>
+              <w:bottom w:val="single" w:sz="4" w:color="D9D9D9"/>
+              <w:left w:val="single" w:sz="4" w:color="D9D9D9"/>
+              <w:right w:val="single" w:sz="4" w:color="D9D9D9"/>
+            </w:tcBorders>
+          </w:tcPr>
+          <w:p>
+            <w:pPr>
+              <w:spacing w:after="20" w:line="240" w:lineRule="auto"/>
+            </w:pPr>
+            <w:r>
+              <w:rPr>
+                <w:b w:val="0"/>
+                <w:sz w:val="19"/>
+              </w:rPr>
+              <w:t>3 3; 3 9</w:t>
+            </w:r>
+          </w:p>
+        </w:tc>
+      </w:tr>
+      <w:tr>
+        <w:trPr>
+          <w:cantSplit/>
+        </w:trPr>
+        <w:tc>
+          <w:tcPr>
+            <w:tcW w:type="dxa" w:w="2275"/>
+            <w:vAlign w:val="center"/>
+            <w:shd w:fill="FFFFFF"/>
+            <w:tcMar>
+              <w:top w:w="75" w:type="dxa"/>
+              <w:bottom w:w="75" w:type="dxa"/>
+              <w:left w:w="100" w:type="dxa"/>
+              <w:right w:w="100" w:type="dxa"/>
+            </w:tcMar>
+            <w:tcBorders>
+              <w:top w:val="single" w:sz="4" w:color="D9D9D9"/>
+              <w:bottom w:val="single" w:sz="4" w:color="D9D9D9"/>
+              <w:left w:val="single" w:sz="4" w:color="D9D9D9"/>
+              <w:right w:val="single" w:sz="4" w:color="D9D9D9"/>
+            </w:tcBorders>
+          </w:tcPr>
+          <w:p>
+            <w:pPr>
+              <w:spacing w:after="20" w:line="240" w:lineRule="auto"/>
+            </w:pPr>
+            <w:r>
+              <w:rPr>
+                <w:b w:val="0"/>
+                <w:sz w:val="19"/>
+              </w:rPr>
+              <w:t>REQ-2.1 to REQ-2.3</w:t>
+            </w:r>
+          </w:p>
+        </w:tc>
+        <w:tc>
+          <w:tcPr>
+            <w:tcW w:type="dxa" w:w="6077"/>
+            <w:vAlign w:val="center"/>
+            <w:shd w:fill="FFFFFF"/>
+            <w:tcMar>
+              <w:top w:w="75" w:type="dxa"/>
+              <w:bottom w:w="75" w:type="dxa"/>
+              <w:left w:w="100" w:type="dxa"/>
+              <w:right w:w="100" w:type="dxa"/>
+            </w:tcMar>
+            <w:tcBorders>
+              <w:top w:val="single" w:sz="4" w:color="D9D9D9"/>
+              <w:bottom w:val="single" w:sz="4" w:color="D9D9D9"/>
+              <w:left w:val="single" w:sz="4" w:color="D9D9D9"/>
+              <w:right w:val="single" w:sz="4" w:color="D9D9D9"/>
+            </w:tcBorders>
+          </w:tcPr>
+          <w:p>
+            <w:pPr>
+              <w:spacing w:after="20" w:line="240" w:lineRule="auto"/>
+            </w:pPr>
+            <w:r>
+              <w:rPr>
+                <w:b w:val="0"/>
+                <w:sz w:val="19"/>
+              </w:rPr>
+              <w:t>C02 validation and C04/C09 durable complaint with unique ID and UTC timestamp.</w:t>
+            </w:r>
+          </w:p>
+        </w:tc>
+        <w:tc>
+          <w:tcPr>
+            <w:tcW w:type="dxa" w:w="1728"/>
+            <w:vAlign w:val="center"/>
+            <w:shd w:fill="FFFFFF"/>
+            <w:tcMar>
+              <w:top w:w="75" w:type="dxa"/>
+              <w:bottom w:w="75" w:type="dxa"/>
+              <w:left w:w="100" w:type="dxa"/>
+              <w:right w:w="100" w:type="dxa"/>
+            </w:tcMar>
+            <w:tcBorders>
+              <w:top w:val="single" w:sz="4" w:color="D9D9D9"/>
+              <w:bottom w:val="single" w:sz="4" w:color="D9D9D9"/>
+              <w:left w:val="single" w:sz="4" w:color="D9D9D9"/>
+              <w:right w:val="single" w:sz="4" w:color="D9D9D9"/>
+            </w:tcBorders>
+          </w:tcPr>
+          <w:p>
+            <w:pPr>
+              <w:spacing w:after="20" w:line="240" w:lineRule="auto"/>
+            </w:pPr>
+            <w:r>
+              <w:rPr>
+                <w:b w:val="0"/>
+                <w:sz w:val="19"/>
+              </w:rPr>
+              <w:t>3 4 1; 3 7</w:t>
+            </w:r>
+          </w:p>
+        </w:tc>
+      </w:tr>
+      <w:tr>
+        <w:trPr>
+          <w:cantSplit/>
+        </w:trPr>
+        <w:tc>
+          <w:tcPr>
+            <w:tcW w:type="dxa" w:w="2275"/>
+            <w:vAlign w:val="center"/>
+            <w:shd w:fill="FFFFFF"/>
+            <w:tcMar>
+              <w:top w:w="75" w:type="dxa"/>
+              <w:bottom w:w="75" w:type="dxa"/>
+              <w:left w:w="100" w:type="dxa"/>
+              <w:right w:w="100" w:type="dxa"/>
+            </w:tcMar>
+            <w:tcBorders>
+              <w:top w:val="single" w:sz="4" w:color="D9D9D9"/>
+              <w:bottom w:val="single" w:sz="4" w:color="D9D9D9"/>
+              <w:left w:val="single" w:sz="4" w:color="D9D9D9"/>
+              <w:right w:val="single" w:sz="4" w:color="D9D9D9"/>
+            </w:tcBorders>
+          </w:tcPr>
+          <w:p>
+            <w:pPr>
+              <w:spacing w:after="20" w:line="240" w:lineRule="auto"/>
+            </w:pPr>
+            <w:r>
+              <w:rPr>
+                <w:b w:val="0"/>
+                <w:sz w:val="19"/>
+              </w:rPr>
+              <w:t>REQ-3.1 to REQ-3.3</w:t>
+            </w:r>
+          </w:p>
+        </w:tc>
+        <w:tc>
+          <w:tcPr>
+            <w:tcW w:type="dxa" w:w="6077"/>
+            <w:vAlign w:val="center"/>
+            <w:shd w:fill="FFFFFF"/>
+            <w:tcMar>
+              <w:top w:w="75" w:type="dxa"/>
+              <w:bottom w:w="75" w:type="dxa"/>
+              <w:left w:w="100" w:type="dxa"/>
+              <w:right w:w="100" w:type="dxa"/>
+            </w:tcMar>
+            <w:tcBorders>
+              <w:top w:val="single" w:sz="4" w:color="D9D9D9"/>
+              <w:bottom w:val="single" w:sz="4" w:color="D9D9D9"/>
+              <w:left w:val="single" w:sz="4" w:color="D9D9D9"/>
+              <w:right w:val="single" w:sz="4" w:color="D9D9D9"/>
+            </w:tcBorders>
+          </w:tcPr>
+          <w:p>
+            <w:pPr>
+              <w:spacing w:after="20" w:line="240" w:lineRule="auto"/>
+            </w:pPr>
+            <w:r>
+              <w:rPr>
+                <w:b w:val="0"/>
+                <w:sz w:val="19"/>
+              </w:rPr>
+              <w:t>C05 severity routing and C08 in-app queue notice under C04 transaction.</w:t>
+            </w:r>
+          </w:p>
+        </w:tc>
+        <w:tc>
+          <w:tcPr>
+            <w:tcW w:type="dxa" w:w="1728"/>
+            <w:vAlign w:val="center"/>
+            <w:shd w:fill="FFFFFF"/>
+            <w:tcMar>
+              <w:top w:w="75" w:type="dxa"/>
+              <w:bottom w:w="75" w:type="dxa"/>
+              <w:left w:w="100" w:type="dxa"/>
+              <w:right w:w="100" w:type="dxa"/>
+            </w:tcMar>
+            <w:tcBorders>
+              <w:top w:val="single" w:sz="4" w:color="D9D9D9"/>
+              <w:bottom w:val="single" w:sz="4" w:color="D9D9D9"/>
+              <w:left w:val="single" w:sz="4" w:color="D9D9D9"/>
+              <w:right w:val="single" w:sz="4" w:color="D9D9D9"/>
+            </w:tcBorders>
+          </w:tcPr>
+          <w:p>
+            <w:pPr>
+              <w:spacing w:after="20" w:line="240" w:lineRule="auto"/>
+            </w:pPr>
+            <w:r>
+              <w:rPr>
+                <w:b w:val="0"/>
+                <w:sz w:val="19"/>
+              </w:rPr>
+              <w:t>3 3; 3 4 1</w:t>
+            </w:r>
+          </w:p>
+        </w:tc>
+      </w:tr>
+      <w:tr>
+        <w:trPr>
+          <w:cantSplit/>
+        </w:trPr>
+        <w:tc>
+          <w:tcPr>
+            <w:tcW w:type="dxa" w:w="2275"/>
+            <w:vAlign w:val="center"/>
+            <w:shd w:fill="FFFFFF"/>
+            <w:tcMar>
+              <w:top w:w="75" w:type="dxa"/>
+              <w:bottom w:w="75" w:type="dxa"/>
+              <w:left w:w="100" w:type="dxa"/>
+              <w:right w:w="100" w:type="dxa"/>
+            </w:tcMar>
+            <w:tcBorders>
+              <w:top w:val="single" w:sz="4" w:color="D9D9D9"/>
+              <w:bottom w:val="single" w:sz="4" w:color="D9D9D9"/>
+              <w:left w:val="single" w:sz="4" w:color="D9D9D9"/>
+              <w:right w:val="single" w:sz="4" w:color="D9D9D9"/>
+            </w:tcBorders>
+          </w:tcPr>
+          <w:p>
+            <w:pPr>
+              <w:spacing w:after="20" w:line="240" w:lineRule="auto"/>
+            </w:pPr>
+            <w:r>
+              <w:rPr>
+                <w:b w:val="0"/>
+                <w:sz w:val="19"/>
+              </w:rPr>
+              <w:t>REQ-4.1 to REQ-4.4</w:t>
+            </w:r>
+          </w:p>
+        </w:tc>
+        <w:tc>
+          <w:tcPr>
+            <w:tcW w:type="dxa" w:w="6077"/>
+            <w:vAlign w:val="center"/>
+            <w:shd w:fill="FFFFFF"/>
+            <w:tcMar>
+              <w:top w:w="75" w:type="dxa"/>
+              <w:bottom w:w="75" w:type="dxa"/>
+              <w:left w:w="100" w:type="dxa"/>
+              <w:right w:w="100" w:type="dxa"/>
+            </w:tcMar>
+            <w:tcBorders>
+              <w:top w:val="single" w:sz="4" w:color="D9D9D9"/>
+              <w:bottom w:val="single" w:sz="4" w:color="D9D9D9"/>
+              <w:left w:val="single" w:sz="4" w:color="D9D9D9"/>
+              <w:right w:val="single" w:sz="4" w:color="D9D9D9"/>
+            </w:tcBorders>
+          </w:tcPr>
+          <w:p>
+            <w:pPr>
+              <w:spacing w:after="20" w:line="240" w:lineRule="auto"/>
+            </w:pPr>
+            <w:r>
+              <w:rPr>
+                <w:b w:val="0"/>
+                <w:sz w:val="19"/>
+              </w:rPr>
+              <w:t>C03 assignment checks; C04 required remarks/reason; C05 next-level and L3 ceiling.</w:t>
+            </w:r>
+          </w:p>
+        </w:tc>
+        <w:tc>
+          <w:tcPr>
+            <w:tcW w:type="dxa" w:w="1728"/>
+            <w:vAlign w:val="center"/>
+            <w:shd w:fill="FFFFFF"/>
+            <w:tcMar>
+              <w:top w:w="75" w:type="dxa"/>
+              <w:bottom w:w="75" w:type="dxa"/>
+              <w:left w:w="100" w:type="dxa"/>
+              <w:right w:w="100" w:type="dxa"/>
+            </w:tcMar>
+            <w:tcBorders>
+              <w:top w:val="single" w:sz="4" w:color="D9D9D9"/>
+              <w:bottom w:val="single" w:sz="4" w:color="D9D9D9"/>
+              <w:left w:val="single" w:sz="4" w:color="D9D9D9"/>
+              <w:right w:val="single" w:sz="4" w:color="D9D9D9"/>
+            </w:tcBorders>
+          </w:tcPr>
+          <w:p>
+            <w:pPr>
+              <w:spacing w:after="20" w:line="240" w:lineRule="auto"/>
+            </w:pPr>
+            <w:r>
+              <w:rPr>
+                <w:b w:val="0"/>
+                <w:sz w:val="19"/>
+              </w:rPr>
+              <w:t>3 4 2; 3 8</w:t>
+            </w:r>
+          </w:p>
+        </w:tc>
+      </w:tr>
+      <w:tr>
+        <w:trPr>
+          <w:cantSplit/>
+        </w:trPr>
+        <w:tc>
+          <w:tcPr>
+            <w:tcW w:type="dxa" w:w="2275"/>
+            <w:vAlign w:val="center"/>
+            <w:shd w:fill="FFFFFF"/>
+            <w:tcMar>
+              <w:top w:w="75" w:type="dxa"/>
+              <w:bottom w:w="75" w:type="dxa"/>
+              <w:left w:w="100" w:type="dxa"/>
+              <w:right w:w="100" w:type="dxa"/>
+            </w:tcMar>
+            <w:tcBorders>
+              <w:top w:val="single" w:sz="4" w:color="D9D9D9"/>
+              <w:bottom w:val="single" w:sz="4" w:color="D9D9D9"/>
+              <w:left w:val="single" w:sz="4" w:color="D9D9D9"/>
+              <w:right w:val="single" w:sz="4" w:color="D9D9D9"/>
+            </w:tcBorders>
+          </w:tcPr>
+          <w:p>
+            <w:pPr>
+              <w:spacing w:after="20" w:line="240" w:lineRule="auto"/>
+            </w:pPr>
+            <w:r>
+              <w:rPr>
+                <w:b w:val="0"/>
+                <w:sz w:val="19"/>
+              </w:rPr>
+              <w:t>REQ-5.1 to REQ-5.4</w:t>
+            </w:r>
+          </w:p>
+        </w:tc>
+        <w:tc>
+          <w:tcPr>
+            <w:tcW w:type="dxa" w:w="6077"/>
+            <w:vAlign w:val="center"/>
+            <w:shd w:fill="FFFFFF"/>
+            <w:tcMar>
+              <w:top w:w="75" w:type="dxa"/>
+              <w:bottom w:w="75" w:type="dxa"/>
+              <w:left w:w="100" w:type="dxa"/>
+              <w:right w:w="100" w:type="dxa"/>
+            </w:tcMar>
+            <w:tcBorders>
+              <w:top w:val="single" w:sz="4" w:color="D9D9D9"/>
+              <w:bottom w:val="single" w:sz="4" w:color="D9D9D9"/>
+              <w:left w:val="single" w:sz="4" w:color="D9D9D9"/>
+              <w:right w:val="single" w:sz="4" w:color="D9D9D9"/>
+            </w:tcBorders>
+          </w:tcPr>
+          <w:p>
+            <w:pPr>
+              <w:spacing w:after="20" w:line="240" w:lineRule="auto"/>
+            </w:pPr>
+            <w:r>
+              <w:rPr>
+                <w:b w:val="0"/>
+                <w:sz w:val="19"/>
+              </w:rPr>
+              <w:t>C04 eligible single appeal; C05 target; C09 uniqueness and final-review flag.</w:t>
+            </w:r>
+          </w:p>
+        </w:tc>
+        <w:tc>
+          <w:tcPr>
+            <w:tcW w:type="dxa" w:w="1728"/>
+            <w:vAlign w:val="center"/>
+            <w:shd w:fill="FFFFFF"/>
+            <w:tcMar>
+              <w:top w:w="75" w:type="dxa"/>
+              <w:bottom w:w="75" w:type="dxa"/>
+              <w:left w:w="100" w:type="dxa"/>
+              <w:right w:w="100" w:type="dxa"/>
+            </w:tcMar>
+            <w:tcBorders>
+              <w:top w:val="single" w:sz="4" w:color="D9D9D9"/>
+              <w:bottom w:val="single" w:sz="4" w:color="D9D9D9"/>
+              <w:left w:val="single" w:sz="4" w:color="D9D9D9"/>
+              <w:right w:val="single" w:sz="4" w:color="D9D9D9"/>
+            </w:tcBorders>
+          </w:tcPr>
+          <w:p>
+            <w:pPr>
+              <w:spacing w:after="20" w:line="240" w:lineRule="auto"/>
+            </w:pPr>
+            <w:r>
+              <w:rPr>
+                <w:b w:val="0"/>
+                <w:sz w:val="19"/>
+              </w:rPr>
+              <w:t>3 4 2; 3 8</w:t>
+            </w:r>
+          </w:p>
+        </w:tc>
+      </w:tr>
+      <w:tr>
+        <w:trPr>
+          <w:cantSplit/>
+        </w:trPr>
+        <w:tc>
+          <w:tcPr>
+            <w:tcW w:type="dxa" w:w="2275"/>
+            <w:vAlign w:val="center"/>
+            <w:shd w:fill="FFFFFF"/>
+            <w:tcMar>
+              <w:top w:w="75" w:type="dxa"/>
+              <w:bottom w:w="75" w:type="dxa"/>
+              <w:left w:w="100" w:type="dxa"/>
+              <w:right w:w="100" w:type="dxa"/>
+            </w:tcMar>
+            <w:tcBorders>
+              <w:top w:val="single" w:sz="4" w:color="D9D9D9"/>
+              <w:bottom w:val="single" w:sz="4" w:color="D9D9D9"/>
+              <w:left w:val="single" w:sz="4" w:color="D9D9D9"/>
+              <w:right w:val="single" w:sz="4" w:color="D9D9D9"/>
+            </w:tcBorders>
+          </w:tcPr>
+          <w:p>
+            <w:pPr>
+              <w:spacing w:after="20" w:line="240" w:lineRule="auto"/>
+            </w:pPr>
+            <w:r>
+              <w:rPr>
+                <w:b w:val="0"/>
+                <w:sz w:val="19"/>
+              </w:rPr>
+              <w:t>REQ-6.1 to REQ-6.3</w:t>
+            </w:r>
+          </w:p>
+        </w:tc>
+        <w:tc>
+          <w:tcPr>
+            <w:tcW w:type="dxa" w:w="6077"/>
+            <w:vAlign w:val="center"/>
+            <w:shd w:fill="FFFFFF"/>
+            <w:tcMar>
+              <w:top w:w="75" w:type="dxa"/>
+              <w:bottom w:w="75" w:type="dxa"/>
+              <w:left w:w="100" w:type="dxa"/>
+              <w:right w:w="100" w:type="dxa"/>
+            </w:tcMar>
+            <w:tcBorders>
+              <w:top w:val="single" w:sz="4" w:color="D9D9D9"/>
+              <w:bottom w:val="single" w:sz="4" w:color="D9D9D9"/>
+              <w:left w:val="single" w:sz="4" w:color="D9D9D9"/>
+              <w:right w:val="single" w:sz="4" w:color="D9D9D9"/>
+            </w:tcBorders>
+          </w:tcPr>
+          <w:p>
+            <w:pPr>
+              <w:spacing w:after="20" w:line="240" w:lineRule="auto"/>
+            </w:pPr>
+            <w:r>
+              <w:rPr>
+                <w:b w:val="0"/>
+                <w:sz w:val="19"/>
+              </w:rPr>
+              <w:t>C06 immutable history, C03 owner/historic-handler visibility and C09 protections.</w:t>
+            </w:r>
+          </w:p>
+        </w:tc>
+        <w:tc>
+          <w:tcPr>
+            <w:tcW w:type="dxa" w:w="1728"/>
+            <w:vAlign w:val="center"/>
+            <w:shd w:fill="FFFFFF"/>
+            <w:tcMar>
+              <w:top w:w="75" w:type="dxa"/>
+              <w:bottom w:w="75" w:type="dxa"/>
+              <w:left w:w="100" w:type="dxa"/>
+              <w:right w:w="100" w:type="dxa"/>
+            </w:tcMar>
+            <w:tcBorders>
+              <w:top w:val="single" w:sz="4" w:color="D9D9D9"/>
+              <w:bottom w:val="single" w:sz="4" w:color="D9D9D9"/>
+              <w:left w:val="single" w:sz="4" w:color="D9D9D9"/>
+              <w:right w:val="single" w:sz="4" w:color="D9D9D9"/>
+            </w:tcBorders>
+          </w:tcPr>
+          <w:p>
+            <w:pPr>
+              <w:spacing w:after="20" w:line="240" w:lineRule="auto"/>
+            </w:pPr>
+            <w:r>
+              <w:rPr>
+                <w:b w:val="0"/>
+                <w:sz w:val="19"/>
+              </w:rPr>
+              <w:t>3 4 3; 3 7 3; 3 9</w:t>
+            </w:r>
+          </w:p>
+        </w:tc>
+      </w:tr>
+      <w:tr>
+        <w:trPr>
+          <w:cantSplit/>
+        </w:trPr>
+        <w:tc>
+          <w:tcPr>
+            <w:tcW w:type="dxa" w:w="2275"/>
+            <w:vAlign w:val="center"/>
+            <w:shd w:fill="FFFFFF"/>
+            <w:tcMar>
+              <w:top w:w="75" w:type="dxa"/>
+              <w:bottom w:w="75" w:type="dxa"/>
+              <w:left w:w="100" w:type="dxa"/>
+              <w:right w:w="100" w:type="dxa"/>
+            </w:tcMar>
+            <w:tcBorders>
+              <w:top w:val="single" w:sz="4" w:color="D9D9D9"/>
+              <w:bottom w:val="single" w:sz="4" w:color="D9D9D9"/>
+              <w:left w:val="single" w:sz="4" w:color="D9D9D9"/>
+              <w:right w:val="single" w:sz="4" w:color="D9D9D9"/>
+            </w:tcBorders>
+          </w:tcPr>
+          <w:p>
+            <w:pPr>
+              <w:spacing w:after="20" w:line="240" w:lineRule="auto"/>
+            </w:pPr>
+            <w:r>
+              <w:rPr>
+                <w:b w:val="0"/>
+                <w:sz w:val="19"/>
+              </w:rPr>
+              <w:t>REQ-7.1 to REQ-7.3</w:t>
+            </w:r>
+          </w:p>
+        </w:tc>
+        <w:tc>
+          <w:tcPr>
+            <w:tcW w:type="dxa" w:w="6077"/>
+            <w:vAlign w:val="center"/>
+            <w:shd w:fill="FFFFFF"/>
+            <w:tcMar>
+              <w:top w:w="75" w:type="dxa"/>
+              <w:bottom w:w="75" w:type="dxa"/>
+              <w:left w:w="100" w:type="dxa"/>
+              <w:right w:w="100" w:type="dxa"/>
+            </w:tcMar>
+            <w:tcBorders>
+              <w:top w:val="single" w:sz="4" w:color="D9D9D9"/>
+              <w:bottom w:val="single" w:sz="4" w:color="D9D9D9"/>
+              <w:left w:val="single" w:sz="4" w:color="D9D9D9"/>
+              <w:right w:val="single" w:sz="4" w:color="D9D9D9"/>
+            </w:tcBorders>
+          </w:tcPr>
+          <w:p>
+            <w:pPr>
+              <w:spacing w:after="20" w:line="240" w:lineRule="auto"/>
+            </w:pPr>
+            <w:r>
+              <w:rPr>
+                <w:b w:val="0"/>
+                <w:sz w:val="19"/>
+              </w:rPr>
+              <w:t>C08/C03 own-student, current-queue and reached-L3 dashboard projections.</w:t>
+            </w:r>
+          </w:p>
+        </w:tc>
+        <w:tc>
+          <w:tcPr>
+            <w:tcW w:type="dxa" w:w="1728"/>
+            <w:vAlign w:val="center"/>
+            <w:shd w:fill="FFFFFF"/>
+            <w:tcMar>
+              <w:top w:w="75" w:type="dxa"/>
+              <w:bottom w:w="75" w:type="dxa"/>
+              <w:left w:w="100" w:type="dxa"/>
+              <w:right w:w="100" w:type="dxa"/>
+            </w:tcMar>
+            <w:tcBorders>
+              <w:top w:val="single" w:sz="4" w:color="D9D9D9"/>
+              <w:bottom w:val="single" w:sz="4" w:color="D9D9D9"/>
+              <w:left w:val="single" w:sz="4" w:color="D9D9D9"/>
+              <w:right w:val="single" w:sz="4" w:color="D9D9D9"/>
+            </w:tcBorders>
+          </w:tcPr>
+          <w:p>
+            <w:pPr>
+              <w:spacing w:after="20" w:line="240" w:lineRule="auto"/>
+            </w:pPr>
+            <w:r>
+              <w:rPr>
+                <w:b w:val="0"/>
+                <w:sz w:val="19"/>
+              </w:rPr>
+              <w:t>3 4 3; 3 9</w:t>
+            </w:r>
+          </w:p>
+        </w:tc>
+      </w:tr>
+      <w:tr>
+        <w:trPr>
+          <w:cantSplit/>
+        </w:trPr>
+        <w:tc>
+          <w:tcPr>
+            <w:tcW w:type="dxa" w:w="2275"/>
+            <w:vAlign w:val="center"/>
+            <w:shd w:fill="FFFFFF"/>
+            <w:tcMar>
+              <w:top w:w="75" w:type="dxa"/>
+              <w:bottom w:w="75" w:type="dxa"/>
+              <w:left w:w="100" w:type="dxa"/>
+              <w:right w:w="100" w:type="dxa"/>
+            </w:tcMar>
+            <w:tcBorders>
+              <w:top w:val="single" w:sz="4" w:color="D9D9D9"/>
+              <w:bottom w:val="single" w:sz="4" w:color="D9D9D9"/>
+              <w:left w:val="single" w:sz="4" w:color="D9D9D9"/>
+              <w:right w:val="single" w:sz="4" w:color="D9D9D9"/>
+            </w:tcBorders>
+          </w:tcPr>
+          <w:p>
+            <w:pPr>
+              <w:spacing w:after="20" w:line="240" w:lineRule="auto"/>
+            </w:pPr>
+            <w:r>
+              <w:rPr>
+                <w:b w:val="0"/>
+                <w:sz w:val="19"/>
+              </w:rPr>
+              <w:t>REQ-8.1 to REQ-8.2</w:t>
+            </w:r>
+          </w:p>
+        </w:tc>
+        <w:tc>
+          <w:tcPr>
+            <w:tcW w:type="dxa" w:w="6077"/>
+            <w:vAlign w:val="center"/>
+            <w:shd w:fill="FFFFFF"/>
+            <w:tcMar>
+              <w:top w:w="75" w:type="dxa"/>
+              <w:bottom w:w="75" w:type="dxa"/>
+              <w:left w:w="100" w:type="dxa"/>
+              <w:right w:w="100" w:type="dxa"/>
+            </w:tcMar>
+            <w:tcBorders>
+              <w:top w:val="single" w:sz="4" w:color="D9D9D9"/>
+              <w:bottom w:val="single" w:sz="4" w:color="D9D9D9"/>
+              <w:left w:val="single" w:sz="4" w:color="D9D9D9"/>
+              <w:right w:val="single" w:sz="4" w:color="D9D9D9"/>
+            </w:tcBorders>
+          </w:tcPr>
+          <w:p>
+            <w:pPr>
+              <w:spacing w:after="20" w:line="240" w:lineRule="auto"/>
+            </w:pPr>
+            <w:r>
+              <w:rPr>
+                <w:b w:val="0"/>
+                <w:sz w:val="19"/>
+              </w:rPr>
+              <w:t>C08 manual threshold review; C04/C05 scoped escalation. Open policy decision in 3 11.</w:t>
+            </w:r>
+          </w:p>
+        </w:tc>
+        <w:tc>
+          <w:tcPr>
+            <w:tcW w:type="dxa" w:w="1728"/>
+            <w:vAlign w:val="center"/>
+            <w:shd w:fill="FFFFFF"/>
+            <w:tcMar>
+              <w:top w:w="75" w:type="dxa"/>
+              <w:bottom w:w="75" w:type="dxa"/>
+              <w:left w:w="100" w:type="dxa"/>
+              <w:right w:w="100" w:type="dxa"/>
+            </w:tcMar>
+            <w:tcBorders>
+              <w:top w:val="single" w:sz="4" w:color="D9D9D9"/>
+              <w:bottom w:val="single" w:sz="4" w:color="D9D9D9"/>
+              <w:left w:val="single" w:sz="4" w:color="D9D9D9"/>
+              <w:right w:val="single" w:sz="4" w:color="D9D9D9"/>
+            </w:tcBorders>
+          </w:tcPr>
+          <w:p>
+            <w:pPr>
+              <w:spacing w:after="20" w:line="240" w:lineRule="auto"/>
+            </w:pPr>
+            <w:r>
+              <w:rPr>
+                <w:b w:val="0"/>
+                <w:sz w:val="19"/>
+              </w:rPr>
+              <w:t>3 4 4; 3 8; 3 11</w:t>
+            </w:r>
+          </w:p>
+        </w:tc>
+      </w:tr>
+      <w:tr>
+        <w:trPr>
+          <w:cantSplit/>
+        </w:trPr>
+        <w:tc>
+          <w:tcPr>
+            <w:tcW w:type="dxa" w:w="2275"/>
+            <w:vAlign w:val="center"/>
+            <w:shd w:fill="FFFFFF"/>
+            <w:tcMar>
+              <w:top w:w="75" w:type="dxa"/>
+              <w:bottom w:w="75" w:type="dxa"/>
+              <w:left w:w="100" w:type="dxa"/>
+              <w:right w:w="100" w:type="dxa"/>
+            </w:tcMar>
+            <w:tcBorders>
+              <w:top w:val="single" w:sz="4" w:color="D9D9D9"/>
+              <w:bottom w:val="single" w:sz="4" w:color="D9D9D9"/>
+              <w:left w:val="single" w:sz="4" w:color="D9D9D9"/>
+              <w:right w:val="single" w:sz="4" w:color="D9D9D9"/>
+            </w:tcBorders>
+          </w:tcPr>
+          <w:p>
+            <w:pPr>
+              <w:spacing w:after="20" w:line="240" w:lineRule="auto"/>
+            </w:pPr>
+            <w:r>
+              <w:rPr>
+                <w:b w:val="0"/>
+                <w:sz w:val="19"/>
+              </w:rPr>
+              <w:t>REQ-9.1 to REQ-9.2</w:t>
+            </w:r>
+          </w:p>
+        </w:tc>
+        <w:tc>
+          <w:tcPr>
+            <w:tcW w:type="dxa" w:w="6077"/>
+            <w:vAlign w:val="center"/>
+            <w:shd w:fill="FFFFFF"/>
+            <w:tcMar>
+              <w:top w:w="75" w:type="dxa"/>
+              <w:bottom w:w="75" w:type="dxa"/>
+              <w:left w:w="100" w:type="dxa"/>
+              <w:right w:w="100" w:type="dxa"/>
+            </w:tcMar>
+            <w:tcBorders>
+              <w:top w:val="single" w:sz="4" w:color="D9D9D9"/>
+              <w:bottom w:val="single" w:sz="4" w:color="D9D9D9"/>
+              <w:left w:val="single" w:sz="4" w:color="D9D9D9"/>
+              <w:right w:val="single" w:sz="4" w:color="D9D9D9"/>
+            </w:tcBorders>
+          </w:tcPr>
+          <w:p>
+            <w:pPr>
+              <w:spacing w:after="20" w:line="240" w:lineRule="auto"/>
+            </w:pPr>
+            <w:r>
+              <w:rPr>
+                <w:b w:val="0"/>
+                <w:sz w:val="19"/>
+              </w:rPr>
+              <w:t>C07 resolved-owner prompt and handler projection without student identity.</w:t>
+            </w:r>
+          </w:p>
+        </w:tc>
+        <w:tc>
+          <w:tcPr>
+            <w:tcW w:type="dxa" w:w="1728"/>
+            <w:vAlign w:val="center"/>
+            <w:shd w:fill="FFFFFF"/>
+            <w:tcMar>
+              <w:top w:w="75" w:type="dxa"/>
+              <w:bottom w:w="75" w:type="dxa"/>
+              <w:left w:w="100" w:type="dxa"/>
+              <w:right w:w="100" w:type="dxa"/>
+            </w:tcMar>
+            <w:tcBorders>
+              <w:top w:val="single" w:sz="4" w:color="D9D9D9"/>
+              <w:bottom w:val="single" w:sz="4" w:color="D9D9D9"/>
+              <w:left w:val="single" w:sz="4" w:color="D9D9D9"/>
+              <w:right w:val="single" w:sz="4" w:color="D9D9D9"/>
+            </w:tcBorders>
+          </w:tcPr>
+          <w:p>
+            <w:pPr>
+              <w:spacing w:after="20" w:line="240" w:lineRule="auto"/>
+            </w:pPr>
+            <w:r>
+              <w:rPr>
+                <w:b w:val="0"/>
+                <w:sz w:val="19"/>
+              </w:rPr>
+              <w:t>3 4 3; 3 6; 3 9</w:t>
+            </w:r>
+          </w:p>
+        </w:tc>
+      </w:tr>
+    </w:tbl>
+    <w:p>
+      <w:pPr>
+        <w:spacing w:after="0"/>
+      </w:pPr>
+    </w:p>
+    <w:p>
+      <w:pPr>
+        <w:pStyle w:val="Heading2"/>
+      </w:pPr>
+      <w:r>
+        <w:t>3 10 1 Security and business rule mapping</w:t>
+      </w:r>
+    </w:p>
+    <w:tbl>
+      <w:tblPr>
+        <w:tblW w:type="auto" w:w="0"/>
+        <w:tblLayout w:type="fixed"/>
+        <w:tblLook w:firstColumn="1" w:firstRow="1" w:lastColumn="0" w:lastRow="0" w:noHBand="0" w:noVBand="1" w:val="04A0"/>
+      </w:tblPr>
+      <w:tblGrid>
+        <w:gridCol w:w="2304"/>
+        <w:gridCol w:w="7776"/>
+      </w:tblGrid>
+      <w:tr>
+        <w:trPr>
+          <w:cantSplit/>
+          <w:tblHeader/>
+        </w:trPr>
+        <w:tc>
+          <w:tcPr>
+            <w:tcW w:type="dxa" w:w="2304"/>
+            <w:vAlign w:val="center"/>
+            <w:shd w:fill="E6EDF3"/>
+            <w:tcMar>
+              <w:top w:w="75" w:type="dxa"/>
+              <w:bottom w:w="75" w:type="dxa"/>
+              <w:left w:w="100" w:type="dxa"/>
+              <w:right w:w="100" w:type="dxa"/>
+            </w:tcMar>
+            <w:tcBorders>
+              <w:top w:val="single" w:sz="4" w:color="D9D9D9"/>
+              <w:bottom w:val="single" w:sz="4" w:color="D9D9D9"/>
+              <w:left w:val="single" w:sz="4" w:color="D9D9D9"/>
+              <w:right w:val="single" w:sz="4" w:color="D9D9D9"/>
+            </w:tcBorders>
+          </w:tcPr>
+          <w:p>
+            <w:pPr>
+              <w:spacing w:after="20" w:line="240" w:lineRule="auto"/>
+            </w:pPr>
+            <w:r>
+              <w:rPr>
+                <w:b/>
+                <w:sz w:val="19"/>
+              </w:rPr>
+              <w:t>SRS IDs</w:t>
+            </w:r>
+          </w:p>
+        </w:tc>
+        <w:tc>
+          <w:tcPr>
+            <w:tcW w:type="dxa" w:w="7776"/>
+            <w:vAlign w:val="center"/>
+            <w:shd w:fill="E6EDF3"/>
+            <w:tcMar>
+              <w:top w:w="75" w:type="dxa"/>
+              <w:bottom w:w="75" w:type="dxa"/>
+              <w:left w:w="100" w:type="dxa"/>
+              <w:right w:w="100" w:type="dxa"/>
+            </w:tcMar>
+            <w:tcBorders>
+              <w:top w:val="single" w:sz="4" w:color="D9D9D9"/>
+              <w:bottom w:val="single" w:sz="4" w:color="D9D9D9"/>
+              <w:left w:val="single" w:sz="4" w:color="D9D9D9"/>
+              <w:right w:val="single" w:sz="4" w:color="D9D9D9"/>
+            </w:tcBorders>
+          </w:tcPr>
+          <w:p>
+            <w:pPr>
+              <w:spacing w:after="20" w:line="240" w:lineRule="auto"/>
+            </w:pPr>
+            <w:r>
+              <w:rPr>
+                <w:b/>
+                <w:sz w:val="19"/>
+              </w:rPr>
+              <w:t>Component and architectural control</w:t>
+            </w:r>
+          </w:p>
+        </w:tc>
+      </w:tr>
+      <w:tr>
+        <w:trPr>
+          <w:cantSplit/>
+        </w:trPr>
+        <w:tc>
+          <w:tcPr>
+            <w:tcW w:type="dxa" w:w="2304"/>
+            <w:vAlign w:val="center"/>
+            <w:shd w:fill="FFFFFF"/>
+            <w:tcMar>
+              <w:top w:w="75" w:type="dxa"/>
+              <w:bottom w:w="75" w:type="dxa"/>
+              <w:left w:w="100" w:type="dxa"/>
+              <w:right w:w="100" w:type="dxa"/>
+            </w:tcMar>
+            <w:tcBorders>
+              <w:top w:val="single" w:sz="4" w:color="D9D9D9"/>
+              <w:bottom w:val="single" w:sz="4" w:color="D9D9D9"/>
+              <w:left w:val="single" w:sz="4" w:color="D9D9D9"/>
+              <w:right w:val="single" w:sz="4" w:color="D9D9D9"/>
+            </w:tcBorders>
+          </w:tcPr>
+          <w:p>
+            <w:pPr>
+              <w:spacing w:after="20" w:line="240" w:lineRule="auto"/>
+            </w:pPr>
+            <w:r>
+              <w:rPr>
+                <w:b w:val="0"/>
+                <w:sz w:val="19"/>
+              </w:rPr>
+              <w:t>SEC-01; SEC-04</w:t>
+            </w:r>
+          </w:p>
+        </w:tc>
+        <w:tc>
+          <w:tcPr>
+            <w:tcW w:type="dxa" w:w="7776"/>
+            <w:vAlign w:val="center"/>
+            <w:shd w:fill="FFFFFF"/>
+            <w:tcMar>
+              <w:top w:w="75" w:type="dxa"/>
+              <w:bottom w:w="75" w:type="dxa"/>
+              <w:left w:w="100" w:type="dxa"/>
+              <w:right w:w="100" w:type="dxa"/>
+            </w:tcMar>
+            <w:tcBorders>
+              <w:top w:val="single" w:sz="4" w:color="D9D9D9"/>
+              <w:bottom w:val="single" w:sz="4" w:color="D9D9D9"/>
+              <w:left w:val="single" w:sz="4" w:color="D9D9D9"/>
+              <w:right w:val="single" w:sz="4" w:color="D9D9D9"/>
+            </w:tcBorders>
+          </w:tcPr>
+          <w:p>
+            <w:pPr>
+              <w:spacing w:after="20" w:line="240" w:lineRule="auto"/>
+            </w:pPr>
+            <w:r>
+              <w:rPr>
+                <w:b w:val="0"/>
+                <w:sz w:val="19"/>
+              </w:rPr>
+              <w:t>C03 real password hashing and generic failed-login response; Section 3 9 1.</w:t>
+            </w:r>
+          </w:p>
+        </w:tc>
+      </w:tr>
+      <w:tr>
+        <w:trPr>
+          <w:cantSplit/>
+        </w:trPr>
+        <w:tc>
+          <w:tcPr>
+            <w:tcW w:type="dxa" w:w="2304"/>
+            <w:vAlign w:val="center"/>
+            <w:shd w:fill="FFFFFF"/>
+            <w:tcMar>
+              <w:top w:w="75" w:type="dxa"/>
+              <w:bottom w:w="75" w:type="dxa"/>
+              <w:left w:w="100" w:type="dxa"/>
+              <w:right w:w="100" w:type="dxa"/>
+            </w:tcMar>
+            <w:tcBorders>
+              <w:top w:val="single" w:sz="4" w:color="D9D9D9"/>
+              <w:bottom w:val="single" w:sz="4" w:color="D9D9D9"/>
+              <w:left w:val="single" w:sz="4" w:color="D9D9D9"/>
+              <w:right w:val="single" w:sz="4" w:color="D9D9D9"/>
+            </w:tcBorders>
+          </w:tcPr>
+          <w:p>
+            <w:pPr>
+              <w:spacing w:after="20" w:line="240" w:lineRule="auto"/>
+            </w:pPr>
+            <w:r>
+              <w:rPr>
+                <w:b w:val="0"/>
+                <w:sz w:val="19"/>
+              </w:rPr>
+              <w:t>SEC-02; SO-01</w:t>
+            </w:r>
+          </w:p>
+        </w:tc>
+        <w:tc>
+          <w:tcPr>
+            <w:tcW w:type="dxa" w:w="7776"/>
+            <w:vAlign w:val="center"/>
+            <w:shd w:fill="FFFFFF"/>
+            <w:tcMar>
+              <w:top w:w="75" w:type="dxa"/>
+              <w:bottom w:w="75" w:type="dxa"/>
+              <w:left w:w="100" w:type="dxa"/>
+              <w:right w:w="100" w:type="dxa"/>
+            </w:tcMar>
+            <w:tcBorders>
+              <w:top w:val="single" w:sz="4" w:color="D9D9D9"/>
+              <w:bottom w:val="single" w:sz="4" w:color="D9D9D9"/>
+              <w:left w:val="single" w:sz="4" w:color="D9D9D9"/>
+              <w:right w:val="single" w:sz="4" w:color="D9D9D9"/>
+            </w:tcBorders>
+          </w:tcPr>
+          <w:p>
+            <w:pPr>
+              <w:spacing w:after="20" w:line="240" w:lineRule="auto"/>
+            </w:pPr>
+            <w:r>
+              <w:rPr>
+                <w:b w:val="0"/>
+                <w:sz w:val="19"/>
+              </w:rPr>
+              <w:t>C03 server authorization, C02 browser boundary and private C09 store; Section 3 9.</w:t>
+            </w:r>
+          </w:p>
+        </w:tc>
+      </w:tr>
+      <w:tr>
+        <w:trPr>
+          <w:cantSplit/>
+        </w:trPr>
+        <w:tc>
+          <w:tcPr>
+            <w:tcW w:type="dxa" w:w="2304"/>
+            <w:vAlign w:val="center"/>
+            <w:shd w:fill="FFFFFF"/>
+            <w:tcMar>
+              <w:top w:w="75" w:type="dxa"/>
+              <w:bottom w:w="75" w:type="dxa"/>
+              <w:left w:w="100" w:type="dxa"/>
+              <w:right w:w="100" w:type="dxa"/>
+            </w:tcMar>
+            <w:tcBorders>
+              <w:top w:val="single" w:sz="4" w:color="D9D9D9"/>
+              <w:bottom w:val="single" w:sz="4" w:color="D9D9D9"/>
+              <w:left w:val="single" w:sz="4" w:color="D9D9D9"/>
+              <w:right w:val="single" w:sz="4" w:color="D9D9D9"/>
+            </w:tcBorders>
+          </w:tcPr>
+          <w:p>
+            <w:pPr>
+              <w:spacing w:after="20" w:line="240" w:lineRule="auto"/>
+            </w:pPr>
+            <w:r>
+              <w:rPr>
+                <w:b w:val="0"/>
+                <w:sz w:val="19"/>
+              </w:rPr>
+              <w:t>SEC-03; SO-02</w:t>
+            </w:r>
+          </w:p>
+        </w:tc>
+        <w:tc>
+          <w:tcPr>
+            <w:tcW w:type="dxa" w:w="7776"/>
+            <w:vAlign w:val="center"/>
+            <w:shd w:fill="FFFFFF"/>
+            <w:tcMar>
+              <w:top w:w="75" w:type="dxa"/>
+              <w:bottom w:w="75" w:type="dxa"/>
+              <w:left w:w="100" w:type="dxa"/>
+              <w:right w:w="100" w:type="dxa"/>
+            </w:tcMar>
+            <w:tcBorders>
+              <w:top w:val="single" w:sz="4" w:color="D9D9D9"/>
+              <w:bottom w:val="single" w:sz="4" w:color="D9D9D9"/>
+              <w:left w:val="single" w:sz="4" w:color="D9D9D9"/>
+              <w:right w:val="single" w:sz="4" w:color="D9D9D9"/>
+            </w:tcBorders>
+          </w:tcPr>
+          <w:p>
+            <w:pPr>
+              <w:spacing w:after="20" w:line="240" w:lineRule="auto"/>
+            </w:pPr>
+            <w:r>
+              <w:rPr>
+                <w:b w:val="0"/>
+                <w:sz w:val="19"/>
+              </w:rPr>
+              <w:t>C04 atomic state/history and C06 immutable audit; Sections 3 7 3 and 3 8.</w:t>
+            </w:r>
+          </w:p>
+        </w:tc>
+      </w:tr>
+      <w:tr>
+        <w:trPr>
+          <w:cantSplit/>
+        </w:trPr>
+        <w:tc>
+          <w:tcPr>
+            <w:tcW w:type="dxa" w:w="2304"/>
+            <w:vAlign w:val="center"/>
+            <w:shd w:fill="FFFFFF"/>
+            <w:tcMar>
+              <w:top w:w="75" w:type="dxa"/>
+              <w:bottom w:w="75" w:type="dxa"/>
+              <w:left w:w="100" w:type="dxa"/>
+              <w:right w:w="100" w:type="dxa"/>
+            </w:tcMar>
+            <w:tcBorders>
+              <w:top w:val="single" w:sz="4" w:color="D9D9D9"/>
+              <w:bottom w:val="single" w:sz="4" w:color="D9D9D9"/>
+              <w:left w:val="single" w:sz="4" w:color="D9D9D9"/>
+              <w:right w:val="single" w:sz="4" w:color="D9D9D9"/>
+            </w:tcBorders>
+          </w:tcPr>
+          <w:p>
+            <w:pPr>
+              <w:spacing w:after="20" w:line="240" w:lineRule="auto"/>
+            </w:pPr>
+            <w:r>
+              <w:rPr>
+                <w:b w:val="0"/>
+                <w:sz w:val="19"/>
+              </w:rPr>
+              <w:t>BR-01 to BR-03</w:t>
+            </w:r>
+          </w:p>
+        </w:tc>
+        <w:tc>
+          <w:tcPr>
+            <w:tcW w:type="dxa" w:w="7776"/>
+            <w:vAlign w:val="center"/>
+            <w:shd w:fill="FFFFFF"/>
+            <w:tcMar>
+              <w:top w:w="75" w:type="dxa"/>
+              <w:bottom w:w="75" w:type="dxa"/>
+              <w:left w:w="100" w:type="dxa"/>
+              <w:right w:w="100" w:type="dxa"/>
+            </w:tcMar>
+            <w:tcBorders>
+              <w:top w:val="single" w:sz="4" w:color="D9D9D9"/>
+              <w:bottom w:val="single" w:sz="4" w:color="D9D9D9"/>
+              <w:left w:val="single" w:sz="4" w:color="D9D9D9"/>
+              <w:right w:val="single" w:sz="4" w:color="D9D9D9"/>
+            </w:tcBorders>
+          </w:tcPr>
+          <w:p>
+            <w:pPr>
+              <w:spacing w:after="20" w:line="240" w:lineRule="auto"/>
+            </w:pPr>
+            <w:r>
+              <w:rPr>
+                <w:b w:val="0"/>
+                <w:sz w:val="19"/>
+              </w:rPr>
+              <w:t>C03 authentication, ownership and assigned-handler permissions; Sections 3 3 and 3 4.</w:t>
+            </w:r>
+          </w:p>
+        </w:tc>
+      </w:tr>
+      <w:tr>
+        <w:trPr>
+          <w:cantSplit/>
+        </w:trPr>
+        <w:tc>
+          <w:tcPr>
+            <w:tcW w:type="dxa" w:w="2304"/>
+            <w:vAlign w:val="center"/>
+            <w:shd w:fill="FFFFFF"/>
+            <w:tcMar>
+              <w:top w:w="75" w:type="dxa"/>
+              <w:bottom w:w="75" w:type="dxa"/>
+              <w:left w:w="100" w:type="dxa"/>
+              <w:right w:w="100" w:type="dxa"/>
+            </w:tcMar>
+            <w:tcBorders>
+              <w:top w:val="single" w:sz="4" w:color="D9D9D9"/>
+              <w:bottom w:val="single" w:sz="4" w:color="D9D9D9"/>
+              <w:left w:val="single" w:sz="4" w:color="D9D9D9"/>
+              <w:right w:val="single" w:sz="4" w:color="D9D9D9"/>
+            </w:tcBorders>
+          </w:tcPr>
+          <w:p>
+            <w:pPr>
+              <w:spacing w:after="20" w:line="240" w:lineRule="auto"/>
+            </w:pPr>
+            <w:r>
+              <w:rPr>
+                <w:b w:val="0"/>
+                <w:sz w:val="19"/>
+              </w:rPr>
+              <w:t>BR-04 to BR-06</w:t>
+            </w:r>
+          </w:p>
+        </w:tc>
+        <w:tc>
+          <w:tcPr>
+            <w:tcW w:type="dxa" w:w="7776"/>
+            <w:vAlign w:val="center"/>
+            <w:shd w:fill="FFFFFF"/>
+            <w:tcMar>
+              <w:top w:w="75" w:type="dxa"/>
+              <w:bottom w:w="75" w:type="dxa"/>
+              <w:left w:w="100" w:type="dxa"/>
+              <w:right w:w="100" w:type="dxa"/>
+            </w:tcMar>
+            <w:tcBorders>
+              <w:top w:val="single" w:sz="4" w:color="D9D9D9"/>
+              <w:bottom w:val="single" w:sz="4" w:color="D9D9D9"/>
+              <w:left w:val="single" w:sz="4" w:color="D9D9D9"/>
+              <w:right w:val="single" w:sz="4" w:color="D9D9D9"/>
+            </w:tcBorders>
+          </w:tcPr>
+          <w:p>
+            <w:pPr>
+              <w:spacing w:after="20" w:line="240" w:lineRule="auto"/>
+            </w:pPr>
+            <w:r>
+              <w:rPr>
+                <w:b w:val="0"/>
+                <w:sz w:val="19"/>
+              </w:rPr>
+              <w:t>C05 routing, C04 appeal eligibility and C06 history; Section 3 4.</w:t>
+            </w:r>
+          </w:p>
+        </w:tc>
+      </w:tr>
+      <w:tr>
+        <w:trPr>
+          <w:cantSplit/>
+        </w:trPr>
+        <w:tc>
+          <w:tcPr>
+            <w:tcW w:type="dxa" w:w="2304"/>
+            <w:vAlign w:val="center"/>
+            <w:shd w:fill="FFFFFF"/>
+            <w:tcMar>
+              <w:top w:w="75" w:type="dxa"/>
+              <w:bottom w:w="75" w:type="dxa"/>
+              <w:left w:w="100" w:type="dxa"/>
+              <w:right w:w="100" w:type="dxa"/>
+            </w:tcMar>
+            <w:tcBorders>
+              <w:top w:val="single" w:sz="4" w:color="D9D9D9"/>
+              <w:bottom w:val="single" w:sz="4" w:color="D9D9D9"/>
+              <w:left w:val="single" w:sz="4" w:color="D9D9D9"/>
+              <w:right w:val="single" w:sz="4" w:color="D9D9D9"/>
+            </w:tcBorders>
+          </w:tcPr>
+          <w:p>
+            <w:pPr>
+              <w:spacing w:after="20" w:line="240" w:lineRule="auto"/>
+            </w:pPr>
+            <w:r>
+              <w:rPr>
+                <w:b w:val="0"/>
+                <w:sz w:val="19"/>
+              </w:rPr>
+              <w:t>BR-07; BR-08</w:t>
+            </w:r>
+          </w:p>
+        </w:tc>
+        <w:tc>
+          <w:tcPr>
+            <w:tcW w:type="dxa" w:w="7776"/>
+            <w:vAlign w:val="center"/>
+            <w:shd w:fill="FFFFFF"/>
+            <w:tcMar>
+              <w:top w:w="75" w:type="dxa"/>
+              <w:bottom w:w="75" w:type="dxa"/>
+              <w:left w:w="100" w:type="dxa"/>
+              <w:right w:w="100" w:type="dxa"/>
+            </w:tcMar>
+            <w:tcBorders>
+              <w:top w:val="single" w:sz="4" w:color="D9D9D9"/>
+              <w:bottom w:val="single" w:sz="4" w:color="D9D9D9"/>
+              <w:left w:val="single" w:sz="4" w:color="D9D9D9"/>
+              <w:right w:val="single" w:sz="4" w:color="D9D9D9"/>
+            </w:tcBorders>
+          </w:tcPr>
+          <w:p>
+            <w:pPr>
+              <w:spacing w:after="20" w:line="240" w:lineRule="auto"/>
+            </w:pPr>
+            <w:r>
+              <w:rPr>
+                <w:b w:val="0"/>
+                <w:sz w:val="19"/>
+              </w:rPr>
+              <w:t>C08 manual SLA review and C07 resolved feedback eligibility; Sections 3 4 and 3 11.</w:t>
+            </w:r>
+          </w:p>
+        </w:tc>
+      </w:tr>
+    </w:tbl>
+    <w:p>
+      <w:pPr>
+        <w:spacing w:after="0"/>
+      </w:pPr>
+    </w:p>
+    <w:p>
+      <w:r>
+        <w:br w:type="page"/>
+      </w:r>
+    </w:p>
+    <w:p>
+      <w:pPr>
+        <w:pStyle w:val="Heading1"/>
+      </w:pPr>
+      <w:r>
+        <w:t>3 10 2 Nonfunctional requirement traceability</w:t>
+      </w:r>
+    </w:p>
+    <w:tbl>
+      <w:tblPr>
+        <w:tblW w:type="auto" w:w="0"/>
+        <w:tblLayout w:type="fixed"/>
+        <w:tblLook w:firstColumn="1" w:firstRow="1" w:lastColumn="0" w:lastRow="0" w:noHBand="0" w:noVBand="1" w:val="04A0"/>
+      </w:tblPr>
+      <w:tblGrid>
+        <w:gridCol w:w="2664"/>
+        <w:gridCol w:w="4320"/>
+        <w:gridCol w:w="3096"/>
+      </w:tblGrid>
+      <w:tr>
+        <w:trPr>
+          <w:cantSplit/>
+          <w:tblHeader/>
+        </w:trPr>
+        <w:tc>
+          <w:tcPr>
+            <w:tcW w:type="dxa" w:w="2664"/>
+            <w:vAlign w:val="center"/>
+            <w:shd w:fill="E6EDF3"/>
+            <w:tcMar>
+              <w:top w:w="75" w:type="dxa"/>
+              <w:bottom w:w="75" w:type="dxa"/>
+              <w:left w:w="100" w:type="dxa"/>
+              <w:right w:w="100" w:type="dxa"/>
+            </w:tcMar>
+            <w:tcBorders>
+              <w:top w:val="single" w:sz="4" w:color="D9D9D9"/>
+              <w:bottom w:val="single" w:sz="4" w:color="D9D9D9"/>
+              <w:left w:val="single" w:sz="4" w:color="D9D9D9"/>
+              <w:right w:val="single" w:sz="4" w:color="D9D9D9"/>
+            </w:tcBorders>
+          </w:tcPr>
+          <w:p>
+            <w:pPr>
+              <w:spacing w:after="20" w:line="240" w:lineRule="auto"/>
+            </w:pPr>
+            <w:r>
+              <w:rPr>
+                <w:b/>
+                <w:sz w:val="19"/>
+              </w:rPr>
+              <w:t>SRS IDs</w:t>
+            </w:r>
+          </w:p>
+        </w:tc>
+        <w:tc>
+          <w:tcPr>
+            <w:tcW w:type="dxa" w:w="4320"/>
+            <w:vAlign w:val="center"/>
+            <w:shd w:fill="E6EDF3"/>
+            <w:tcMar>
+              <w:top w:w="75" w:type="dxa"/>
+              <w:bottom w:w="75" w:type="dxa"/>
+              <w:left w:w="100" w:type="dxa"/>
+              <w:right w:w="100" w:type="dxa"/>
+            </w:tcMar>
+            <w:tcBorders>
+              <w:top w:val="single" w:sz="4" w:color="D9D9D9"/>
+              <w:bottom w:val="single" w:sz="4" w:color="D9D9D9"/>
+              <w:left w:val="single" w:sz="4" w:color="D9D9D9"/>
+              <w:right w:val="single" w:sz="4" w:color="D9D9D9"/>
+            </w:tcBorders>
+          </w:tcPr>
+          <w:p>
+            <w:pPr>
+              <w:spacing w:after="20" w:line="240" w:lineRule="auto"/>
+            </w:pPr>
+            <w:r>
+              <w:rPr>
+                <w:b/>
+                <w:sz w:val="19"/>
+              </w:rPr>
+              <w:t>Architectural support</w:t>
+            </w:r>
+          </w:p>
+        </w:tc>
+        <w:tc>
+          <w:tcPr>
+            <w:tcW w:type="dxa" w:w="3096"/>
+            <w:vAlign w:val="center"/>
+            <w:shd w:fill="E6EDF3"/>
+            <w:tcMar>
+              <w:top w:w="75" w:type="dxa"/>
+              <w:bottom w:w="75" w:type="dxa"/>
+              <w:left w:w="100" w:type="dxa"/>
+              <w:right w:w="100" w:type="dxa"/>
+            </w:tcMar>
+            <w:tcBorders>
+              <w:top w:val="single" w:sz="4" w:color="D9D9D9"/>
+              <w:bottom w:val="single" w:sz="4" w:color="D9D9D9"/>
+              <w:left w:val="single" w:sz="4" w:color="D9D9D9"/>
+              <w:right w:val="single" w:sz="4" w:color="D9D9D9"/>
+            </w:tcBorders>
+          </w:tcPr>
+          <w:p>
+            <w:pPr>
+              <w:spacing w:after="20" w:line="240" w:lineRule="auto"/>
+            </w:pPr>
+            <w:r>
+              <w:rPr>
+                <w:b/>
+                <w:sz w:val="19"/>
+              </w:rPr>
+              <w:t>Validation required</w:t>
+            </w:r>
+          </w:p>
+        </w:tc>
+      </w:tr>
+      <w:tr>
+        <w:trPr>
+          <w:cantSplit/>
+        </w:trPr>
+        <w:tc>
+          <w:tcPr>
+            <w:tcW w:type="dxa" w:w="2664"/>
+            <w:vAlign w:val="center"/>
+            <w:shd w:fill="FFFFFF"/>
+            <w:tcMar>
+              <w:top w:w="75" w:type="dxa"/>
+              <w:bottom w:w="75" w:type="dxa"/>
+              <w:left w:w="100" w:type="dxa"/>
+              <w:right w:w="100" w:type="dxa"/>
+            </w:tcMar>
+            <w:tcBorders>
+              <w:top w:val="single" w:sz="4" w:color="D9D9D9"/>
+              <w:bottom w:val="single" w:sz="4" w:color="D9D9D9"/>
+              <w:left w:val="single" w:sz="4" w:color="D9D9D9"/>
+              <w:right w:val="single" w:sz="4" w:color="D9D9D9"/>
+            </w:tcBorders>
+          </w:tcPr>
+          <w:p>
+            <w:pPr>
+              <w:spacing w:after="20" w:line="240" w:lineRule="auto"/>
+            </w:pPr>
+            <w:r>
+              <w:rPr>
+                <w:b w:val="0"/>
+                <w:sz w:val="19"/>
+              </w:rPr>
+              <w:t>NFR-PERF-01</w:t>
+            </w:r>
+          </w:p>
+        </w:tc>
+        <w:tc>
+          <w:tcPr>
+            <w:tcW w:type="dxa" w:w="4320"/>
+            <w:vAlign w:val="center"/>
+            <w:shd w:fill="FFFFFF"/>
+            <w:tcMar>
+              <w:top w:w="75" w:type="dxa"/>
+              <w:bottom w:w="75" w:type="dxa"/>
+              <w:left w:w="100" w:type="dxa"/>
+              <w:right w:w="100" w:type="dxa"/>
+            </w:tcMar>
+            <w:tcBorders>
+              <w:top w:val="single" w:sz="4" w:color="D9D9D9"/>
+              <w:bottom w:val="single" w:sz="4" w:color="D9D9D9"/>
+              <w:left w:val="single" w:sz="4" w:color="D9D9D9"/>
+              <w:right w:val="single" w:sz="4" w:color="D9D9D9"/>
+            </w:tcBorders>
+          </w:tcPr>
+          <w:p>
+            <w:pPr>
+              <w:spacing w:after="20" w:line="240" w:lineRule="auto"/>
+            </w:pPr>
+            <w:r>
+              <w:rPr>
+                <w:b w:val="0"/>
+                <w:sz w:val="19"/>
+              </w:rPr>
+              <w:t>C08 indexed, paginated dashboard queries; C09 targeted indexes.</w:t>
+            </w:r>
+          </w:p>
+        </w:tc>
+        <w:tc>
+          <w:tcPr>
+            <w:tcW w:type="dxa" w:w="3096"/>
+            <w:vAlign w:val="center"/>
+            <w:shd w:fill="FFFFFF"/>
+            <w:tcMar>
+              <w:top w:w="75" w:type="dxa"/>
+              <w:bottom w:w="75" w:type="dxa"/>
+              <w:left w:w="100" w:type="dxa"/>
+              <w:right w:w="100" w:type="dxa"/>
+            </w:tcMar>
+            <w:tcBorders>
+              <w:top w:val="single" w:sz="4" w:color="D9D9D9"/>
+              <w:bottom w:val="single" w:sz="4" w:color="D9D9D9"/>
+              <w:left w:val="single" w:sz="4" w:color="D9D9D9"/>
+              <w:right w:val="single" w:sz="4" w:color="D9D9D9"/>
+            </w:tcBorders>
+          </w:tcPr>
+          <w:p>
+            <w:pPr>
+              <w:spacing w:after="20" w:line="240" w:lineRule="auto"/>
+            </w:pPr>
+            <w:r>
+              <w:rPr>
+                <w:b w:val="0"/>
+                <w:sz w:val="19"/>
+              </w:rPr>
+              <w:t>Dashboard &lt;=2 seconds under an agreed normal workload.</w:t>
+            </w:r>
+          </w:p>
+        </w:tc>
+      </w:tr>
+      <w:tr>
+        <w:trPr>
+          <w:cantSplit/>
+        </w:trPr>
+        <w:tc>
+          <w:tcPr>
+            <w:tcW w:type="dxa" w:w="2664"/>
+            <w:vAlign w:val="center"/>
+            <w:shd w:fill="FFFFFF"/>
+            <w:tcMar>
+              <w:top w:w="75" w:type="dxa"/>
+              <w:bottom w:w="75" w:type="dxa"/>
+              <w:left w:w="100" w:type="dxa"/>
+              <w:right w:w="100" w:type="dxa"/>
+            </w:tcMar>
+            <w:tcBorders>
+              <w:top w:val="single" w:sz="4" w:color="D9D9D9"/>
+              <w:bottom w:val="single" w:sz="4" w:color="D9D9D9"/>
+              <w:left w:val="single" w:sz="4" w:color="D9D9D9"/>
+              <w:right w:val="single" w:sz="4" w:color="D9D9D9"/>
+            </w:tcBorders>
+          </w:tcPr>
+          <w:p>
+            <w:pPr>
+              <w:spacing w:after="20" w:line="240" w:lineRule="auto"/>
+            </w:pPr>
+            <w:r>
+              <w:rPr>
+                <w:b w:val="0"/>
+                <w:sz w:val="19"/>
+              </w:rPr>
+              <w:t>NFR-PERF-02</w:t>
+            </w:r>
+          </w:p>
+        </w:tc>
+        <w:tc>
+          <w:tcPr>
+            <w:tcW w:type="dxa" w:w="4320"/>
+            <w:vAlign w:val="center"/>
+            <w:shd w:fill="FFFFFF"/>
+            <w:tcMar>
+              <w:top w:w="75" w:type="dxa"/>
+              <w:bottom w:w="75" w:type="dxa"/>
+              <w:left w:w="100" w:type="dxa"/>
+              <w:right w:w="100" w:type="dxa"/>
+            </w:tcMar>
+            <w:tcBorders>
+              <w:top w:val="single" w:sz="4" w:color="D9D9D9"/>
+              <w:bottom w:val="single" w:sz="4" w:color="D9D9D9"/>
+              <w:left w:val="single" w:sz="4" w:color="D9D9D9"/>
+              <w:right w:val="single" w:sz="4" w:color="D9D9D9"/>
+            </w:tcBorders>
+          </w:tcPr>
+          <w:p>
+            <w:pPr>
+              <w:spacing w:after="20" w:line="240" w:lineRule="auto"/>
+            </w:pPr>
+            <w:r>
+              <w:rPr>
+                <w:b w:val="0"/>
+                <w:sz w:val="19"/>
+              </w:rPr>
+              <w:t>C04 short transaction and no external notification dependency.</w:t>
+            </w:r>
+          </w:p>
+        </w:tc>
+        <w:tc>
+          <w:tcPr>
+            <w:tcW w:type="dxa" w:w="3096"/>
+            <w:vAlign w:val="center"/>
+            <w:shd w:fill="FFFFFF"/>
+            <w:tcMar>
+              <w:top w:w="75" w:type="dxa"/>
+              <w:bottom w:w="75" w:type="dxa"/>
+              <w:left w:w="100" w:type="dxa"/>
+              <w:right w:w="100" w:type="dxa"/>
+            </w:tcMar>
+            <w:tcBorders>
+              <w:top w:val="single" w:sz="4" w:color="D9D9D9"/>
+              <w:bottom w:val="single" w:sz="4" w:color="D9D9D9"/>
+              <w:left w:val="single" w:sz="4" w:color="D9D9D9"/>
+              <w:right w:val="single" w:sz="4" w:color="D9D9D9"/>
+            </w:tcBorders>
+          </w:tcPr>
+          <w:p>
+            <w:pPr>
+              <w:spacing w:after="20" w:line="240" w:lineRule="auto"/>
+            </w:pPr>
+            <w:r>
+              <w:rPr>
+                <w:b w:val="0"/>
+                <w:sz w:val="19"/>
+              </w:rPr>
+              <w:t>Valid submission confirmation &lt;=3 seconds under that workload.</w:t>
+            </w:r>
+          </w:p>
+        </w:tc>
+      </w:tr>
+      <w:tr>
+        <w:trPr>
+          <w:cantSplit/>
+        </w:trPr>
+        <w:tc>
+          <w:tcPr>
+            <w:tcW w:type="dxa" w:w="2664"/>
+            <w:vAlign w:val="center"/>
+            <w:shd w:fill="FFFFFF"/>
+            <w:tcMar>
+              <w:top w:w="75" w:type="dxa"/>
+              <w:bottom w:w="75" w:type="dxa"/>
+              <w:left w:w="100" w:type="dxa"/>
+              <w:right w:w="100" w:type="dxa"/>
+            </w:tcMar>
+            <w:tcBorders>
+              <w:top w:val="single" w:sz="4" w:color="D9D9D9"/>
+              <w:bottom w:val="single" w:sz="4" w:color="D9D9D9"/>
+              <w:left w:val="single" w:sz="4" w:color="D9D9D9"/>
+              <w:right w:val="single" w:sz="4" w:color="D9D9D9"/>
+            </w:tcBorders>
+          </w:tcPr>
+          <w:p>
+            <w:pPr>
+              <w:spacing w:after="20" w:line="240" w:lineRule="auto"/>
+            </w:pPr>
+            <w:r>
+              <w:rPr>
+                <w:b w:val="0"/>
+                <w:sz w:val="19"/>
+              </w:rPr>
+              <w:t>NFR-DATA-01; NFR-DATA-03</w:t>
+            </w:r>
+          </w:p>
+        </w:tc>
+        <w:tc>
+          <w:tcPr>
+            <w:tcW w:type="dxa" w:w="4320"/>
+            <w:vAlign w:val="center"/>
+            <w:shd w:fill="FFFFFF"/>
+            <w:tcMar>
+              <w:top w:w="75" w:type="dxa"/>
+              <w:bottom w:w="75" w:type="dxa"/>
+              <w:left w:w="100" w:type="dxa"/>
+              <w:right w:w="100" w:type="dxa"/>
+            </w:tcMar>
+            <w:tcBorders>
+              <w:top w:val="single" w:sz="4" w:color="D9D9D9"/>
+              <w:bottom w:val="single" w:sz="4" w:color="D9D9D9"/>
+              <w:left w:val="single" w:sz="4" w:color="D9D9D9"/>
+              <w:right w:val="single" w:sz="4" w:color="D9D9D9"/>
+            </w:tcBorders>
+          </w:tcPr>
+          <w:p>
+            <w:pPr>
+              <w:spacing w:after="20" w:line="240" w:lineRule="auto"/>
+            </w:pPr>
+            <w:r>
+              <w:rPr>
+                <w:b w:val="0"/>
+                <w:sz w:val="19"/>
+              </w:rPr>
+              <w:t>C09 durable SQLite file, database PK and required relationships.</w:t>
+            </w:r>
+          </w:p>
+        </w:tc>
+        <w:tc>
+          <w:tcPr>
+            <w:tcW w:type="dxa" w:w="3096"/>
+            <w:vAlign w:val="center"/>
+            <w:shd w:fill="FFFFFF"/>
+            <w:tcMar>
+              <w:top w:w="75" w:type="dxa"/>
+              <w:bottom w:w="75" w:type="dxa"/>
+              <w:left w:w="100" w:type="dxa"/>
+              <w:right w:w="100" w:type="dxa"/>
+            </w:tcMar>
+            <w:tcBorders>
+              <w:top w:val="single" w:sz="4" w:color="D9D9D9"/>
+              <w:bottom w:val="single" w:sz="4" w:color="D9D9D9"/>
+              <w:left w:val="single" w:sz="4" w:color="D9D9D9"/>
+              <w:right w:val="single" w:sz="4" w:color="D9D9D9"/>
+            </w:tcBorders>
+          </w:tcPr>
+          <w:p>
+            <w:pPr>
+              <w:spacing w:after="20" w:line="240" w:lineRule="auto"/>
+            </w:pPr>
+            <w:r>
+              <w:rPr>
+                <w:b w:val="0"/>
+                <w:sz w:val="19"/>
+              </w:rPr>
+              <w:t>Stored records survive restart and IDs remain unique.</w:t>
+            </w:r>
+          </w:p>
+        </w:tc>
+      </w:tr>
+      <w:tr>
+        <w:trPr>
+          <w:cantSplit/>
+        </w:trPr>
+        <w:tc>
+          <w:tcPr>
+            <w:tcW w:type="dxa" w:w="2664"/>
+            <w:vAlign w:val="center"/>
+            <w:shd w:fill="FFFFFF"/>
+            <w:tcMar>
+              <w:top w:w="75" w:type="dxa"/>
+              <w:bottom w:w="75" w:type="dxa"/>
+              <w:left w:w="100" w:type="dxa"/>
+              <w:right w:w="100" w:type="dxa"/>
+            </w:tcMar>
+            <w:tcBorders>
+              <w:top w:val="single" w:sz="4" w:color="D9D9D9"/>
+              <w:bottom w:val="single" w:sz="4" w:color="D9D9D9"/>
+              <w:left w:val="single" w:sz="4" w:color="D9D9D9"/>
+              <w:right w:val="single" w:sz="4" w:color="D9D9D9"/>
+            </w:tcBorders>
+          </w:tcPr>
+          <w:p>
+            <w:pPr>
+              <w:spacing w:after="20" w:line="240" w:lineRule="auto"/>
+            </w:pPr>
+            <w:r>
+              <w:rPr>
+                <w:b w:val="0"/>
+                <w:sz w:val="19"/>
+              </w:rPr>
+              <w:t>NFR-DATA-02</w:t>
+            </w:r>
+          </w:p>
+        </w:tc>
+        <w:tc>
+          <w:tcPr>
+            <w:tcW w:type="dxa" w:w="4320"/>
+            <w:vAlign w:val="center"/>
+            <w:shd w:fill="FFFFFF"/>
+            <w:tcMar>
+              <w:top w:w="75" w:type="dxa"/>
+              <w:bottom w:w="75" w:type="dxa"/>
+              <w:left w:w="100" w:type="dxa"/>
+              <w:right w:w="100" w:type="dxa"/>
+            </w:tcMar>
+            <w:tcBorders>
+              <w:top w:val="single" w:sz="4" w:color="D9D9D9"/>
+              <w:bottom w:val="single" w:sz="4" w:color="D9D9D9"/>
+              <w:left w:val="single" w:sz="4" w:color="D9D9D9"/>
+              <w:right w:val="single" w:sz="4" w:color="D9D9D9"/>
+            </w:tcBorders>
+          </w:tcPr>
+          <w:p>
+            <w:pPr>
+              <w:spacing w:after="20" w:line="240" w:lineRule="auto"/>
+            </w:pPr>
+            <w:r>
+              <w:rPr>
+                <w:b w:val="0"/>
+                <w:sz w:val="19"/>
+              </w:rPr>
+              <w:t>C02/C04 validate before writes; C09 transaction rollback.</w:t>
+            </w:r>
+          </w:p>
+        </w:tc>
+        <w:tc>
+          <w:tcPr>
+            <w:tcW w:type="dxa" w:w="3096"/>
+            <w:vAlign w:val="center"/>
+            <w:shd w:fill="FFFFFF"/>
+            <w:tcMar>
+              <w:top w:w="75" w:type="dxa"/>
+              <w:bottom w:w="75" w:type="dxa"/>
+              <w:left w:w="100" w:type="dxa"/>
+              <w:right w:w="100" w:type="dxa"/>
+            </w:tcMar>
+            <w:tcBorders>
+              <w:top w:val="single" w:sz="4" w:color="D9D9D9"/>
+              <w:bottom w:val="single" w:sz="4" w:color="D9D9D9"/>
+              <w:left w:val="single" w:sz="4" w:color="D9D9D9"/>
+              <w:right w:val="single" w:sz="4" w:color="D9D9D9"/>
+            </w:tcBorders>
+          </w:tcPr>
+          <w:p>
+            <w:pPr>
+              <w:spacing w:after="20" w:line="240" w:lineRule="auto"/>
+            </w:pPr>
+            <w:r>
+              <w:rPr>
+                <w:b w:val="0"/>
+                <w:sz w:val="19"/>
+              </w:rPr>
+              <w:t>Invalid input creates no complaint or partial workflow data.</w:t>
+            </w:r>
+          </w:p>
+        </w:tc>
+      </w:tr>
+      <w:tr>
+        <w:trPr>
+          <w:cantSplit/>
+        </w:trPr>
+        <w:tc>
+          <w:tcPr>
+            <w:tcW w:type="dxa" w:w="2664"/>
+            <w:vAlign w:val="center"/>
+            <w:shd w:fill="FFFFFF"/>
+            <w:tcMar>
+              <w:top w:w="75" w:type="dxa"/>
+              <w:bottom w:w="75" w:type="dxa"/>
+              <w:left w:w="100" w:type="dxa"/>
+              <w:right w:w="100" w:type="dxa"/>
+            </w:tcMar>
+            <w:tcBorders>
+              <w:top w:val="single" w:sz="4" w:color="D9D9D9"/>
+              <w:bottom w:val="single" w:sz="4" w:color="D9D9D9"/>
+              <w:left w:val="single" w:sz="4" w:color="D9D9D9"/>
+              <w:right w:val="single" w:sz="4" w:color="D9D9D9"/>
+            </w:tcBorders>
+          </w:tcPr>
+          <w:p>
+            <w:pPr>
+              <w:spacing w:after="20" w:line="240" w:lineRule="auto"/>
+            </w:pPr>
+            <w:r>
+              <w:rPr>
+                <w:b w:val="0"/>
+                <w:sz w:val="19"/>
+              </w:rPr>
+              <w:t>NFR-DATA-04</w:t>
+            </w:r>
+          </w:p>
+        </w:tc>
+        <w:tc>
+          <w:tcPr>
+            <w:tcW w:type="dxa" w:w="4320"/>
+            <w:vAlign w:val="center"/>
+            <w:shd w:fill="FFFFFF"/>
+            <w:tcMar>
+              <w:top w:w="75" w:type="dxa"/>
+              <w:bottom w:w="75" w:type="dxa"/>
+              <w:left w:w="100" w:type="dxa"/>
+              <w:right w:w="100" w:type="dxa"/>
+            </w:tcMar>
+            <w:tcBorders>
+              <w:top w:val="single" w:sz="4" w:color="D9D9D9"/>
+              <w:bottom w:val="single" w:sz="4" w:color="D9D9D9"/>
+              <w:left w:val="single" w:sz="4" w:color="D9D9D9"/>
+              <w:right w:val="single" w:sz="4" w:color="D9D9D9"/>
+            </w:tcBorders>
+          </w:tcPr>
+          <w:p>
+            <w:pPr>
+              <w:spacing w:after="20" w:line="240" w:lineRule="auto"/>
+            </w:pPr>
+            <w:r>
+              <w:rPr>
+                <w:b w:val="0"/>
+                <w:sz w:val="19"/>
+              </w:rPr>
+              <w:t>C06 UTC audit timestamps, stable timestamp/audit_id ordering and protected rows.</w:t>
+            </w:r>
+          </w:p>
+        </w:tc>
+        <w:tc>
+          <w:tcPr>
+            <w:tcW w:type="dxa" w:w="3096"/>
+            <w:vAlign w:val="center"/>
+            <w:shd w:fill="FFFFFF"/>
+            <w:tcMar>
+              <w:top w:w="75" w:type="dxa"/>
+              <w:bottom w:w="75" w:type="dxa"/>
+              <w:left w:w="100" w:type="dxa"/>
+              <w:right w:w="100" w:type="dxa"/>
+            </w:tcMar>
+            <w:tcBorders>
+              <w:top w:val="single" w:sz="4" w:color="D9D9D9"/>
+              <w:bottom w:val="single" w:sz="4" w:color="D9D9D9"/>
+              <w:left w:val="single" w:sz="4" w:color="D9D9D9"/>
+              <w:right w:val="single" w:sz="4" w:color="D9D9D9"/>
+            </w:tcBorders>
+          </w:tcPr>
+          <w:p>
+            <w:pPr>
+              <w:spacing w:after="20" w:line="240" w:lineRule="auto"/>
+            </w:pPr>
+            <w:r>
+              <w:rPr>
+                <w:b w:val="0"/>
+                <w:sz w:val="19"/>
+              </w:rPr>
+              <w:t>History remains complete and chronological.</w:t>
+            </w:r>
+          </w:p>
+        </w:tc>
+      </w:tr>
+      <w:tr>
+        <w:trPr>
+          <w:cantSplit/>
+        </w:trPr>
+        <w:tc>
+          <w:tcPr>
+            <w:tcW w:type="dxa" w:w="2664"/>
+            <w:vAlign w:val="center"/>
+            <w:shd w:fill="FFFFFF"/>
+            <w:tcMar>
+              <w:top w:w="75" w:type="dxa"/>
+              <w:bottom w:w="75" w:type="dxa"/>
+              <w:left w:w="100" w:type="dxa"/>
+              <w:right w:w="100" w:type="dxa"/>
+            </w:tcMar>
+            <w:tcBorders>
+              <w:top w:val="single" w:sz="4" w:color="D9D9D9"/>
+              <w:bottom w:val="single" w:sz="4" w:color="D9D9D9"/>
+              <w:left w:val="single" w:sz="4" w:color="D9D9D9"/>
+              <w:right w:val="single" w:sz="4" w:color="D9D9D9"/>
+            </w:tcBorders>
+          </w:tcPr>
+          <w:p>
+            <w:pPr>
+              <w:spacing w:after="20" w:line="240" w:lineRule="auto"/>
+            </w:pPr>
+            <w:r>
+              <w:rPr>
+                <w:b w:val="0"/>
+                <w:sz w:val="19"/>
+              </w:rPr>
+              <w:t>NFR-USAB-01; NFR-USAB-02</w:t>
+            </w:r>
+          </w:p>
+        </w:tc>
+        <w:tc>
+          <w:tcPr>
+            <w:tcW w:type="dxa" w:w="4320"/>
+            <w:vAlign w:val="center"/>
+            <w:shd w:fill="FFFFFF"/>
+            <w:tcMar>
+              <w:top w:w="75" w:type="dxa"/>
+              <w:bottom w:w="75" w:type="dxa"/>
+              <w:left w:w="100" w:type="dxa"/>
+              <w:right w:w="100" w:type="dxa"/>
+            </w:tcMar>
+            <w:tcBorders>
+              <w:top w:val="single" w:sz="4" w:color="D9D9D9"/>
+              <w:bottom w:val="single" w:sz="4" w:color="D9D9D9"/>
+              <w:left w:val="single" w:sz="4" w:color="D9D9D9"/>
+              <w:right w:val="single" w:sz="4" w:color="D9D9D9"/>
+            </w:tcBorders>
+          </w:tcPr>
+          <w:p>
+            <w:pPr>
+              <w:spacing w:after="20" w:line="240" w:lineRule="auto"/>
+            </w:pPr>
+            <w:r>
+              <w:rPr>
+                <w:b w:val="0"/>
+                <w:sz w:val="19"/>
+              </w:rPr>
+              <w:t>C01/C02 field labels, validation errors, textual status and status badges.</w:t>
+            </w:r>
+          </w:p>
+        </w:tc>
+        <w:tc>
+          <w:tcPr>
+            <w:tcW w:type="dxa" w:w="3096"/>
+            <w:vAlign w:val="center"/>
+            <w:shd w:fill="FFFFFF"/>
+            <w:tcMar>
+              <w:top w:w="75" w:type="dxa"/>
+              <w:bottom w:w="75" w:type="dxa"/>
+              <w:left w:w="100" w:type="dxa"/>
+              <w:right w:w="100" w:type="dxa"/>
+            </w:tcMar>
+            <w:tcBorders>
+              <w:top w:val="single" w:sz="4" w:color="D9D9D9"/>
+              <w:bottom w:val="single" w:sz="4" w:color="D9D9D9"/>
+              <w:left w:val="single" w:sz="4" w:color="D9D9D9"/>
+              <w:right w:val="single" w:sz="4" w:color="D9D9D9"/>
+            </w:tcBorders>
+          </w:tcPr>
+          <w:p>
+            <w:pPr>
+              <w:spacing w:after="20" w:line="240" w:lineRule="auto"/>
+            </w:pPr>
+            <w:r>
+              <w:rPr>
+                <w:b w:val="0"/>
+                <w:sz w:val="19"/>
+              </w:rPr>
+              <w:t>Review input errors and visible state in role-specific UI flows.</w:t>
+            </w:r>
+          </w:p>
+        </w:tc>
+      </w:tr>
+      <w:tr>
+        <w:trPr>
+          <w:cantSplit/>
+        </w:trPr>
+        <w:tc>
+          <w:tcPr>
+            <w:tcW w:type="dxa" w:w="2664"/>
+            <w:vAlign w:val="center"/>
+            <w:shd w:fill="FFFFFF"/>
+            <w:tcMar>
+              <w:top w:w="75" w:type="dxa"/>
+              <w:bottom w:w="75" w:type="dxa"/>
+              <w:left w:w="100" w:type="dxa"/>
+              <w:right w:w="100" w:type="dxa"/>
+            </w:tcMar>
+            <w:tcBorders>
+              <w:top w:val="single" w:sz="4" w:color="D9D9D9"/>
+              <w:bottom w:val="single" w:sz="4" w:color="D9D9D9"/>
+              <w:left w:val="single" w:sz="4" w:color="D9D9D9"/>
+              <w:right w:val="single" w:sz="4" w:color="D9D9D9"/>
+            </w:tcBorders>
+          </w:tcPr>
+          <w:p>
+            <w:pPr>
+              <w:spacing w:after="20" w:line="240" w:lineRule="auto"/>
+            </w:pPr>
+            <w:r>
+              <w:rPr>
+                <w:b w:val="0"/>
+                <w:sz w:val="19"/>
+              </w:rPr>
+              <w:t>NFR-MAIN-01</w:t>
+            </w:r>
+          </w:p>
+        </w:tc>
+        <w:tc>
+          <w:tcPr>
+            <w:tcW w:type="dxa" w:w="4320"/>
+            <w:vAlign w:val="center"/>
+            <w:shd w:fill="FFFFFF"/>
+            <w:tcMar>
+              <w:top w:w="75" w:type="dxa"/>
+              <w:bottom w:w="75" w:type="dxa"/>
+              <w:left w:w="100" w:type="dxa"/>
+              <w:right w:w="100" w:type="dxa"/>
+            </w:tcMar>
+            <w:tcBorders>
+              <w:top w:val="single" w:sz="4" w:color="D9D9D9"/>
+              <w:bottom w:val="single" w:sz="4" w:color="D9D9D9"/>
+              <w:left w:val="single" w:sz="4" w:color="D9D9D9"/>
+              <w:right w:val="single" w:sz="4" w:color="D9D9D9"/>
+            </w:tcBorders>
+          </w:tcPr>
+          <w:p>
+            <w:pPr>
+              <w:spacing w:after="20" w:line="240" w:lineRule="auto"/>
+            </w:pPr>
+            <w:r>
+              <w:rPr>
+                <w:b w:val="0"/>
+                <w:sz w:val="19"/>
+              </w:rPr>
+              <w:t>C03-C08 separate modules; C05 centralized routing; C09 persistence boundary.</w:t>
+            </w:r>
+          </w:p>
+        </w:tc>
+        <w:tc>
+          <w:tcPr>
+            <w:tcW w:type="dxa" w:w="3096"/>
+            <w:vAlign w:val="center"/>
+            <w:shd w:fill="FFFFFF"/>
+            <w:tcMar>
+              <w:top w:w="75" w:type="dxa"/>
+              <w:bottom w:w="75" w:type="dxa"/>
+              <w:left w:w="100" w:type="dxa"/>
+              <w:right w:w="100" w:type="dxa"/>
+            </w:tcMar>
+            <w:tcBorders>
+              <w:top w:val="single" w:sz="4" w:color="D9D9D9"/>
+              <w:bottom w:val="single" w:sz="4" w:color="D9D9D9"/>
+              <w:left w:val="single" w:sz="4" w:color="D9D9D9"/>
+              <w:right w:val="single" w:sz="4" w:color="D9D9D9"/>
+            </w:tcBorders>
+          </w:tcPr>
+          <w:p>
+            <w:pPr>
+              <w:spacing w:after="20" w:line="240" w:lineRule="auto"/>
+            </w:pPr>
+            <w:r>
+              <w:rPr>
+                <w:b w:val="0"/>
+                <w:sz w:val="19"/>
+              </w:rPr>
+              <w:t>Review dependencies and modify routing without duplicating handler rules.</w:t>
+            </w:r>
+          </w:p>
+        </w:tc>
+      </w:tr>
+      <w:tr>
+        <w:trPr>
+          <w:cantSplit/>
+        </w:trPr>
+        <w:tc>
+          <w:tcPr>
+            <w:tcW w:type="dxa" w:w="2664"/>
+            <w:vAlign w:val="center"/>
+            <w:shd w:fill="FFFFFF"/>
+            <w:tcMar>
+              <w:top w:w="75" w:type="dxa"/>
+              <w:bottom w:w="75" w:type="dxa"/>
+              <w:left w:w="100" w:type="dxa"/>
+              <w:right w:w="100" w:type="dxa"/>
+            </w:tcMar>
+            <w:tcBorders>
+              <w:top w:val="single" w:sz="4" w:color="D9D9D9"/>
+              <w:bottom w:val="single" w:sz="4" w:color="D9D9D9"/>
+              <w:left w:val="single" w:sz="4" w:color="D9D9D9"/>
+              <w:right w:val="single" w:sz="4" w:color="D9D9D9"/>
+            </w:tcBorders>
+          </w:tcPr>
+          <w:p>
+            <w:pPr>
+              <w:spacing w:after="20" w:line="240" w:lineRule="auto"/>
+            </w:pPr>
+            <w:r>
+              <w:rPr>
+                <w:b w:val="0"/>
+                <w:sz w:val="19"/>
+              </w:rPr>
+              <w:t>NFR-REL-01; NFR-REL-02</w:t>
+            </w:r>
+          </w:p>
+        </w:tc>
+        <w:tc>
+          <w:tcPr>
+            <w:tcW w:type="dxa" w:w="4320"/>
+            <w:vAlign w:val="center"/>
+            <w:shd w:fill="FFFFFF"/>
+            <w:tcMar>
+              <w:top w:w="75" w:type="dxa"/>
+              <w:bottom w:w="75" w:type="dxa"/>
+              <w:left w:w="100" w:type="dxa"/>
+              <w:right w:w="100" w:type="dxa"/>
+            </w:tcMar>
+            <w:tcBorders>
+              <w:top w:val="single" w:sz="4" w:color="D9D9D9"/>
+              <w:bottom w:val="single" w:sz="4" w:color="D9D9D9"/>
+              <w:left w:val="single" w:sz="4" w:color="D9D9D9"/>
+              <w:right w:val="single" w:sz="4" w:color="D9D9D9"/>
+            </w:tcBorders>
+          </w:tcPr>
+          <w:p>
+            <w:pPr>
+              <w:spacing w:after="20" w:line="240" w:lineRule="auto"/>
+            </w:pPr>
+            <w:r>
+              <w:rPr>
+                <w:b w:val="0"/>
+                <w:sz w:val="19"/>
+              </w:rPr>
+              <w:t>Persistent file, consistent backup and commit-before-confirmation.</w:t>
+            </w:r>
+          </w:p>
+        </w:tc>
+        <w:tc>
+          <w:tcPr>
+            <w:tcW w:type="dxa" w:w="3096"/>
+            <w:vAlign w:val="center"/>
+            <w:shd w:fill="FFFFFF"/>
+            <w:tcMar>
+              <w:top w:w="75" w:type="dxa"/>
+              <w:bottom w:w="75" w:type="dxa"/>
+              <w:left w:w="100" w:type="dxa"/>
+              <w:right w:w="100" w:type="dxa"/>
+            </w:tcMar>
+            <w:tcBorders>
+              <w:top w:val="single" w:sz="4" w:color="D9D9D9"/>
+              <w:bottom w:val="single" w:sz="4" w:color="D9D9D9"/>
+              <w:left w:val="single" w:sz="4" w:color="D9D9D9"/>
+              <w:right w:val="single" w:sz="4" w:color="D9D9D9"/>
+            </w:tcBorders>
+          </w:tcPr>
+          <w:p>
+            <w:pPr>
+              <w:spacing w:after="20" w:line="240" w:lineRule="auto"/>
+            </w:pPr>
+            <w:r>
+              <w:rPr>
+                <w:b w:val="0"/>
+                <w:sz w:val="19"/>
+              </w:rPr>
+              <w:t>Restart, storage-failure and recovery scenarios on the implemented app.</w:t>
+            </w:r>
+          </w:p>
+        </w:tc>
+      </w:tr>
+    </w:tbl>
+    <w:p>
+      <w:pPr>
+        <w:spacing w:after="0"/>
+      </w:pPr>
+    </w:p>
+    <w:p>
+      <w:pPr>
+        <w:pStyle w:val="Heading2"/>
+      </w:pPr>
+      <w:r>
+        <w:t>3 10 3 Validation boundary</w:t>
+      </w:r>
+    </w:p>
+    <w:p>
+      <w:r>
+        <w:t>The repository test_scms.py provides an in-memory domain simulation. Its results cannot demonstrate HTTP access policy, cryptographic hashing, SQLite durability, browser usability or deployment performance. Member 2 should link architecture controls to tests against the implemented application, including transaction failure and simultaneous appeal attempts.</w:t>
+      </w:r>
+    </w:p>
+    <w:p>
+      <w:r>
+        <w:t>The SRS does not quantify the normal workload. The team must specify concurrent users, complaint volume, request mix and measurement environment before evaluating the 2-second and 3-second targets. No measured performance, security assurance or successful recovery is claimed by this specification.</w:t>
+      </w:r>
+    </w:p>
+    <w:p>
+      <w:pPr>
+        <w:pStyle w:val="Heading2"/>
+      </w:pPr>
+      <w:r>
+        <w:t>3 10 4 Architecture review checklist</w:t>
+      </w:r>
+    </w:p>
+    <w:p>
+      <w:r>
+        <w:t>Review AC01 module names against Section 4 interfaces; inspect access filters for each role; verify transaction ownership; check one-appeal and feedback constraints; review manual SLA authority; and link every functional/security requirement to a component. Release validation follows implementation and the approved Test Plan.</w:t>
+      </w:r>
+    </w:p>
+    <w:p>
+      <w:r>
+        <w:br w:type="page"/>
+      </w:r>
+    </w:p>
+    <w:p>
+      <w:pPr>
+        <w:pStyle w:val="Heading1"/>
+      </w:pPr>
+      <w:r>
+        <w:t>3 11 Design alignment and architecture decisions</w:t>
+      </w:r>
+    </w:p>
+    <w:p>
+      <w:pPr>
+        <w:pStyle w:val="Heading2"/>
+      </w:pPr>
+      <w:r>
+        <w:t>3 11 1 Alignment with Section 4</w:t>
+      </w:r>
+    </w:p>
+    <w:p>
+      <w:r>
+        <w:t>This architecture retains AuthService, ComplaintService, RoutingPolicy and SQLite Repository, so both existing sequence diagrams and detailed API contracts can use the same names. Audit, feedback and query responsibilities are modular parts of the same Flask application. The proposed persistent entities, optimistic version field, in-app notices and shared transaction boundary match Section 4 data design.</w:t>
+      </w:r>
+    </w:p>
+    <w:p>
+      <w:r>
+        <w:t>The Member 4 design already defines detailed endpoints, error handling and operational logging. Insert this Section 3 before Section 4 in the combined Software Architecture and Design Specification. Endpoint payloads remain owned by Section 4; this architecture assigns their modules and trust boundaries.</w:t>
+      </w:r>
+    </w:p>
+    <w:p>
+      <w:pPr>
+        <w:pStyle w:val="Heading2"/>
+      </w:pPr>
+      <w:r>
+        <w:t>3 11 2 Decisions requiring team review</w:t>
+      </w:r>
+    </w:p>
+    <w:tbl>
+      <w:tblPr>
+        <w:tblW w:type="auto" w:w="0"/>
+        <w:tblLayout w:type="fixed"/>
+        <w:tblLook w:firstColumn="1" w:firstRow="1" w:lastColumn="0" w:lastRow="0" w:noHBand="0" w:noVBand="1" w:val="04A0"/>
+      </w:tblPr>
+      <w:tblGrid>
+        <w:gridCol w:w="2448"/>
+        <w:gridCol w:w="7632"/>
+      </w:tblGrid>
+      <w:tr>
+        <w:trPr>
+          <w:cantSplit/>
+          <w:tblHeader/>
+        </w:trPr>
+        <w:tc>
+          <w:tcPr>
+            <w:tcW w:type="dxa" w:w="2448"/>
+            <w:vAlign w:val="center"/>
+            <w:shd w:fill="E6EDF3"/>
+            <w:tcMar>
+              <w:top w:w="75" w:type="dxa"/>
+              <w:bottom w:w="75" w:type="dxa"/>
+              <w:left w:w="100" w:type="dxa"/>
+              <w:right w:w="100" w:type="dxa"/>
+            </w:tcMar>
+            <w:tcBorders>
+              <w:top w:val="single" w:sz="4" w:color="D9D9D9"/>
+              <w:bottom w:val="single" w:sz="4" w:color="D9D9D9"/>
+              <w:left w:val="single" w:sz="4" w:color="D9D9D9"/>
+              <w:right w:val="single" w:sz="4" w:color="D9D9D9"/>
+            </w:tcBorders>
+          </w:tcPr>
+          <w:p>
+            <w:pPr>
+              <w:spacing w:after="20" w:line="240" w:lineRule="auto"/>
+            </w:pPr>
+            <w:r>
+              <w:rPr>
+                <w:b/>
+                <w:sz w:val="19"/>
+              </w:rPr>
+              <w:t>Issue</w:t>
+            </w:r>
+          </w:p>
+        </w:tc>
+        <w:tc>
+          <w:tcPr>
+            <w:tcW w:type="dxa" w:w="7632"/>
+            <w:vAlign w:val="center"/>
+            <w:shd w:fill="E6EDF3"/>
+            <w:tcMar>
+              <w:top w:w="75" w:type="dxa"/>
+              <w:bottom w:w="75" w:type="dxa"/>
+              <w:left w:w="100" w:type="dxa"/>
+              <w:right w:w="100" w:type="dxa"/>
+            </w:tcMar>
+            <w:tcBorders>
+              <w:top w:val="single" w:sz="4" w:color="D9D9D9"/>
+              <w:bottom w:val="single" w:sz="4" w:color="D9D9D9"/>
+              <w:left w:val="single" w:sz="4" w:color="D9D9D9"/>
+              <w:right w:val="single" w:sz="4" w:color="D9D9D9"/>
+            </w:tcBorders>
+          </w:tcPr>
+          <w:p>
+            <w:pPr>
+              <w:spacing w:after="20" w:line="240" w:lineRule="auto"/>
+            </w:pPr>
+            <w:r>
+              <w:rPr>
+                <w:b/>
+                <w:sz w:val="19"/>
+              </w:rPr>
+              <w:t>Architecture position</w:t>
+            </w:r>
+          </w:p>
+        </w:tc>
+      </w:tr>
+      <w:tr>
+        <w:trPr>
+          <w:cantSplit/>
+        </w:trPr>
+        <w:tc>
+          <w:tcPr>
+            <w:tcW w:type="dxa" w:w="2448"/>
+            <w:vAlign w:val="center"/>
+            <w:shd w:fill="FFFFFF"/>
+            <w:tcMar>
+              <w:top w:w="75" w:type="dxa"/>
+              <w:bottom w:w="75" w:type="dxa"/>
+              <w:left w:w="100" w:type="dxa"/>
+              <w:right w:w="100" w:type="dxa"/>
+            </w:tcMar>
+            <w:tcBorders>
+              <w:top w:val="single" w:sz="4" w:color="D9D9D9"/>
+              <w:bottom w:val="single" w:sz="4" w:color="D9D9D9"/>
+              <w:left w:val="single" w:sz="4" w:color="D9D9D9"/>
+              <w:right w:val="single" w:sz="4" w:color="D9D9D9"/>
+            </w:tcBorders>
+          </w:tcPr>
+          <w:p>
+            <w:pPr>
+              <w:spacing w:after="20" w:line="240" w:lineRule="auto"/>
+            </w:pPr>
+            <w:r>
+              <w:rPr>
+                <w:b w:val="0"/>
+                <w:sz w:val="19"/>
+              </w:rPr>
+              <w:t>Admin and SLA authority</w:t>
+            </w:r>
+          </w:p>
+        </w:tc>
+        <w:tc>
+          <w:tcPr>
+            <w:tcW w:type="dxa" w:w="7632"/>
+            <w:vAlign w:val="center"/>
+            <w:shd w:fill="FFFFFF"/>
+            <w:tcMar>
+              <w:top w:w="75" w:type="dxa"/>
+              <w:bottom w:w="75" w:type="dxa"/>
+              <w:left w:w="100" w:type="dxa"/>
+              <w:right w:w="100" w:type="dxa"/>
+            </w:tcMar>
+            <w:tcBorders>
+              <w:top w:val="single" w:sz="4" w:color="D9D9D9"/>
+              <w:bottom w:val="single" w:sz="4" w:color="D9D9D9"/>
+              <w:left w:val="single" w:sz="4" w:color="D9D9D9"/>
+              <w:right w:val="single" w:sz="4" w:color="D9D9D9"/>
+            </w:tcBorders>
+          </w:tcPr>
+          <w:p>
+            <w:pPr>
+              <w:spacing w:after="20" w:line="240" w:lineRule="auto"/>
+            </w:pPr>
+            <w:r>
+              <w:rPr>
+                <w:b w:val="0"/>
+                <w:sz w:val="19"/>
+              </w:rPr>
+              <w:t>The SRS defines four user classes but REQ-8 names Admin/Dean. Provision SLA_REVIEW to Dean in this scope; Admin is a trusted administrative capability, not a fifth public registration role.</w:t>
+            </w:r>
+          </w:p>
+        </w:tc>
+      </w:tr>
+      <w:tr>
+        <w:trPr>
+          <w:cantSplit/>
+        </w:trPr>
+        <w:tc>
+          <w:tcPr>
+            <w:tcW w:type="dxa" w:w="2448"/>
+            <w:vAlign w:val="center"/>
+            <w:shd w:fill="FFFFFF"/>
+            <w:tcMar>
+              <w:top w:w="75" w:type="dxa"/>
+              <w:bottom w:w="75" w:type="dxa"/>
+              <w:left w:w="100" w:type="dxa"/>
+              <w:right w:w="100" w:type="dxa"/>
+            </w:tcMar>
+            <w:tcBorders>
+              <w:top w:val="single" w:sz="4" w:color="D9D9D9"/>
+              <w:bottom w:val="single" w:sz="4" w:color="D9D9D9"/>
+              <w:left w:val="single" w:sz="4" w:color="D9D9D9"/>
+              <w:right w:val="single" w:sz="4" w:color="D9D9D9"/>
+            </w:tcBorders>
+          </w:tcPr>
+          <w:p>
+            <w:pPr>
+              <w:spacing w:after="20" w:line="240" w:lineRule="auto"/>
+            </w:pPr>
+            <w:r>
+              <w:rPr>
+                <w:b w:val="0"/>
+                <w:sz w:val="19"/>
+              </w:rPr>
+              <w:t>SLA versus assignment policy</w:t>
+            </w:r>
+          </w:p>
+        </w:tc>
+        <w:tc>
+          <w:tcPr>
+            <w:tcW w:type="dxa" w:w="7632"/>
+            <w:vAlign w:val="center"/>
+            <w:shd w:fill="FFFFFF"/>
+            <w:tcMar>
+              <w:top w:w="75" w:type="dxa"/>
+              <w:bottom w:w="75" w:type="dxa"/>
+              <w:left w:w="100" w:type="dxa"/>
+              <w:right w:w="100" w:type="dxa"/>
+            </w:tcMar>
+            <w:tcBorders>
+              <w:top w:val="single" w:sz="4" w:color="D9D9D9"/>
+              <w:bottom w:val="single" w:sz="4" w:color="D9D9D9"/>
+              <w:left w:val="single" w:sz="4" w:color="D9D9D9"/>
+              <w:right w:val="single" w:sz="4" w:color="D9D9D9"/>
+            </w:tcBorders>
+          </w:tcPr>
+          <w:p>
+            <w:pPr>
+              <w:spacing w:after="20" w:line="240" w:lineRule="auto"/>
+            </w:pPr>
+            <w:r>
+              <w:rPr>
+                <w:b w:val="0"/>
+                <w:sz w:val="19"/>
+              </w:rPr>
+              <w:t>REQ-8.2 allows overdue escalation while REQ-4.4 limits handler actions to assignment. Treat SLA escalation as a narrowly scoped exception requiring team sign-off; ordinary Resolve/Reject/Escalate stays assignment-bound.</w:t>
+            </w:r>
+          </w:p>
+        </w:tc>
+      </w:tr>
+      <w:tr>
+        <w:trPr>
+          <w:cantSplit/>
+        </w:trPr>
+        <w:tc>
+          <w:tcPr>
+            <w:tcW w:type="dxa" w:w="2448"/>
+            <w:vAlign w:val="center"/>
+            <w:shd w:fill="FFFFFF"/>
+            <w:tcMar>
+              <w:top w:w="75" w:type="dxa"/>
+              <w:bottom w:w="75" w:type="dxa"/>
+              <w:left w:w="100" w:type="dxa"/>
+              <w:right w:w="100" w:type="dxa"/>
+            </w:tcMar>
+            <w:tcBorders>
+              <w:top w:val="single" w:sz="4" w:color="D9D9D9"/>
+              <w:bottom w:val="single" w:sz="4" w:color="D9D9D9"/>
+              <w:left w:val="single" w:sz="4" w:color="D9D9D9"/>
+              <w:right w:val="single" w:sz="4" w:color="D9D9D9"/>
+            </w:tcBorders>
+          </w:tcPr>
+          <w:p>
+            <w:pPr>
+              <w:spacing w:after="20" w:line="240" w:lineRule="auto"/>
+            </w:pPr>
+            <w:r>
+              <w:rPr>
+                <w:b w:val="0"/>
+                <w:sz w:val="19"/>
+              </w:rPr>
+              <w:t>SLA terminal states</w:t>
+            </w:r>
+          </w:p>
+        </w:tc>
+        <w:tc>
+          <w:tcPr>
+            <w:tcW w:type="dxa" w:w="7632"/>
+            <w:vAlign w:val="center"/>
+            <w:shd w:fill="FFFFFF"/>
+            <w:tcMar>
+              <w:top w:w="75" w:type="dxa"/>
+              <w:bottom w:w="75" w:type="dxa"/>
+              <w:left w:w="100" w:type="dxa"/>
+              <w:right w:w="100" w:type="dxa"/>
+            </w:tcMar>
+            <w:tcBorders>
+              <w:top w:val="single" w:sz="4" w:color="D9D9D9"/>
+              <w:bottom w:val="single" w:sz="4" w:color="D9D9D9"/>
+              <w:left w:val="single" w:sz="4" w:color="D9D9D9"/>
+              <w:right w:val="single" w:sz="4" w:color="D9D9D9"/>
+            </w:tcBorders>
+          </w:tcPr>
+          <w:p>
+            <w:pPr>
+              <w:spacing w:after="20" w:line="240" w:lineRule="auto"/>
+            </w:pPr>
+            <w:r>
+              <w:rPr>
+                <w:b w:val="0"/>
+                <w:sz w:val="19"/>
+              </w:rPr>
+              <w:t>Show overdue records required by REQ-8.1, but enable escalation only for active Submitted/Escalated/Under Appeal Review records below L3. Align Section 4 overdue listing, which currently focuses on active records, during integration.</w:t>
+            </w:r>
+          </w:p>
+        </w:tc>
+      </w:tr>
+      <w:tr>
+        <w:trPr>
+          <w:cantSplit/>
+        </w:trPr>
+        <w:tc>
+          <w:tcPr>
+            <w:tcW w:type="dxa" w:w="2448"/>
+            <w:vAlign w:val="center"/>
+            <w:shd w:fill="FFFFFF"/>
+            <w:tcMar>
+              <w:top w:w="75" w:type="dxa"/>
+              <w:bottom w:w="75" w:type="dxa"/>
+              <w:left w:w="100" w:type="dxa"/>
+              <w:right w:w="100" w:type="dxa"/>
+            </w:tcMar>
+            <w:tcBorders>
+              <w:top w:val="single" w:sz="4" w:color="D9D9D9"/>
+              <w:bottom w:val="single" w:sz="4" w:color="D9D9D9"/>
+              <w:left w:val="single" w:sz="4" w:color="D9D9D9"/>
+              <w:right w:val="single" w:sz="4" w:color="D9D9D9"/>
+            </w:tcBorders>
+          </w:tcPr>
+          <w:p>
+            <w:pPr>
+              <w:spacing w:after="20" w:line="240" w:lineRule="auto"/>
+            </w:pPr>
+            <w:r>
+              <w:rPr>
+                <w:b w:val="0"/>
+                <w:sz w:val="19"/>
+              </w:rPr>
+              <w:t>SRS traceability labels</w:t>
+            </w:r>
+          </w:p>
+        </w:tc>
+        <w:tc>
+          <w:tcPr>
+            <w:tcW w:type="dxa" w:w="7632"/>
+            <w:vAlign w:val="center"/>
+            <w:shd w:fill="FFFFFF"/>
+            <w:tcMar>
+              <w:top w:w="75" w:type="dxa"/>
+              <w:bottom w:w="75" w:type="dxa"/>
+              <w:left w:w="100" w:type="dxa"/>
+              <w:right w:w="100" w:type="dxa"/>
+            </w:tcMar>
+            <w:tcBorders>
+              <w:top w:val="single" w:sz="4" w:color="D9D9D9"/>
+              <w:bottom w:val="single" w:sz="4" w:color="D9D9D9"/>
+              <w:left w:val="single" w:sz="4" w:color="D9D9D9"/>
+              <w:right w:val="single" w:sz="4" w:color="D9D9D9"/>
+            </w:tcBorders>
+          </w:tcPr>
+          <w:p>
+            <w:pPr>
+              <w:spacing w:after="20" w:line="240" w:lineRule="auto"/>
+            </w:pPr>
+            <w:r>
+              <w:rPr>
+                <w:b w:val="0"/>
+                <w:sz w:val="19"/>
+              </w:rPr>
+              <w:t>Appendix C contains REQ41.3 and descriptions shifted from feature-section meanings. Use REQ-1.4 for generic credential failure and preserve all feature-section IDs; Member 1 should correct the source RTM.</w:t>
+            </w:r>
+          </w:p>
+        </w:tc>
+      </w:tr>
+      <w:tr>
+        <w:trPr>
+          <w:cantSplit/>
+        </w:trPr>
+        <w:tc>
+          <w:tcPr>
+            <w:tcW w:type="dxa" w:w="2448"/>
+            <w:vAlign w:val="center"/>
+            <w:shd w:fill="FFFFFF"/>
+            <w:tcMar>
+              <w:top w:w="75" w:type="dxa"/>
+              <w:bottom w:w="75" w:type="dxa"/>
+              <w:left w:w="100" w:type="dxa"/>
+              <w:right w:w="100" w:type="dxa"/>
+            </w:tcMar>
+            <w:tcBorders>
+              <w:top w:val="single" w:sz="4" w:color="D9D9D9"/>
+              <w:bottom w:val="single" w:sz="4" w:color="D9D9D9"/>
+              <w:left w:val="single" w:sz="4" w:color="D9D9D9"/>
+              <w:right w:val="single" w:sz="4" w:color="D9D9D9"/>
+            </w:tcBorders>
+          </w:tcPr>
+          <w:p>
+            <w:pPr>
+              <w:spacing w:after="20" w:line="240" w:lineRule="auto"/>
+            </w:pPr>
+            <w:r>
+              <w:rPr>
+                <w:b w:val="0"/>
+                <w:sz w:val="19"/>
+              </w:rPr>
+              <w:t>Proposed schema rules</w:t>
+            </w:r>
+          </w:p>
+        </w:tc>
+        <w:tc>
+          <w:tcPr>
+            <w:tcW w:type="dxa" w:w="7632"/>
+            <w:vAlign w:val="center"/>
+            <w:shd w:fill="FFFFFF"/>
+            <w:tcMar>
+              <w:top w:w="75" w:type="dxa"/>
+              <w:bottom w:w="75" w:type="dxa"/>
+              <w:left w:w="100" w:type="dxa"/>
+              <w:right w:w="100" w:type="dxa"/>
+            </w:tcMar>
+            <w:tcBorders>
+              <w:top w:val="single" w:sz="4" w:color="D9D9D9"/>
+              <w:bottom w:val="single" w:sz="4" w:color="D9D9D9"/>
+              <w:left w:val="single" w:sz="4" w:color="D9D9D9"/>
+              <w:right w:val="single" w:sz="4" w:color="D9D9D9"/>
+            </w:tcBorders>
+          </w:tcPr>
+          <w:p>
+            <w:pPr>
+              <w:spacing w:after="20" w:line="240" w:lineRule="auto"/>
+            </w:pPr>
+            <w:r>
+              <w:rPr>
+                <w:b w:val="0"/>
+                <w:sz w:val="19"/>
+              </w:rPr>
+              <w:t>One feedback per complaint, 1000-character appeal justification and terminal-state restrictions are Section 4 design choices. Confirm them without presenting them as new SRS requirements.</w:t>
+            </w:r>
+          </w:p>
+        </w:tc>
+      </w:tr>
+    </w:tbl>
+    <w:p>
+      <w:pPr>
+        <w:spacing w:after="0"/>
+      </w:pPr>
+    </w:p>
+    <w:p>
+      <w:pPr>
+        <w:pStyle w:val="Heading2"/>
+      </w:pPr>
+      <w:r>
+        <w:t>3 11 3 Source references</w:t>
+      </w:r>
+    </w:p>
+    <w:p>
+      <w:r>
+        <w:t>Team 8 repository baseline: d83e2a506e9a5e81d41bff908544432f5b44cd79. SRS.docx Version 2.0; SCMS_Test_Plan_2.0.docx Version 2.0; Member 4/SCMS_Software_Design_FINAL (2).docx Section 4. Original Section 4 contribution: c4ab642d4c94024b6abedcd3ecc214098680de7d. Member allocation: deliverable-2-workflow, Member 3 Software Architecture.</w:t>
+      </w:r>
+    </w:p>
+    <w:p>
+      <w:r>
+        <w:t>Technical references: Flask Deploying to Production, flask.palletsprojects.com/en/stable/deploying/; SQLite Foreign Key Support, sqlite.org/foreignkeys.html; Werkzeug Security Utilities, werkzeug.palletsprojects.com/en/stable/utils/. These support the WSGI deployment, per-connection foreign-key enforcement and maintained password-hash helper choices.</w:t>
+      </w:r>
+    </w:p>
     <w:sectPr>
       <w:footerReference w:type="default" r:id="rId9"/>
       <w:pgSz w:w="12240" w:h="15840"/>

</xml_diff>